<commit_message>
Completa los aportes de los autores en la descripción del software
</commit_message>
<xml_diff>
--- a/manuales/Descripcion_del_Software_Meritum_CAT.docx
+++ b/manuales/Descripcion_del_Software_Meritum_CAT.docx
@@ -286,7 +286,7 @@
       <w:r>
         <w:fldChar w:fldCharType="separate"/>
       </w:r>
-      <w:hyperlink w:anchor="_Toc241262601" w:history="1">
+      <w:hyperlink w:anchor="_Toc241263020" w:history="1">
         <w:r>
           <w:rPr>
             <w:rStyle w:val="Hyperlink"/>
@@ -313,7 +313,7 @@
             <w:noProof/>
             <w:webHidden/>
           </w:rPr>
-          <w:instrText xml:space="preserve"> PAGEREF _Toc241262601 \h </w:instrText>
+          <w:instrText xml:space="preserve"> PAGEREF _Toc241263020 \h </w:instrText>
         </w:r>
         <w:r>
           <w:rPr>
@@ -354,7 +354,7 @@
           <w:noProof/>
         </w:rPr>
       </w:pPr>
-      <w:hyperlink w:anchor="_Toc241262602" w:history="1">
+      <w:hyperlink w:anchor="_Toc241263021" w:history="1">
         <w:r>
           <w:rPr>
             <w:rStyle w:val="Hyperlink"/>
@@ -381,7 +381,7 @@
             <w:noProof/>
             <w:webHidden/>
           </w:rPr>
-          <w:instrText xml:space="preserve"> PAGEREF _Toc241262602 \h </w:instrText>
+          <w:instrText xml:space="preserve"> PAGEREF _Toc241263021 \h </w:instrText>
         </w:r>
         <w:r>
           <w:rPr>
@@ -422,7 +422,7 @@
           <w:noProof/>
         </w:rPr>
       </w:pPr>
-      <w:hyperlink w:anchor="_Toc241262603" w:history="1">
+      <w:hyperlink w:anchor="_Toc241263022" w:history="1">
         <w:r>
           <w:rPr>
             <w:rStyle w:val="Hyperlink"/>
@@ -449,7 +449,7 @@
             <w:noProof/>
             <w:webHidden/>
           </w:rPr>
-          <w:instrText xml:space="preserve"> PAGEREF _Toc241262603 \h </w:instrText>
+          <w:instrText xml:space="preserve"> PAGEREF _Toc241263022 \h </w:instrText>
         </w:r>
         <w:r>
           <w:rPr>
@@ -490,7 +490,7 @@
           <w:noProof/>
         </w:rPr>
       </w:pPr>
-      <w:hyperlink w:anchor="_Toc241262604" w:history="1">
+      <w:hyperlink w:anchor="_Toc241263023" w:history="1">
         <w:r>
           <w:rPr>
             <w:rStyle w:val="Hyperlink"/>
@@ -517,7 +517,7 @@
             <w:noProof/>
             <w:webHidden/>
           </w:rPr>
-          <w:instrText xml:space="preserve"> PAGEREF _Toc241262604 \h </w:instrText>
+          <w:instrText xml:space="preserve"> PAGEREF _Toc241263023 \h </w:instrText>
         </w:r>
         <w:r>
           <w:rPr>
@@ -558,7 +558,7 @@
           <w:noProof/>
         </w:rPr>
       </w:pPr>
-      <w:hyperlink w:anchor="_Toc241262605" w:history="1">
+      <w:hyperlink w:anchor="_Toc241263024" w:history="1">
         <w:r>
           <w:rPr>
             <w:rStyle w:val="Hyperlink"/>
@@ -585,7 +585,7 @@
             <w:noProof/>
             <w:webHidden/>
           </w:rPr>
-          <w:instrText xml:space="preserve"> PAGEREF _Toc241262605 \h </w:instrText>
+          <w:instrText xml:space="preserve"> PAGEREF _Toc241263024 \h </w:instrText>
         </w:r>
         <w:r>
           <w:rPr>
@@ -626,7 +626,7 @@
           <w:noProof/>
         </w:rPr>
       </w:pPr>
-      <w:hyperlink w:anchor="_Toc241262606" w:history="1">
+      <w:hyperlink w:anchor="_Toc241263025" w:history="1">
         <w:r>
           <w:rPr>
             <w:rStyle w:val="Hyperlink"/>
@@ -653,7 +653,7 @@
             <w:noProof/>
             <w:webHidden/>
           </w:rPr>
-          <w:instrText xml:space="preserve"> PAGEREF _Toc241262606 \h </w:instrText>
+          <w:instrText xml:space="preserve"> PAGEREF _Toc241263025 \h </w:instrText>
         </w:r>
         <w:r>
           <w:rPr>
@@ -694,7 +694,7 @@
           <w:noProof/>
         </w:rPr>
       </w:pPr>
-      <w:hyperlink w:anchor="_Toc241262607" w:history="1">
+      <w:hyperlink w:anchor="_Toc241263026" w:history="1">
         <w:r>
           <w:rPr>
             <w:rStyle w:val="Hyperlink"/>
@@ -721,7 +721,7 @@
             <w:noProof/>
             <w:webHidden/>
           </w:rPr>
-          <w:instrText xml:space="preserve"> PAGEREF _Toc241262607 \h </w:instrText>
+          <w:instrText xml:space="preserve"> PAGEREF _Toc241263026 \h </w:instrText>
         </w:r>
         <w:r>
           <w:rPr>
@@ -762,7 +762,7 @@
           <w:noProof/>
         </w:rPr>
       </w:pPr>
-      <w:hyperlink w:anchor="_Toc241262608" w:history="1">
+      <w:hyperlink w:anchor="_Toc241263027" w:history="1">
         <w:r>
           <w:rPr>
             <w:rStyle w:val="Hyperlink"/>
@@ -789,7 +789,7 @@
             <w:noProof/>
             <w:webHidden/>
           </w:rPr>
-          <w:instrText xml:space="preserve"> PAGEREF _Toc241262608 \h </w:instrText>
+          <w:instrText xml:space="preserve"> PAGEREF _Toc241263027 \h </w:instrText>
         </w:r>
         <w:r>
           <w:rPr>
@@ -830,7 +830,7 @@
           <w:noProof/>
         </w:rPr>
       </w:pPr>
-      <w:hyperlink w:anchor="_Toc241262609" w:history="1">
+      <w:hyperlink w:anchor="_Toc241263028" w:history="1">
         <w:r>
           <w:rPr>
             <w:rStyle w:val="Hyperlink"/>
@@ -857,7 +857,7 @@
             <w:noProof/>
             <w:webHidden/>
           </w:rPr>
-          <w:instrText xml:space="preserve"> PAGEREF _Toc241262609 \h </w:instrText>
+          <w:instrText xml:space="preserve"> PAGEREF _Toc241263028 \h </w:instrText>
         </w:r>
         <w:r>
           <w:rPr>
@@ -898,7 +898,7 @@
           <w:noProof/>
         </w:rPr>
       </w:pPr>
-      <w:hyperlink w:anchor="_Toc241262610" w:history="1">
+      <w:hyperlink w:anchor="_Toc241263029" w:history="1">
         <w:r>
           <w:rPr>
             <w:rStyle w:val="Hyperlink"/>
@@ -925,7 +925,7 @@
             <w:noProof/>
             <w:webHidden/>
           </w:rPr>
-          <w:instrText xml:space="preserve"> PAGEREF _Toc241262610 \h </w:instrText>
+          <w:instrText xml:space="preserve"> PAGEREF _Toc241263029 \h </w:instrText>
         </w:r>
         <w:r>
           <w:rPr>
@@ -966,7 +966,7 @@
           <w:noProof/>
         </w:rPr>
       </w:pPr>
-      <w:hyperlink w:anchor="_Toc241262611" w:history="1">
+      <w:hyperlink w:anchor="_Toc241263030" w:history="1">
         <w:r>
           <w:rPr>
             <w:rStyle w:val="Hyperlink"/>
@@ -993,7 +993,7 @@
             <w:noProof/>
             <w:webHidden/>
           </w:rPr>
-          <w:instrText xml:space="preserve"> PAGEREF _Toc241262611 \h </w:instrText>
+          <w:instrText xml:space="preserve"> PAGEREF _Toc241263030 \h </w:instrText>
         </w:r>
         <w:r>
           <w:rPr>
@@ -1034,7 +1034,7 @@
           <w:noProof/>
         </w:rPr>
       </w:pPr>
-      <w:hyperlink w:anchor="_Toc241262612" w:history="1">
+      <w:hyperlink w:anchor="_Toc241263031" w:history="1">
         <w:r>
           <w:rPr>
             <w:rStyle w:val="Hyperlink"/>
@@ -1061,7 +1061,7 @@
             <w:noProof/>
             <w:webHidden/>
           </w:rPr>
-          <w:instrText xml:space="preserve"> PAGEREF _Toc241262612 \h </w:instrText>
+          <w:instrText xml:space="preserve"> PAGEREF _Toc241263031 \h </w:instrText>
         </w:r>
         <w:r>
           <w:rPr>
@@ -1102,7 +1102,7 @@
           <w:noProof/>
         </w:rPr>
       </w:pPr>
-      <w:hyperlink w:anchor="_Toc241262613" w:history="1">
+      <w:hyperlink w:anchor="_Toc241263032" w:history="1">
         <w:r>
           <w:rPr>
             <w:rStyle w:val="Hyperlink"/>
@@ -1129,7 +1129,7 @@
             <w:noProof/>
             <w:webHidden/>
           </w:rPr>
-          <w:instrText xml:space="preserve"> PAGEREF _Toc241262613 \h </w:instrText>
+          <w:instrText xml:space="preserve"> PAGEREF _Toc241263032 \h </w:instrText>
         </w:r>
         <w:r>
           <w:rPr>
@@ -1170,7 +1170,7 @@
           <w:noProof/>
         </w:rPr>
       </w:pPr>
-      <w:hyperlink w:anchor="_Toc241262614" w:history="1">
+      <w:hyperlink w:anchor="_Toc241263033" w:history="1">
         <w:r>
           <w:rPr>
             <w:rStyle w:val="Hyperlink"/>
@@ -1197,7 +1197,7 @@
             <w:noProof/>
             <w:webHidden/>
           </w:rPr>
-          <w:instrText xml:space="preserve"> PAGEREF _Toc241262614 \h </w:instrText>
+          <w:instrText xml:space="preserve"> PAGEREF _Toc241263033 \h </w:instrText>
         </w:r>
         <w:r>
           <w:rPr>
@@ -1238,7 +1238,7 @@
           <w:noProof/>
         </w:rPr>
       </w:pPr>
-      <w:hyperlink w:anchor="_Toc241262615" w:history="1">
+      <w:hyperlink w:anchor="_Toc241263034" w:history="1">
         <w:r>
           <w:rPr>
             <w:rStyle w:val="Hyperlink"/>
@@ -1265,7 +1265,7 @@
             <w:noProof/>
             <w:webHidden/>
           </w:rPr>
-          <w:instrText xml:space="preserve"> PAGEREF _Toc241262615 \h </w:instrText>
+          <w:instrText xml:space="preserve"> PAGEREF _Toc241263034 \h </w:instrText>
         </w:r>
         <w:r>
           <w:rPr>
@@ -1306,7 +1306,7 @@
           <w:noProof/>
         </w:rPr>
       </w:pPr>
-      <w:hyperlink w:anchor="_Toc241262616" w:history="1">
+      <w:hyperlink w:anchor="_Toc241263035" w:history="1">
         <w:r>
           <w:rPr>
             <w:rStyle w:val="Hyperlink"/>
@@ -1333,7 +1333,7 @@
             <w:noProof/>
             <w:webHidden/>
           </w:rPr>
-          <w:instrText xml:space="preserve"> PAGEREF _Toc241262616 \h </w:instrText>
+          <w:instrText xml:space="preserve"> PAGEREF _Toc241263035 \h </w:instrText>
         </w:r>
         <w:r>
           <w:rPr>
@@ -1374,7 +1374,7 @@
           <w:noProof/>
         </w:rPr>
       </w:pPr>
-      <w:hyperlink w:anchor="_Toc241262617" w:history="1">
+      <w:hyperlink w:anchor="_Toc241263036" w:history="1">
         <w:r>
           <w:rPr>
             <w:rStyle w:val="Hyperlink"/>
@@ -1401,7 +1401,7 @@
             <w:noProof/>
             <w:webHidden/>
           </w:rPr>
-          <w:instrText xml:space="preserve"> PAGEREF _Toc241262617 \h </w:instrText>
+          <w:instrText xml:space="preserve"> PAGEREF _Toc241263036 \h </w:instrText>
         </w:r>
         <w:r>
           <w:rPr>
@@ -1442,7 +1442,7 @@
           <w:noProof/>
         </w:rPr>
       </w:pPr>
-      <w:hyperlink w:anchor="_Toc241262618" w:history="1">
+      <w:hyperlink w:anchor="_Toc241263037" w:history="1">
         <w:r>
           <w:rPr>
             <w:rStyle w:val="Hyperlink"/>
@@ -1469,7 +1469,7 @@
             <w:noProof/>
             <w:webHidden/>
           </w:rPr>
-          <w:instrText xml:space="preserve"> PAGEREF _Toc241262618 \h </w:instrText>
+          <w:instrText xml:space="preserve"> PAGEREF _Toc241263037 \h </w:instrText>
         </w:r>
         <w:r>
           <w:rPr>
@@ -1510,7 +1510,7 @@
           <w:noProof/>
         </w:rPr>
       </w:pPr>
-      <w:hyperlink w:anchor="_Toc241262619" w:history="1">
+      <w:hyperlink w:anchor="_Toc241263038" w:history="1">
         <w:r>
           <w:rPr>
             <w:rStyle w:val="Hyperlink"/>
@@ -1537,7 +1537,7 @@
             <w:noProof/>
             <w:webHidden/>
           </w:rPr>
-          <w:instrText xml:space="preserve"> PAGEREF _Toc241262619 \h </w:instrText>
+          <w:instrText xml:space="preserve"> PAGEREF _Toc241263038 \h </w:instrText>
         </w:r>
         <w:r>
           <w:rPr>
@@ -1578,7 +1578,7 @@
           <w:noProof/>
         </w:rPr>
       </w:pPr>
-      <w:hyperlink w:anchor="_Toc241262620" w:history="1">
+      <w:hyperlink w:anchor="_Toc241263039" w:history="1">
         <w:r>
           <w:rPr>
             <w:rStyle w:val="Hyperlink"/>
@@ -1605,7 +1605,7 @@
             <w:noProof/>
             <w:webHidden/>
           </w:rPr>
-          <w:instrText xml:space="preserve"> PAGEREF _Toc241262620 \h </w:instrText>
+          <w:instrText xml:space="preserve"> PAGEREF _Toc241263039 \h </w:instrText>
         </w:r>
         <w:r>
           <w:rPr>
@@ -1646,7 +1646,7 @@
           <w:noProof/>
         </w:rPr>
       </w:pPr>
-      <w:hyperlink w:anchor="_Toc241262621" w:history="1">
+      <w:hyperlink w:anchor="_Toc241263040" w:history="1">
         <w:r>
           <w:rPr>
             <w:rStyle w:val="Hyperlink"/>
@@ -1673,7 +1673,7 @@
             <w:noProof/>
             <w:webHidden/>
           </w:rPr>
-          <w:instrText xml:space="preserve"> PAGEREF _Toc241262621 \h </w:instrText>
+          <w:instrText xml:space="preserve"> PAGEREF _Toc241263040 \h </w:instrText>
         </w:r>
         <w:r>
           <w:rPr>
@@ -1714,7 +1714,7 @@
           <w:noProof/>
         </w:rPr>
       </w:pPr>
-      <w:hyperlink w:anchor="_Toc241262622" w:history="1">
+      <w:hyperlink w:anchor="_Toc241263041" w:history="1">
         <w:r>
           <w:rPr>
             <w:rStyle w:val="Hyperlink"/>
@@ -1741,7 +1741,7 @@
             <w:noProof/>
             <w:webHidden/>
           </w:rPr>
-          <w:instrText xml:space="preserve"> PAGEREF _Toc241262622 \h </w:instrText>
+          <w:instrText xml:space="preserve"> PAGEREF _Toc241263041 \h </w:instrText>
         </w:r>
         <w:r>
           <w:rPr>
@@ -1782,7 +1782,7 @@
           <w:noProof/>
         </w:rPr>
       </w:pPr>
-      <w:hyperlink w:anchor="_Toc241262623" w:history="1">
+      <w:hyperlink w:anchor="_Toc241263042" w:history="1">
         <w:r>
           <w:rPr>
             <w:rStyle w:val="Hyperlink"/>
@@ -1809,7 +1809,7 @@
             <w:noProof/>
             <w:webHidden/>
           </w:rPr>
-          <w:instrText xml:space="preserve"> PAGEREF _Toc241262623 \h </w:instrText>
+          <w:instrText xml:space="preserve"> PAGEREF _Toc241263042 \h </w:instrText>
         </w:r>
         <w:r>
           <w:rPr>
@@ -1850,7 +1850,7 @@
           <w:noProof/>
         </w:rPr>
       </w:pPr>
-      <w:hyperlink w:anchor="_Toc241262624" w:history="1">
+      <w:hyperlink w:anchor="_Toc241263043" w:history="1">
         <w:r>
           <w:rPr>
             <w:rStyle w:val="Hyperlink"/>
@@ -1877,7 +1877,7 @@
             <w:noProof/>
             <w:webHidden/>
           </w:rPr>
-          <w:instrText xml:space="preserve"> PAGEREF _Toc241262624 \h </w:instrText>
+          <w:instrText xml:space="preserve"> PAGEREF _Toc241263043 \h </w:instrText>
         </w:r>
         <w:r>
           <w:rPr>
@@ -1918,7 +1918,7 @@
           <w:noProof/>
         </w:rPr>
       </w:pPr>
-      <w:hyperlink w:anchor="_Toc241262625" w:history="1">
+      <w:hyperlink w:anchor="_Toc241263044" w:history="1">
         <w:r>
           <w:rPr>
             <w:rStyle w:val="Hyperlink"/>
@@ -1945,7 +1945,7 @@
             <w:noProof/>
             <w:webHidden/>
           </w:rPr>
-          <w:instrText xml:space="preserve"> PAGEREF _Toc241262625 \h </w:instrText>
+          <w:instrText xml:space="preserve"> PAGEREF _Toc241263044 \h </w:instrText>
         </w:r>
         <w:r>
           <w:rPr>
@@ -1986,7 +1986,7 @@
           <w:noProof/>
         </w:rPr>
       </w:pPr>
-      <w:hyperlink w:anchor="_Toc241262626" w:history="1">
+      <w:hyperlink w:anchor="_Toc241263045" w:history="1">
         <w:r>
           <w:rPr>
             <w:rStyle w:val="Hyperlink"/>
@@ -2013,7 +2013,7 @@
             <w:noProof/>
             <w:webHidden/>
           </w:rPr>
-          <w:instrText xml:space="preserve"> PAGEREF _Toc241262626 \h </w:instrText>
+          <w:instrText xml:space="preserve"> PAGEREF _Toc241263045 \h </w:instrText>
         </w:r>
         <w:r>
           <w:rPr>
@@ -2054,7 +2054,7 @@
           <w:noProof/>
         </w:rPr>
       </w:pPr>
-      <w:hyperlink w:anchor="_Toc241262627" w:history="1">
+      <w:hyperlink w:anchor="_Toc241263046" w:history="1">
         <w:r>
           <w:rPr>
             <w:rStyle w:val="Hyperlink"/>
@@ -2081,7 +2081,7 @@
             <w:noProof/>
             <w:webHidden/>
           </w:rPr>
-          <w:instrText xml:space="preserve"> PAGEREF _Toc241262627 \h </w:instrText>
+          <w:instrText xml:space="preserve"> PAGEREF _Toc241263046 \h </w:instrText>
         </w:r>
         <w:r>
           <w:rPr>
@@ -2122,7 +2122,7 @@
           <w:noProof/>
         </w:rPr>
       </w:pPr>
-      <w:hyperlink w:anchor="_Toc241262628" w:history="1">
+      <w:hyperlink w:anchor="_Toc241263047" w:history="1">
         <w:r>
           <w:rPr>
             <w:rStyle w:val="Hyperlink"/>
@@ -2149,7 +2149,7 @@
             <w:noProof/>
             <w:webHidden/>
           </w:rPr>
-          <w:instrText xml:space="preserve"> PAGEREF _Toc241262628 \h </w:instrText>
+          <w:instrText xml:space="preserve"> PAGEREF _Toc241263047 \h </w:instrText>
         </w:r>
         <w:r>
           <w:rPr>
@@ -2190,7 +2190,7 @@
           <w:noProof/>
         </w:rPr>
       </w:pPr>
-      <w:hyperlink w:anchor="_Toc241262629" w:history="1">
+      <w:hyperlink w:anchor="_Toc241263048" w:history="1">
         <w:r>
           <w:rPr>
             <w:rStyle w:val="Hyperlink"/>
@@ -2217,7 +2217,7 @@
             <w:noProof/>
             <w:webHidden/>
           </w:rPr>
-          <w:instrText xml:space="preserve"> PAGEREF _Toc241262629 \h </w:instrText>
+          <w:instrText xml:space="preserve"> PAGEREF _Toc241263048 \h </w:instrText>
         </w:r>
         <w:r>
           <w:rPr>
@@ -2258,7 +2258,7 @@
           <w:noProof/>
         </w:rPr>
       </w:pPr>
-      <w:hyperlink w:anchor="_Toc241262630" w:history="1">
+      <w:hyperlink w:anchor="_Toc241263049" w:history="1">
         <w:r>
           <w:rPr>
             <w:rStyle w:val="Hyperlink"/>
@@ -2285,7 +2285,7 @@
             <w:noProof/>
             <w:webHidden/>
           </w:rPr>
-          <w:instrText xml:space="preserve"> PAGEREF _Toc241262630 \h </w:instrText>
+          <w:instrText xml:space="preserve"> PAGEREF _Toc241263049 \h </w:instrText>
         </w:r>
         <w:r>
           <w:rPr>
@@ -2326,7 +2326,7 @@
           <w:noProof/>
         </w:rPr>
       </w:pPr>
-      <w:hyperlink w:anchor="_Toc241262631" w:history="1">
+      <w:hyperlink w:anchor="_Toc241263050" w:history="1">
         <w:r>
           <w:rPr>
             <w:rStyle w:val="Hyperlink"/>
@@ -2353,7 +2353,7 @@
             <w:noProof/>
             <w:webHidden/>
           </w:rPr>
-          <w:instrText xml:space="preserve"> PAGEREF _Toc241262631 \h </w:instrText>
+          <w:instrText xml:space="preserve"> PAGEREF _Toc241263050 \h </w:instrText>
         </w:r>
         <w:r>
           <w:rPr>
@@ -2394,7 +2394,7 @@
           <w:noProof/>
         </w:rPr>
       </w:pPr>
-      <w:hyperlink w:anchor="_Toc241262632" w:history="1">
+      <w:hyperlink w:anchor="_Toc241263051" w:history="1">
         <w:r>
           <w:rPr>
             <w:rStyle w:val="Hyperlink"/>
@@ -2421,7 +2421,7 @@
             <w:noProof/>
             <w:webHidden/>
           </w:rPr>
-          <w:instrText xml:space="preserve"> PAGEREF _Toc241262632 \h </w:instrText>
+          <w:instrText xml:space="preserve"> PAGEREF _Toc241263051 \h </w:instrText>
         </w:r>
         <w:r>
           <w:rPr>
@@ -2462,7 +2462,7 @@
           <w:noProof/>
         </w:rPr>
       </w:pPr>
-      <w:hyperlink w:anchor="_Toc241262633" w:history="1">
+      <w:hyperlink w:anchor="_Toc241263052" w:history="1">
         <w:r>
           <w:rPr>
             <w:rStyle w:val="Hyperlink"/>
@@ -2489,7 +2489,7 @@
             <w:noProof/>
             <w:webHidden/>
           </w:rPr>
-          <w:instrText xml:space="preserve"> PAGEREF _Toc241262633 \h </w:instrText>
+          <w:instrText xml:space="preserve"> PAGEREF _Toc241263052 \h </w:instrText>
         </w:r>
         <w:r>
           <w:rPr>
@@ -2530,7 +2530,7 @@
           <w:noProof/>
         </w:rPr>
       </w:pPr>
-      <w:hyperlink w:anchor="_Toc241262634" w:history="1">
+      <w:hyperlink w:anchor="_Toc241263053" w:history="1">
         <w:r>
           <w:rPr>
             <w:rStyle w:val="Hyperlink"/>
@@ -2557,7 +2557,7 @@
             <w:noProof/>
             <w:webHidden/>
           </w:rPr>
-          <w:instrText xml:space="preserve"> PAGEREF _Toc241262634 \h </w:instrText>
+          <w:instrText xml:space="preserve"> PAGEREF _Toc241263053 \h </w:instrText>
         </w:r>
         <w:r>
           <w:rPr>
@@ -2598,7 +2598,7 @@
           <w:noProof/>
         </w:rPr>
       </w:pPr>
-      <w:hyperlink w:anchor="_Toc241262635" w:history="1">
+      <w:hyperlink w:anchor="_Toc241263054" w:history="1">
         <w:r>
           <w:rPr>
             <w:rStyle w:val="Hyperlink"/>
@@ -2625,7 +2625,7 @@
             <w:noProof/>
             <w:webHidden/>
           </w:rPr>
-          <w:instrText xml:space="preserve"> PAGEREF _Toc241262635 \h </w:instrText>
+          <w:instrText xml:space="preserve"> PAGEREF _Toc241263054 \h </w:instrText>
         </w:r>
         <w:r>
           <w:rPr>
@@ -2666,7 +2666,7 @@
           <w:noProof/>
         </w:rPr>
       </w:pPr>
-      <w:hyperlink w:anchor="_Toc241262636" w:history="1">
+      <w:hyperlink w:anchor="_Toc241263055" w:history="1">
         <w:r>
           <w:rPr>
             <w:rStyle w:val="Hyperlink"/>
@@ -2693,7 +2693,7 @@
             <w:noProof/>
             <w:webHidden/>
           </w:rPr>
-          <w:instrText xml:space="preserve"> PAGEREF _Toc241262636 \h </w:instrText>
+          <w:instrText xml:space="preserve"> PAGEREF _Toc241263055 \h </w:instrText>
         </w:r>
         <w:r>
           <w:rPr>
@@ -2734,7 +2734,7 @@
           <w:noProof/>
         </w:rPr>
       </w:pPr>
-      <w:hyperlink w:anchor="_Toc241262637" w:history="1">
+      <w:hyperlink w:anchor="_Toc241263056" w:history="1">
         <w:r>
           <w:rPr>
             <w:rStyle w:val="Hyperlink"/>
@@ -2761,7 +2761,7 @@
             <w:noProof/>
             <w:webHidden/>
           </w:rPr>
-          <w:instrText xml:space="preserve"> PAGEREF _Toc241262637 \h </w:instrText>
+          <w:instrText xml:space="preserve"> PAGEREF _Toc241263056 \h </w:instrText>
         </w:r>
         <w:r>
           <w:rPr>
@@ -2802,7 +2802,7 @@
           <w:noProof/>
         </w:rPr>
       </w:pPr>
-      <w:hyperlink w:anchor="_Toc241262638" w:history="1">
+      <w:hyperlink w:anchor="_Toc241263057" w:history="1">
         <w:r>
           <w:rPr>
             <w:rStyle w:val="Hyperlink"/>
@@ -2829,7 +2829,7 @@
             <w:noProof/>
             <w:webHidden/>
           </w:rPr>
-          <w:instrText xml:space="preserve"> PAGEREF _Toc241262638 \h </w:instrText>
+          <w:instrText xml:space="preserve"> PAGEREF _Toc241263057 \h </w:instrText>
         </w:r>
         <w:r>
           <w:rPr>
@@ -2870,7 +2870,7 @@
           <w:noProof/>
         </w:rPr>
       </w:pPr>
-      <w:hyperlink w:anchor="_Toc241262639" w:history="1">
+      <w:hyperlink w:anchor="_Toc241263058" w:history="1">
         <w:r>
           <w:rPr>
             <w:rStyle w:val="Hyperlink"/>
@@ -2897,7 +2897,7 @@
             <w:noProof/>
             <w:webHidden/>
           </w:rPr>
-          <w:instrText xml:space="preserve"> PAGEREF _Toc241262639 \h </w:instrText>
+          <w:instrText xml:space="preserve"> PAGEREF _Toc241263058 \h </w:instrText>
         </w:r>
         <w:r>
           <w:rPr>
@@ -2938,7 +2938,7 @@
           <w:noProof/>
         </w:rPr>
       </w:pPr>
-      <w:hyperlink w:anchor="_Toc241262640" w:history="1">
+      <w:hyperlink w:anchor="_Toc241263059" w:history="1">
         <w:r>
           <w:rPr>
             <w:rStyle w:val="Hyperlink"/>
@@ -2965,7 +2965,7 @@
             <w:noProof/>
             <w:webHidden/>
           </w:rPr>
-          <w:instrText xml:space="preserve"> PAGEREF _Toc241262640 \h </w:instrText>
+          <w:instrText xml:space="preserve"> PAGEREF _Toc241263059 \h </w:instrText>
         </w:r>
         <w:r>
           <w:rPr>
@@ -3006,7 +3006,7 @@
           <w:noProof/>
         </w:rPr>
       </w:pPr>
-      <w:hyperlink w:anchor="_Toc241262641" w:history="1">
+      <w:hyperlink w:anchor="_Toc241263060" w:history="1">
         <w:r>
           <w:rPr>
             <w:rStyle w:val="Hyperlink"/>
@@ -3033,7 +3033,7 @@
             <w:noProof/>
             <w:webHidden/>
           </w:rPr>
-          <w:instrText xml:space="preserve"> PAGEREF _Toc241262641 \h </w:instrText>
+          <w:instrText xml:space="preserve"> PAGEREF _Toc241263060 \h </w:instrText>
         </w:r>
         <w:r>
           <w:rPr>
@@ -3074,7 +3074,7 @@
           <w:noProof/>
         </w:rPr>
       </w:pPr>
-      <w:hyperlink w:anchor="_Toc241262642" w:history="1">
+      <w:hyperlink w:anchor="_Toc241263061" w:history="1">
         <w:r>
           <w:rPr>
             <w:rStyle w:val="Hyperlink"/>
@@ -3101,7 +3101,7 @@
             <w:noProof/>
             <w:webHidden/>
           </w:rPr>
-          <w:instrText xml:space="preserve"> PAGEREF _Toc241262642 \h </w:instrText>
+          <w:instrText xml:space="preserve"> PAGEREF _Toc241263061 \h </w:instrText>
         </w:r>
         <w:r>
           <w:rPr>
@@ -3142,7 +3142,7 @@
           <w:noProof/>
         </w:rPr>
       </w:pPr>
-      <w:hyperlink w:anchor="_Toc241262643" w:history="1">
+      <w:hyperlink w:anchor="_Toc241263062" w:history="1">
         <w:r>
           <w:rPr>
             <w:rStyle w:val="Hyperlink"/>
@@ -3169,7 +3169,7 @@
             <w:noProof/>
             <w:webHidden/>
           </w:rPr>
-          <w:instrText xml:space="preserve"> PAGEREF _Toc241262643 \h </w:instrText>
+          <w:instrText xml:space="preserve"> PAGEREF _Toc241263062 \h </w:instrText>
         </w:r>
         <w:r>
           <w:rPr>
@@ -3210,7 +3210,7 @@
           <w:noProof/>
         </w:rPr>
       </w:pPr>
-      <w:hyperlink w:anchor="_Toc241262644" w:history="1">
+      <w:hyperlink w:anchor="_Toc241263063" w:history="1">
         <w:r>
           <w:rPr>
             <w:rStyle w:val="Hyperlink"/>
@@ -3237,7 +3237,7 @@
             <w:noProof/>
             <w:webHidden/>
           </w:rPr>
-          <w:instrText xml:space="preserve"> PAGEREF _Toc241262644 \h </w:instrText>
+          <w:instrText xml:space="preserve"> PAGEREF _Toc241263063 \h </w:instrText>
         </w:r>
         <w:r>
           <w:rPr>
@@ -3278,7 +3278,7 @@
           <w:noProof/>
         </w:rPr>
       </w:pPr>
-      <w:hyperlink w:anchor="_Toc241262645" w:history="1">
+      <w:hyperlink w:anchor="_Toc241263064" w:history="1">
         <w:r>
           <w:rPr>
             <w:rStyle w:val="Hyperlink"/>
@@ -3305,7 +3305,7 @@
             <w:noProof/>
             <w:webHidden/>
           </w:rPr>
-          <w:instrText xml:space="preserve"> PAGEREF _Toc241262645 \h </w:instrText>
+          <w:instrText xml:space="preserve"> PAGEREF _Toc241263064 \h </w:instrText>
         </w:r>
         <w:r>
           <w:rPr>
@@ -3346,7 +3346,7 @@
           <w:noProof/>
         </w:rPr>
       </w:pPr>
-      <w:hyperlink w:anchor="_Toc241262646" w:history="1">
+      <w:hyperlink w:anchor="_Toc241263065" w:history="1">
         <w:r>
           <w:rPr>
             <w:rStyle w:val="Hyperlink"/>
@@ -3373,7 +3373,7 @@
             <w:noProof/>
             <w:webHidden/>
           </w:rPr>
-          <w:instrText xml:space="preserve"> PAGEREF _Toc241262646 \h </w:instrText>
+          <w:instrText xml:space="preserve"> PAGEREF _Toc241263065 \h </w:instrText>
         </w:r>
         <w:r>
           <w:rPr>
@@ -3414,7 +3414,7 @@
           <w:noProof/>
         </w:rPr>
       </w:pPr>
-      <w:hyperlink w:anchor="_Toc241262647" w:history="1">
+      <w:hyperlink w:anchor="_Toc241263066" w:history="1">
         <w:r>
           <w:rPr>
             <w:rStyle w:val="Hyperlink"/>
@@ -3441,7 +3441,7 @@
             <w:noProof/>
             <w:webHidden/>
           </w:rPr>
-          <w:instrText xml:space="preserve"> PAGEREF _Toc241262647 \h </w:instrText>
+          <w:instrText xml:space="preserve"> PAGEREF _Toc241263066 \h </w:instrText>
         </w:r>
         <w:r>
           <w:rPr>
@@ -3482,7 +3482,7 @@
           <w:noProof/>
         </w:rPr>
       </w:pPr>
-      <w:hyperlink w:anchor="_Toc241262648" w:history="1">
+      <w:hyperlink w:anchor="_Toc241263067" w:history="1">
         <w:r>
           <w:rPr>
             <w:rStyle w:val="Hyperlink"/>
@@ -3509,7 +3509,7 @@
             <w:noProof/>
             <w:webHidden/>
           </w:rPr>
-          <w:instrText xml:space="preserve"> PAGEREF _Toc241262648 \h </w:instrText>
+          <w:instrText xml:space="preserve"> PAGEREF _Toc241263067 \h </w:instrText>
         </w:r>
         <w:r>
           <w:rPr>
@@ -3554,7 +3554,7 @@
       <w:pPr>
         <w:pStyle w:val="Heading1"/>
       </w:pPr>
-      <w:bookmarkStart w:id="0" w:name="_Toc241262601"/>
+      <w:bookmarkStart w:id="0" w:name="_Toc241263020"/>
       <w:r>
         <w:lastRenderedPageBreak/>
         <w:t>1. Información general del producto</w:t>
@@ -4101,7 +4101,7 @@
       <w:pPr>
         <w:pStyle w:val="Heading1"/>
       </w:pPr>
-      <w:bookmarkStart w:id="1" w:name="_Toc241262602"/>
+      <w:bookmarkStart w:id="1" w:name="_Toc241263021"/>
       <w:r>
         <w:t>2. Descripción general del software</w:t>
       </w:r>
@@ -4161,7 +4161,7 @@
       <w:pPr>
         <w:pStyle w:val="Heading2"/>
       </w:pPr>
-      <w:bookmarkStart w:id="2" w:name="_Toc241262603"/>
+      <w:bookmarkStart w:id="2" w:name="_Toc241263022"/>
       <w:r>
         <w:t>2.1. Especificación de requisitos de hardware y software</w:t>
       </w:r>
@@ -4171,7 +4171,7 @@
       <w:pPr>
         <w:pStyle w:val="Heading3"/>
       </w:pPr>
-      <w:bookmarkStart w:id="3" w:name="_Toc241262604"/>
+      <w:bookmarkStart w:id="3" w:name="_Toc241263023"/>
       <w:r>
         <w:t>Requisitos para el usuario final</w:t>
       </w:r>
@@ -4483,7 +4483,7 @@
       <w:pPr>
         <w:pStyle w:val="Heading3"/>
       </w:pPr>
-      <w:bookmarkStart w:id="4" w:name="_Toc241262605"/>
+      <w:bookmarkStart w:id="4" w:name="_Toc241263024"/>
       <w:r>
         <w:t>Entorno de software (modo desarrollo)</w:t>
       </w:r>
@@ -4834,7 +4834,7 @@
       <w:pPr>
         <w:pStyle w:val="Heading3"/>
       </w:pPr>
-      <w:bookmarkStart w:id="5" w:name="_Toc241262606"/>
+      <w:bookmarkStart w:id="5" w:name="_Toc241263025"/>
       <w:r>
         <w:t>Requisito de operación en red</w:t>
       </w:r>
@@ -4852,7 +4852,7 @@
       <w:pPr>
         <w:pStyle w:val="Heading2"/>
       </w:pPr>
-      <w:bookmarkStart w:id="6" w:name="_Toc241262607"/>
+      <w:bookmarkStart w:id="6" w:name="_Toc241263026"/>
       <w:r>
         <w:lastRenderedPageBreak/>
         <w:t>2.2. Justificación de los requisitos</w:t>
@@ -4890,7 +4890,7 @@
       <w:pPr>
         <w:pStyle w:val="Heading1"/>
       </w:pPr>
-      <w:bookmarkStart w:id="7" w:name="_Toc241262608"/>
+      <w:bookmarkStart w:id="7" w:name="_Toc241263027"/>
       <w:r>
         <w:t>3. Objetivos y área de aplicación</w:t>
       </w:r>
@@ -4900,7 +4900,7 @@
       <w:pPr>
         <w:pStyle w:val="Heading2"/>
       </w:pPr>
-      <w:bookmarkStart w:id="8" w:name="_Toc241262609"/>
+      <w:bookmarkStart w:id="8" w:name="_Toc241263028"/>
       <w:r>
         <w:t>3.1 Objetivo general</w:t>
       </w:r>
@@ -4918,7 +4918,7 @@
       <w:pPr>
         <w:pStyle w:val="Heading2"/>
       </w:pPr>
-      <w:bookmarkStart w:id="9" w:name="_Toc241262610"/>
+      <w:bookmarkStart w:id="9" w:name="_Toc241263029"/>
       <w:r>
         <w:t>3.2 Objetivos específicos</w:t>
       </w:r>
@@ -4991,7 +4991,7 @@
       <w:pPr>
         <w:pStyle w:val="Heading2"/>
       </w:pPr>
-      <w:bookmarkStart w:id="10" w:name="_Toc241262611"/>
+      <w:bookmarkStart w:id="10" w:name="_Toc241263030"/>
       <w:r>
         <w:t>3.3 Área de aplicación</w:t>
       </w:r>
@@ -5064,7 +5064,7 @@
       <w:pPr>
         <w:pStyle w:val="Heading1"/>
       </w:pPr>
-      <w:bookmarkStart w:id="11" w:name="_Toc241262612"/>
+      <w:bookmarkStart w:id="11" w:name="_Toc241263031"/>
       <w:r>
         <w:t>4. Funcionalidades principales</w:t>
       </w:r>
@@ -5293,7 +5293,7 @@
       <w:pPr>
         <w:pStyle w:val="Heading1"/>
       </w:pPr>
-      <w:bookmarkStart w:id="12" w:name="_Toc241262613"/>
+      <w:bookmarkStart w:id="12" w:name="_Toc241263032"/>
       <w:r>
         <w:t>5. Adaptabilidad, extensibilidad y mantenibilidad</w:t>
       </w:r>
@@ -5303,7 +5303,7 @@
       <w:pPr>
         <w:pStyle w:val="Heading3"/>
       </w:pPr>
-      <w:bookmarkStart w:id="13" w:name="_Toc241262614"/>
+      <w:bookmarkStart w:id="13" w:name="_Toc241263033"/>
       <w:r>
         <w:t>Modularidad</w:t>
       </w:r>
@@ -5321,7 +5321,7 @@
       <w:pPr>
         <w:pStyle w:val="Heading3"/>
       </w:pPr>
-      <w:bookmarkStart w:id="14" w:name="_Toc241262615"/>
+      <w:bookmarkStart w:id="14" w:name="_Toc241263034"/>
       <w:r>
         <w:t>Incorporación de nuevos algoritmos</w:t>
       </w:r>
@@ -5339,7 +5339,7 @@
       <w:pPr>
         <w:pStyle w:val="Heading3"/>
       </w:pPr>
-      <w:bookmarkStart w:id="15" w:name="_Toc241262616"/>
+      <w:bookmarkStart w:id="15" w:name="_Toc241263035"/>
       <w:r>
         <w:t>Incorporación de nuevas fuentes de datos</w:t>
       </w:r>
@@ -5357,7 +5357,7 @@
       <w:pPr>
         <w:pStyle w:val="Heading3"/>
       </w:pPr>
-      <w:bookmarkStart w:id="16" w:name="_Toc241262617"/>
+      <w:bookmarkStart w:id="16" w:name="_Toc241263036"/>
       <w:r>
         <w:t>Reutilización de componentes</w:t>
       </w:r>
@@ -5375,7 +5375,7 @@
       <w:pPr>
         <w:pStyle w:val="Heading3"/>
       </w:pPr>
-      <w:bookmarkStart w:id="17" w:name="_Toc241262618"/>
+      <w:bookmarkStart w:id="17" w:name="_Toc241263037"/>
       <w:r>
         <w:t>Configuración y parametrización</w:t>
       </w:r>
@@ -5393,7 +5393,7 @@
       <w:pPr>
         <w:pStyle w:val="Heading3"/>
       </w:pPr>
-      <w:bookmarkStart w:id="18" w:name="_Toc241262619"/>
+      <w:bookmarkStart w:id="18" w:name="_Toc241263038"/>
       <w:r>
         <w:t>Facilidad de mantenimiento</w:t>
       </w:r>
@@ -5411,7 +5411,7 @@
       <w:pPr>
         <w:pStyle w:val="Heading3"/>
       </w:pPr>
-      <w:bookmarkStart w:id="19" w:name="_Toc241262620"/>
+      <w:bookmarkStart w:id="19" w:name="_Toc241263039"/>
       <w:r>
         <w:t>Extensiones ya realizadas</w:t>
       </w:r>
@@ -5429,7 +5429,7 @@
       <w:pPr>
         <w:pStyle w:val="Heading1"/>
       </w:pPr>
-      <w:bookmarkStart w:id="20" w:name="_Toc241262621"/>
+      <w:bookmarkStart w:id="20" w:name="_Toc241263040"/>
       <w:r>
         <w:lastRenderedPageBreak/>
         <w:t>6. Robustez, desempeño y consistencia</w:t>
@@ -5440,7 +5440,7 @@
       <w:pPr>
         <w:pStyle w:val="Heading2"/>
       </w:pPr>
-      <w:bookmarkStart w:id="21" w:name="_Toc241262622"/>
+      <w:bookmarkStart w:id="21" w:name="_Toc241263041"/>
       <w:r>
         <w:t>6.1 Robustez</w:t>
       </w:r>
@@ -5461,7 +5461,7 @@
       <w:pPr>
         <w:pStyle w:val="Heading2"/>
       </w:pPr>
-      <w:bookmarkStart w:id="22" w:name="_Toc241262623"/>
+      <w:bookmarkStart w:id="22" w:name="_Toc241263042"/>
       <w:r>
         <w:t>6.2 Desempeño</w:t>
       </w:r>
@@ -6907,7 +6907,7 @@
       <w:pPr>
         <w:pStyle w:val="Heading2"/>
       </w:pPr>
-      <w:bookmarkStart w:id="23" w:name="_Toc241262624"/>
+      <w:bookmarkStart w:id="23" w:name="_Toc241263043"/>
       <w:r>
         <w:t>6.3 Consistencia y reproducibilidad</w:t>
       </w:r>
@@ -6925,7 +6925,7 @@
       <w:pPr>
         <w:pStyle w:val="Heading1"/>
       </w:pPr>
-      <w:bookmarkStart w:id="24" w:name="_Toc241262625"/>
+      <w:bookmarkStart w:id="24" w:name="_Toc241263044"/>
       <w:r>
         <w:t>7. Interfaz y usabilidad</w:t>
       </w:r>
@@ -6953,7 +6953,7 @@
           <w:noProof/>
         </w:rPr>
         <w:drawing>
-          <wp:inline distT="0" distB="0" distL="0" distR="0" wp14:anchorId="4919B8F7" wp14:editId="7AD9CA3F">
+          <wp:inline distT="0" distB="0" distL="0" distR="0" wp14:anchorId="1A5D01F9" wp14:editId="7D217E4D">
             <wp:extent cx="5760000" cy="3420000"/>
             <wp:effectExtent l="0" t="0" r="0" b="0"/>
             <wp:docPr id="1" name="Picture 1"/>
@@ -7007,7 +7007,7 @@
       <w:pPr>
         <w:pStyle w:val="Heading1"/>
       </w:pPr>
-      <w:bookmarkStart w:id="25" w:name="_Toc241262626"/>
+      <w:bookmarkStart w:id="25" w:name="_Toc241263045"/>
       <w:r>
         <w:t>8. Integridad y seguridad de la información</w:t>
       </w:r>
@@ -7028,7 +7028,7 @@
       <w:pPr>
         <w:pStyle w:val="Heading1"/>
       </w:pPr>
-      <w:bookmarkStart w:id="26" w:name="_Toc241262627"/>
+      <w:bookmarkStart w:id="26" w:name="_Toc241263046"/>
       <w:r>
         <w:t>9. Portabilidad y compatibilidad</w:t>
       </w:r>
@@ -7038,7 +7038,7 @@
       <w:pPr>
         <w:pStyle w:val="Heading2"/>
       </w:pPr>
-      <w:bookmarkStart w:id="27" w:name="_Toc241262628"/>
+      <w:bookmarkStart w:id="27" w:name="_Toc241263047"/>
       <w:r>
         <w:t>9.1 Plataformas compatibles</w:t>
       </w:r>
@@ -7056,7 +7056,7 @@
       <w:pPr>
         <w:pStyle w:val="Heading2"/>
       </w:pPr>
-      <w:bookmarkStart w:id="28" w:name="_Toc241262629"/>
+      <w:bookmarkStart w:id="28" w:name="_Toc241263048"/>
       <w:r>
         <w:lastRenderedPageBreak/>
         <w:t>9.2 Dependencias relevantes</w:t>
@@ -7378,7 +7378,7 @@
       <w:pPr>
         <w:pStyle w:val="Heading2"/>
       </w:pPr>
-      <w:bookmarkStart w:id="29" w:name="_Toc241262630"/>
+      <w:bookmarkStart w:id="29" w:name="_Toc241263049"/>
       <w:r>
         <w:t>9.3 Portabilidad</w:t>
       </w:r>
@@ -8091,7 +8091,7 @@
       <w:pPr>
         <w:pStyle w:val="Heading1"/>
       </w:pPr>
-      <w:bookmarkStart w:id="30" w:name="_Toc241262631"/>
+      <w:bookmarkStart w:id="30" w:name="_Toc241263050"/>
       <w:r>
         <w:t>10. Documentación y soporte técnico</w:t>
       </w:r>
@@ -8109,7 +8109,7 @@
       <w:pPr>
         <w:pStyle w:val="Heading3"/>
       </w:pPr>
-      <w:bookmarkStart w:id="31" w:name="_Toc241262632"/>
+      <w:bookmarkStart w:id="31" w:name="_Toc241263051"/>
       <w:r>
         <w:lastRenderedPageBreak/>
         <w:t>Soporte técnico</w:t>
@@ -8128,7 +8128,7 @@
       <w:pPr>
         <w:pStyle w:val="Heading1"/>
       </w:pPr>
-      <w:bookmarkStart w:id="32" w:name="_Toc241262633"/>
+      <w:bookmarkStart w:id="32" w:name="_Toc241263052"/>
       <w:r>
         <w:t>11. Pruebas, validación y desempeño</w:t>
       </w:r>
@@ -10148,7 +10148,7 @@
       <w:pPr>
         <w:pStyle w:val="Heading1"/>
       </w:pPr>
-      <w:bookmarkStart w:id="33" w:name="_Toc241262634"/>
+      <w:bookmarkStart w:id="33" w:name="_Toc241263053"/>
       <w:r>
         <w:lastRenderedPageBreak/>
         <w:t>12. Impacto y utilización</w:t>
@@ -10159,7 +10159,7 @@
       <w:pPr>
         <w:pStyle w:val="Heading2"/>
       </w:pPr>
-      <w:bookmarkStart w:id="34" w:name="_Toc241262635"/>
+      <w:bookmarkStart w:id="34" w:name="_Toc241263054"/>
       <w:r>
         <w:t>12.1 Impacto en docencia</w:t>
       </w:r>
@@ -10177,7 +10177,7 @@
       <w:pPr>
         <w:pStyle w:val="Heading2"/>
       </w:pPr>
-      <w:bookmarkStart w:id="35" w:name="_Toc241262636"/>
+      <w:bookmarkStart w:id="35" w:name="_Toc241263055"/>
       <w:r>
         <w:t>12.2 Impacto en investigación</w:t>
       </w:r>
@@ -10195,7 +10195,7 @@
       <w:pPr>
         <w:pStyle w:val="Heading2"/>
       </w:pPr>
-      <w:bookmarkStart w:id="36" w:name="_Toc241262637"/>
+      <w:bookmarkStart w:id="36" w:name="_Toc241263056"/>
       <w:r>
         <w:t>12.3 Impacto en extensión</w:t>
       </w:r>
@@ -10213,7 +10213,7 @@
       <w:pPr>
         <w:pStyle w:val="Heading2"/>
       </w:pPr>
-      <w:bookmarkStart w:id="37" w:name="_Toc241262638"/>
+      <w:bookmarkStart w:id="37" w:name="_Toc241263057"/>
       <w:r>
         <w:t>12.4 Usuarios y utilización</w:t>
       </w:r>
@@ -10231,7 +10231,7 @@
       <w:pPr>
         <w:pStyle w:val="Heading2"/>
       </w:pPr>
-      <w:bookmarkStart w:id="38" w:name="_Toc241262639"/>
+      <w:bookmarkStart w:id="38" w:name="_Toc241263058"/>
       <w:r>
         <w:t>12.5 Evidencias de impacto</w:t>
       </w:r>
@@ -10249,7 +10249,7 @@
       <w:pPr>
         <w:pStyle w:val="Heading1"/>
       </w:pPr>
-      <w:bookmarkStart w:id="39" w:name="_Toc241262640"/>
+      <w:bookmarkStart w:id="39" w:name="_Toc241263059"/>
       <w:r>
         <w:t>13. Contribución al estado del arte</w:t>
       </w:r>
@@ -10259,7 +10259,7 @@
       <w:pPr>
         <w:pStyle w:val="Heading2"/>
       </w:pPr>
-      <w:bookmarkStart w:id="40" w:name="_Toc241262641"/>
+      <w:bookmarkStart w:id="40" w:name="_Toc241263060"/>
       <w:r>
         <w:t>13.1 Problema abordado</w:t>
       </w:r>
@@ -10277,7 +10277,7 @@
       <w:pPr>
         <w:pStyle w:val="Heading2"/>
       </w:pPr>
-      <w:bookmarkStart w:id="41" w:name="_Toc241262642"/>
+      <w:bookmarkStart w:id="41" w:name="_Toc241263061"/>
       <w:r>
         <w:lastRenderedPageBreak/>
         <w:t>13.2 Estado del arte</w:t>
@@ -10296,7 +10296,7 @@
       <w:pPr>
         <w:pStyle w:val="Heading2"/>
       </w:pPr>
-      <w:bookmarkStart w:id="42" w:name="_Toc241262643"/>
+      <w:bookmarkStart w:id="42" w:name="_Toc241263062"/>
       <w:r>
         <w:t>13.3 Limitaciones actuales del estado del arte</w:t>
       </w:r>
@@ -10314,7 +10314,7 @@
       <w:pPr>
         <w:pStyle w:val="Heading2"/>
       </w:pPr>
-      <w:bookmarkStart w:id="43" w:name="_Toc241262644"/>
+      <w:bookmarkStart w:id="43" w:name="_Toc241263063"/>
       <w:r>
         <w:t>13.4 Impacto de Meritum_CAT sobre el estado del arte</w:t>
       </w:r>
@@ -10335,7 +10335,7 @@
       <w:pPr>
         <w:pStyle w:val="Heading1"/>
       </w:pPr>
-      <w:bookmarkStart w:id="44" w:name="_Toc241262645"/>
+      <w:bookmarkStart w:id="44" w:name="_Toc241263064"/>
       <w:r>
         <w:t>14. Aportes de los autores</w:t>
       </w:r>
@@ -10345,7 +10345,7 @@
       <w:pPr>
         <w:pStyle w:val="Heading2"/>
       </w:pPr>
-      <w:bookmarkStart w:id="45" w:name="_Toc241262646"/>
+      <w:bookmarkStart w:id="45" w:name="_Toc241263065"/>
       <w:r>
         <w:t>14.1 Keidy Lucía Gómez Otero</w:t>
       </w:r>
@@ -10356,18 +10356,14 @@
         <w:jc w:val="both"/>
       </w:pPr>
       <w:r>
-        <w:rPr>
-          <w:i/>
-          <w:highlight w:val="yellow"/>
-        </w:rPr>
-        <w:t>[COMPLETAR: aportes de este autor a la concepción, el diseño metodológico, el desarrollo, la validación y la documentación del software]</w:t>
+        <w:t>Responsable del componente educativo del software: la fundamentación en evaluación educativa, la pertinencia de los experimentos y de las métricas para el diseño de pruebas, la orientación del producto hacia su uso en docencia y la revisión del sentido educativo de los resultados y de la documentación.</w:t>
       </w:r>
     </w:p>
     <w:p>
       <w:pPr>
         <w:pStyle w:val="Heading2"/>
       </w:pPr>
-      <w:bookmarkStart w:id="46" w:name="_Toc241262647"/>
+      <w:bookmarkStart w:id="46" w:name="_Toc241263066"/>
       <w:r>
         <w:t>14.2 Francisco Javier Burgos Flórez</w:t>
       </w:r>
@@ -10378,18 +10374,14 @@
         <w:jc w:val="both"/>
       </w:pPr>
       <w:r>
-        <w:rPr>
-          <w:i/>
-          <w:highlight w:val="yellow"/>
-        </w:rPr>
-        <w:t>[COMPLETAR: aportes de este autor a la concepción, el diseño metodológico, el desarrollo, la validación y la documentación del software]</w:t>
+        <w:t>Responsable del desarrollo del software: el diseño de la arquitectura, la implementación del núcleo psicométrico (modelos IRT, estimadores, selección de ítems, control de exposición y simulación Monte Carlo), la interfaz gráfica bilingüe, las pruebas automatizadas, el empaquetado del ejecutable y la documentación técnica.</w:t>
       </w:r>
     </w:p>
     <w:p>
       <w:pPr>
         <w:pStyle w:val="Heading1"/>
       </w:pPr>
-      <w:bookmarkStart w:id="47" w:name="_Toc241262648"/>
+      <w:bookmarkStart w:id="47" w:name="_Toc241263067"/>
       <w:r>
         <w:t>Referencias</w:t>
       </w:r>
@@ -10411,11 +10403,6 @@
           <w:sz w:val="20"/>
         </w:rPr>
         <w:tab/>
-      </w:r>
-      <w:r>
-        <w:rPr>
-          <w:sz w:val="20"/>
-        </w:rPr>
         <w:t>G. Rasch, Probabilistic Models for Some Intelligence and Attainment Tests. Copenhague, Dinamarca: Danish Institute for Educational Research, 1960.</w:t>
       </w:r>
     </w:p>
@@ -10435,6 +10422,11 @@
           <w:sz w:val="20"/>
         </w:rPr>
         <w:tab/>
+      </w:r>
+      <w:r>
+        <w:rPr>
+          <w:sz w:val="20"/>
+        </w:rPr>
         <w:t>A. Birnbaum, “Some latent trait models and their use in inferring an examinee's ability,” en F. M. Lord y M. R. Novick, Statistical Theories of Mental Test Scores. Reading, MA, EE. UU.: Addison-Wesley, 1968, pp. 397–479.</w:t>
       </w:r>
     </w:p>
@@ -10447,7 +10439,46 @@
         <w:rPr>
           <w:sz w:val="20"/>
         </w:rPr>
+        <w:lastRenderedPageBreak/>
         <w:t>[3]</w:t>
+      </w:r>
+      <w:r>
+        <w:rPr>
+          <w:sz w:val="20"/>
+        </w:rPr>
+        <w:tab/>
+        <w:t>F. M. Lord, Applications of Item Response Theory to Practical Testing Problems. Hillsdale, NJ, EE. UU.: Lawrence Erlbaum Associates, 1980.</w:t>
+      </w:r>
+    </w:p>
+    <w:p>
+      <w:pPr>
+        <w:spacing w:after="80"/>
+        <w:ind w:left="510" w:hanging="510"/>
+      </w:pPr>
+      <w:r>
+        <w:rPr>
+          <w:sz w:val="20"/>
+        </w:rPr>
+        <w:t>[4]</w:t>
+      </w:r>
+      <w:r>
+        <w:rPr>
+          <w:sz w:val="20"/>
+        </w:rPr>
+        <w:tab/>
+        <w:t>R. K. Hambleton, H. Swaminathan y H. J. Rogers, Fundamentals of Item Response Theory. Newbury Park, CA, EE. UU.: Sage, 1991.</w:t>
+      </w:r>
+    </w:p>
+    <w:p>
+      <w:pPr>
+        <w:spacing w:after="80"/>
+        <w:ind w:left="510" w:hanging="510"/>
+      </w:pPr>
+      <w:r>
+        <w:rPr>
+          <w:sz w:val="20"/>
+        </w:rPr>
+        <w:t>[5]</w:t>
       </w:r>
       <w:r>
         <w:rPr>
@@ -10459,45 +10490,6 @@
         <w:rPr>
           <w:sz w:val="20"/>
         </w:rPr>
-        <w:t>F. M. Lord, Applications of Item Response Theory to Practical Testing Problems. Hillsdale, NJ, EE. UU.: Lawrence Erlbaum Associates, 1980.</w:t>
-      </w:r>
-    </w:p>
-    <w:p>
-      <w:pPr>
-        <w:spacing w:after="80"/>
-        <w:ind w:left="510" w:hanging="510"/>
-      </w:pPr>
-      <w:r>
-        <w:rPr>
-          <w:sz w:val="20"/>
-        </w:rPr>
-        <w:lastRenderedPageBreak/>
-        <w:t>[4]</w:t>
-      </w:r>
-      <w:r>
-        <w:rPr>
-          <w:sz w:val="20"/>
-        </w:rPr>
-        <w:tab/>
-        <w:t>R. K. Hambleton, H. Swaminathan y H. J. Rogers, Fundamentals of Item Response Theory. Newbury Park, CA, EE. UU.: Sage, 1991.</w:t>
-      </w:r>
-    </w:p>
-    <w:p>
-      <w:pPr>
-        <w:spacing w:after="80"/>
-        <w:ind w:left="510" w:hanging="510"/>
-      </w:pPr>
-      <w:r>
-        <w:rPr>
-          <w:sz w:val="20"/>
-        </w:rPr>
-        <w:t>[5]</w:t>
-      </w:r>
-      <w:r>
-        <w:rPr>
-          <w:sz w:val="20"/>
-        </w:rPr>
-        <w:tab/>
         <w:t>S. E. Embretson y S. P. Reise, Item Response Theory for Psychologists. Mahwah, NJ, EE. UU.: Lawrence Erlbaum Associates, 2000.</w:t>
       </w:r>
     </w:p>
@@ -10517,11 +10509,6 @@
           <w:sz w:val="20"/>
         </w:rPr>
         <w:tab/>
-      </w:r>
-      <w:r>
-        <w:rPr>
-          <w:sz w:val="20"/>
-        </w:rPr>
         <w:t>F. B. Baker y S.-H. Kim, Item Response Theory: Parameter Estimation Techniques, 2.ª ed. Nueva York, NY, EE. UU.: Marcel Dekker, 2004, doi: 10.1201/9781482276725.</w:t>
       </w:r>
     </w:p>
@@ -10849,6 +10836,7 @@
         <w:rPr>
           <w:sz w:val="20"/>
         </w:rPr>
+        <w:lastRenderedPageBreak/>
         <w:t>[22]</w:t>
       </w:r>
       <w:r>
@@ -10868,7 +10856,6 @@
         <w:rPr>
           <w:sz w:val="20"/>
         </w:rPr>
-        <w:lastRenderedPageBreak/>
         <w:t>[23]</w:t>
       </w:r>
       <w:r>
@@ -11174,31 +11161,31 @@
       </w:rPr>
     </w:lvl>
   </w:abstractNum>
-  <w:num w:numId="1" w16cid:durableId="1870217087">
+  <w:num w:numId="1" w16cid:durableId="1369648339">
     <w:abstractNumId w:val="8"/>
   </w:num>
-  <w:num w:numId="2" w16cid:durableId="859898545">
+  <w:num w:numId="2" w16cid:durableId="1864785152">
     <w:abstractNumId w:val="6"/>
   </w:num>
-  <w:num w:numId="3" w16cid:durableId="1388409690">
+  <w:num w:numId="3" w16cid:durableId="1517503209">
     <w:abstractNumId w:val="5"/>
   </w:num>
-  <w:num w:numId="4" w16cid:durableId="1584299823">
+  <w:num w:numId="4" w16cid:durableId="750126520">
     <w:abstractNumId w:val="4"/>
   </w:num>
-  <w:num w:numId="5" w16cid:durableId="1115518810">
+  <w:num w:numId="5" w16cid:durableId="908657305">
     <w:abstractNumId w:val="7"/>
   </w:num>
-  <w:num w:numId="6" w16cid:durableId="137112104">
+  <w:num w:numId="6" w16cid:durableId="323361023">
     <w:abstractNumId w:val="3"/>
   </w:num>
-  <w:num w:numId="7" w16cid:durableId="1799956124">
+  <w:num w:numId="7" w16cid:durableId="1324973266">
     <w:abstractNumId w:val="2"/>
   </w:num>
-  <w:num w:numId="8" w16cid:durableId="920287438">
+  <w:num w:numId="8" w16cid:durableId="857624845">
     <w:abstractNumId w:val="1"/>
   </w:num>
-  <w:num w:numId="9" w16cid:durableId="2048142208">
+  <w:num w:numId="9" w16cid:durableId="628517508">
     <w:abstractNumId w:val="0"/>
   </w:num>
 </w:numbering>
@@ -22586,7 +22573,7 @@
     <w:autoRedefine/>
     <w:uiPriority w:val="39"/>
     <w:unhideWhenUsed/>
-    <w:rsid w:val="0042607B"/>
+    <w:rsid w:val="00F13991"/>
     <w:pPr>
       <w:spacing w:after="100"/>
     </w:pPr>
@@ -22598,7 +22585,7 @@
     <w:autoRedefine/>
     <w:uiPriority w:val="39"/>
     <w:unhideWhenUsed/>
-    <w:rsid w:val="0042607B"/>
+    <w:rsid w:val="00F13991"/>
     <w:pPr>
       <w:spacing w:after="100"/>
       <w:ind w:left="220"/>
@@ -22611,7 +22598,7 @@
     <w:autoRedefine/>
     <w:uiPriority w:val="39"/>
     <w:unhideWhenUsed/>
-    <w:rsid w:val="0042607B"/>
+    <w:rsid w:val="00F13991"/>
     <w:pPr>
       <w:spacing w:after="100"/>
       <w:ind w:left="440"/>
@@ -22622,7 +22609,7 @@
     <w:basedOn w:val="DefaultParagraphFont"/>
     <w:uiPriority w:val="99"/>
     <w:unhideWhenUsed/>
-    <w:rsid w:val="0042607B"/>
+    <w:rsid w:val="00F13991"/>
     <w:rPr>
       <w:color w:val="0000FF" w:themeColor="hyperlink"/>
       <w:u w:val="single"/>

</xml_diff>

<commit_message>
Agrega tercer autor, retira la licencia y corrige la documentación
- Autores: Keidy Lucía Gómez Otero, Francisco Javier Burgos Flórez y
  Juan Guillermo Popayán Hernández (código, metadatos, Acerca de, README,
  CITATION.cff, pyproject.toml y manuales).
- Se retira la licencia del proyecto (archivo LICENSE y menciones); se
  conservan las atribuciones de los componentes de terceros.
- README: corrige el comando de compilación y aclara que los manuales se
  distribuyen por separado.
- Manuales: ecuaciones como objetos de Word (OMML), referencias sin
  autocita, ruta del registro y redacción de reproducibilidad y resultados.
- Prueba de la ventana Acerca de con los tres autores en español e inglés.
</commit_message>
<xml_diff>
--- a/manuales/Descripcion_del_Software_Meritum_CAT.docx
+++ b/manuales/Descripcion_del_Software_Meritum_CAT.docx
@@ -89,7 +89,7 @@
               <w:rPr>
                 <w:sz w:val="20"/>
               </w:rPr>
-              <w:t>Keidy Lucía Gómez Otero – Francisco Javier Burgos Flórez</w:t>
+              <w:t>Keidy Lucía Gómez Otero – Francisco Javier Burgos Flórez – Juan Guillermo Popayán Hernández</w:t>
             </w:r>
           </w:p>
         </w:tc>
@@ -286,7 +286,7 @@
       <w:r>
         <w:fldChar w:fldCharType="separate"/>
       </w:r>
-      <w:hyperlink w:anchor="_Toc241263020" w:history="1">
+      <w:hyperlink w:anchor="_Toc241314424" w:history="1">
         <w:r>
           <w:rPr>
             <w:rStyle w:val="Hyperlink"/>
@@ -313,7 +313,7 @@
             <w:noProof/>
             <w:webHidden/>
           </w:rPr>
-          <w:instrText xml:space="preserve"> PAGEREF _Toc241263020 \h </w:instrText>
+          <w:instrText xml:space="preserve"> PAGEREF _Toc241314424 \h </w:instrText>
         </w:r>
         <w:r>
           <w:rPr>
@@ -354,7 +354,7 @@
           <w:noProof/>
         </w:rPr>
       </w:pPr>
-      <w:hyperlink w:anchor="_Toc241263021" w:history="1">
+      <w:hyperlink w:anchor="_Toc241314425" w:history="1">
         <w:r>
           <w:rPr>
             <w:rStyle w:val="Hyperlink"/>
@@ -381,7 +381,7 @@
             <w:noProof/>
             <w:webHidden/>
           </w:rPr>
-          <w:instrText xml:space="preserve"> PAGEREF _Toc241263021 \h </w:instrText>
+          <w:instrText xml:space="preserve"> PAGEREF _Toc241314425 \h </w:instrText>
         </w:r>
         <w:r>
           <w:rPr>
@@ -422,7 +422,7 @@
           <w:noProof/>
         </w:rPr>
       </w:pPr>
-      <w:hyperlink w:anchor="_Toc241263022" w:history="1">
+      <w:hyperlink w:anchor="_Toc241314426" w:history="1">
         <w:r>
           <w:rPr>
             <w:rStyle w:val="Hyperlink"/>
@@ -449,7 +449,7 @@
             <w:noProof/>
             <w:webHidden/>
           </w:rPr>
-          <w:instrText xml:space="preserve"> PAGEREF _Toc241263022 \h </w:instrText>
+          <w:instrText xml:space="preserve"> PAGEREF _Toc241314426 \h </w:instrText>
         </w:r>
         <w:r>
           <w:rPr>
@@ -490,7 +490,7 @@
           <w:noProof/>
         </w:rPr>
       </w:pPr>
-      <w:hyperlink w:anchor="_Toc241263023" w:history="1">
+      <w:hyperlink w:anchor="_Toc241314427" w:history="1">
         <w:r>
           <w:rPr>
             <w:rStyle w:val="Hyperlink"/>
@@ -517,7 +517,7 @@
             <w:noProof/>
             <w:webHidden/>
           </w:rPr>
-          <w:instrText xml:space="preserve"> PAGEREF _Toc241263023 \h </w:instrText>
+          <w:instrText xml:space="preserve"> PAGEREF _Toc241314427 \h </w:instrText>
         </w:r>
         <w:r>
           <w:rPr>
@@ -558,7 +558,7 @@
           <w:noProof/>
         </w:rPr>
       </w:pPr>
-      <w:hyperlink w:anchor="_Toc241263024" w:history="1">
+      <w:hyperlink w:anchor="_Toc241314428" w:history="1">
         <w:r>
           <w:rPr>
             <w:rStyle w:val="Hyperlink"/>
@@ -585,7 +585,7 @@
             <w:noProof/>
             <w:webHidden/>
           </w:rPr>
-          <w:instrText xml:space="preserve"> PAGEREF _Toc241263024 \h </w:instrText>
+          <w:instrText xml:space="preserve"> PAGEREF _Toc241314428 \h </w:instrText>
         </w:r>
         <w:r>
           <w:rPr>
@@ -626,7 +626,7 @@
           <w:noProof/>
         </w:rPr>
       </w:pPr>
-      <w:hyperlink w:anchor="_Toc241263025" w:history="1">
+      <w:hyperlink w:anchor="_Toc241314429" w:history="1">
         <w:r>
           <w:rPr>
             <w:rStyle w:val="Hyperlink"/>
@@ -653,7 +653,7 @@
             <w:noProof/>
             <w:webHidden/>
           </w:rPr>
-          <w:instrText xml:space="preserve"> PAGEREF _Toc241263025 \h </w:instrText>
+          <w:instrText xml:space="preserve"> PAGEREF _Toc241314429 \h </w:instrText>
         </w:r>
         <w:r>
           <w:rPr>
@@ -694,7 +694,7 @@
           <w:noProof/>
         </w:rPr>
       </w:pPr>
-      <w:hyperlink w:anchor="_Toc241263026" w:history="1">
+      <w:hyperlink w:anchor="_Toc241314430" w:history="1">
         <w:r>
           <w:rPr>
             <w:rStyle w:val="Hyperlink"/>
@@ -721,7 +721,7 @@
             <w:noProof/>
             <w:webHidden/>
           </w:rPr>
-          <w:instrText xml:space="preserve"> PAGEREF _Toc241263026 \h </w:instrText>
+          <w:instrText xml:space="preserve"> PAGEREF _Toc241314430 \h </w:instrText>
         </w:r>
         <w:r>
           <w:rPr>
@@ -762,7 +762,7 @@
           <w:noProof/>
         </w:rPr>
       </w:pPr>
-      <w:hyperlink w:anchor="_Toc241263027" w:history="1">
+      <w:hyperlink w:anchor="_Toc241314431" w:history="1">
         <w:r>
           <w:rPr>
             <w:rStyle w:val="Hyperlink"/>
@@ -789,7 +789,7 @@
             <w:noProof/>
             <w:webHidden/>
           </w:rPr>
-          <w:instrText xml:space="preserve"> PAGEREF _Toc241263027 \h </w:instrText>
+          <w:instrText xml:space="preserve"> PAGEREF _Toc241314431 \h </w:instrText>
         </w:r>
         <w:r>
           <w:rPr>
@@ -830,7 +830,7 @@
           <w:noProof/>
         </w:rPr>
       </w:pPr>
-      <w:hyperlink w:anchor="_Toc241263028" w:history="1">
+      <w:hyperlink w:anchor="_Toc241314432" w:history="1">
         <w:r>
           <w:rPr>
             <w:rStyle w:val="Hyperlink"/>
@@ -857,7 +857,7 @@
             <w:noProof/>
             <w:webHidden/>
           </w:rPr>
-          <w:instrText xml:space="preserve"> PAGEREF _Toc241263028 \h </w:instrText>
+          <w:instrText xml:space="preserve"> PAGEREF _Toc241314432 \h </w:instrText>
         </w:r>
         <w:r>
           <w:rPr>
@@ -898,7 +898,7 @@
           <w:noProof/>
         </w:rPr>
       </w:pPr>
-      <w:hyperlink w:anchor="_Toc241263029" w:history="1">
+      <w:hyperlink w:anchor="_Toc241314433" w:history="1">
         <w:r>
           <w:rPr>
             <w:rStyle w:val="Hyperlink"/>
@@ -925,7 +925,7 @@
             <w:noProof/>
             <w:webHidden/>
           </w:rPr>
-          <w:instrText xml:space="preserve"> PAGEREF _Toc241263029 \h </w:instrText>
+          <w:instrText xml:space="preserve"> PAGEREF _Toc241314433 \h </w:instrText>
         </w:r>
         <w:r>
           <w:rPr>
@@ -966,7 +966,7 @@
           <w:noProof/>
         </w:rPr>
       </w:pPr>
-      <w:hyperlink w:anchor="_Toc241263030" w:history="1">
+      <w:hyperlink w:anchor="_Toc241314434" w:history="1">
         <w:r>
           <w:rPr>
             <w:rStyle w:val="Hyperlink"/>
@@ -993,7 +993,7 @@
             <w:noProof/>
             <w:webHidden/>
           </w:rPr>
-          <w:instrText xml:space="preserve"> PAGEREF _Toc241263030 \h </w:instrText>
+          <w:instrText xml:space="preserve"> PAGEREF _Toc241314434 \h </w:instrText>
         </w:r>
         <w:r>
           <w:rPr>
@@ -1034,7 +1034,7 @@
           <w:noProof/>
         </w:rPr>
       </w:pPr>
-      <w:hyperlink w:anchor="_Toc241263031" w:history="1">
+      <w:hyperlink w:anchor="_Toc241314435" w:history="1">
         <w:r>
           <w:rPr>
             <w:rStyle w:val="Hyperlink"/>
@@ -1061,7 +1061,7 @@
             <w:noProof/>
             <w:webHidden/>
           </w:rPr>
-          <w:instrText xml:space="preserve"> PAGEREF _Toc241263031 \h </w:instrText>
+          <w:instrText xml:space="preserve"> PAGEREF _Toc241314435 \h </w:instrText>
         </w:r>
         <w:r>
           <w:rPr>
@@ -1102,7 +1102,7 @@
           <w:noProof/>
         </w:rPr>
       </w:pPr>
-      <w:hyperlink w:anchor="_Toc241263032" w:history="1">
+      <w:hyperlink w:anchor="_Toc241314436" w:history="1">
         <w:r>
           <w:rPr>
             <w:rStyle w:val="Hyperlink"/>
@@ -1129,7 +1129,7 @@
             <w:noProof/>
             <w:webHidden/>
           </w:rPr>
-          <w:instrText xml:space="preserve"> PAGEREF _Toc241263032 \h </w:instrText>
+          <w:instrText xml:space="preserve"> PAGEREF _Toc241314436 \h </w:instrText>
         </w:r>
         <w:r>
           <w:rPr>
@@ -1170,7 +1170,7 @@
           <w:noProof/>
         </w:rPr>
       </w:pPr>
-      <w:hyperlink w:anchor="_Toc241263033" w:history="1">
+      <w:hyperlink w:anchor="_Toc241314437" w:history="1">
         <w:r>
           <w:rPr>
             <w:rStyle w:val="Hyperlink"/>
@@ -1197,7 +1197,7 @@
             <w:noProof/>
             <w:webHidden/>
           </w:rPr>
-          <w:instrText xml:space="preserve"> PAGEREF _Toc241263033 \h </w:instrText>
+          <w:instrText xml:space="preserve"> PAGEREF _Toc241314437 \h </w:instrText>
         </w:r>
         <w:r>
           <w:rPr>
@@ -1238,7 +1238,7 @@
           <w:noProof/>
         </w:rPr>
       </w:pPr>
-      <w:hyperlink w:anchor="_Toc241263034" w:history="1">
+      <w:hyperlink w:anchor="_Toc241314438" w:history="1">
         <w:r>
           <w:rPr>
             <w:rStyle w:val="Hyperlink"/>
@@ -1265,7 +1265,7 @@
             <w:noProof/>
             <w:webHidden/>
           </w:rPr>
-          <w:instrText xml:space="preserve"> PAGEREF _Toc241263034 \h </w:instrText>
+          <w:instrText xml:space="preserve"> PAGEREF _Toc241314438 \h </w:instrText>
         </w:r>
         <w:r>
           <w:rPr>
@@ -1306,7 +1306,7 @@
           <w:noProof/>
         </w:rPr>
       </w:pPr>
-      <w:hyperlink w:anchor="_Toc241263035" w:history="1">
+      <w:hyperlink w:anchor="_Toc241314439" w:history="1">
         <w:r>
           <w:rPr>
             <w:rStyle w:val="Hyperlink"/>
@@ -1333,7 +1333,7 @@
             <w:noProof/>
             <w:webHidden/>
           </w:rPr>
-          <w:instrText xml:space="preserve"> PAGEREF _Toc241263035 \h </w:instrText>
+          <w:instrText xml:space="preserve"> PAGEREF _Toc241314439 \h </w:instrText>
         </w:r>
         <w:r>
           <w:rPr>
@@ -1374,7 +1374,7 @@
           <w:noProof/>
         </w:rPr>
       </w:pPr>
-      <w:hyperlink w:anchor="_Toc241263036" w:history="1">
+      <w:hyperlink w:anchor="_Toc241314440" w:history="1">
         <w:r>
           <w:rPr>
             <w:rStyle w:val="Hyperlink"/>
@@ -1401,7 +1401,7 @@
             <w:noProof/>
             <w:webHidden/>
           </w:rPr>
-          <w:instrText xml:space="preserve"> PAGEREF _Toc241263036 \h </w:instrText>
+          <w:instrText xml:space="preserve"> PAGEREF _Toc241314440 \h </w:instrText>
         </w:r>
         <w:r>
           <w:rPr>
@@ -1442,7 +1442,7 @@
           <w:noProof/>
         </w:rPr>
       </w:pPr>
-      <w:hyperlink w:anchor="_Toc241263037" w:history="1">
+      <w:hyperlink w:anchor="_Toc241314441" w:history="1">
         <w:r>
           <w:rPr>
             <w:rStyle w:val="Hyperlink"/>
@@ -1469,7 +1469,7 @@
             <w:noProof/>
             <w:webHidden/>
           </w:rPr>
-          <w:instrText xml:space="preserve"> PAGEREF _Toc241263037 \h </w:instrText>
+          <w:instrText xml:space="preserve"> PAGEREF _Toc241314441 \h </w:instrText>
         </w:r>
         <w:r>
           <w:rPr>
@@ -1510,7 +1510,7 @@
           <w:noProof/>
         </w:rPr>
       </w:pPr>
-      <w:hyperlink w:anchor="_Toc241263038" w:history="1">
+      <w:hyperlink w:anchor="_Toc241314442" w:history="1">
         <w:r>
           <w:rPr>
             <w:rStyle w:val="Hyperlink"/>
@@ -1537,7 +1537,7 @@
             <w:noProof/>
             <w:webHidden/>
           </w:rPr>
-          <w:instrText xml:space="preserve"> PAGEREF _Toc241263038 \h </w:instrText>
+          <w:instrText xml:space="preserve"> PAGEREF _Toc241314442 \h </w:instrText>
         </w:r>
         <w:r>
           <w:rPr>
@@ -1578,7 +1578,7 @@
           <w:noProof/>
         </w:rPr>
       </w:pPr>
-      <w:hyperlink w:anchor="_Toc241263039" w:history="1">
+      <w:hyperlink w:anchor="_Toc241314443" w:history="1">
         <w:r>
           <w:rPr>
             <w:rStyle w:val="Hyperlink"/>
@@ -1605,7 +1605,7 @@
             <w:noProof/>
             <w:webHidden/>
           </w:rPr>
-          <w:instrText xml:space="preserve"> PAGEREF _Toc241263039 \h </w:instrText>
+          <w:instrText xml:space="preserve"> PAGEREF _Toc241314443 \h </w:instrText>
         </w:r>
         <w:r>
           <w:rPr>
@@ -1646,7 +1646,7 @@
           <w:noProof/>
         </w:rPr>
       </w:pPr>
-      <w:hyperlink w:anchor="_Toc241263040" w:history="1">
+      <w:hyperlink w:anchor="_Toc241314444" w:history="1">
         <w:r>
           <w:rPr>
             <w:rStyle w:val="Hyperlink"/>
@@ -1673,7 +1673,7 @@
             <w:noProof/>
             <w:webHidden/>
           </w:rPr>
-          <w:instrText xml:space="preserve"> PAGEREF _Toc241263040 \h </w:instrText>
+          <w:instrText xml:space="preserve"> PAGEREF _Toc241314444 \h </w:instrText>
         </w:r>
         <w:r>
           <w:rPr>
@@ -1714,7 +1714,7 @@
           <w:noProof/>
         </w:rPr>
       </w:pPr>
-      <w:hyperlink w:anchor="_Toc241263041" w:history="1">
+      <w:hyperlink w:anchor="_Toc241314445" w:history="1">
         <w:r>
           <w:rPr>
             <w:rStyle w:val="Hyperlink"/>
@@ -1741,7 +1741,7 @@
             <w:noProof/>
             <w:webHidden/>
           </w:rPr>
-          <w:instrText xml:space="preserve"> PAGEREF _Toc241263041 \h </w:instrText>
+          <w:instrText xml:space="preserve"> PAGEREF _Toc241314445 \h </w:instrText>
         </w:r>
         <w:r>
           <w:rPr>
@@ -1782,7 +1782,7 @@
           <w:noProof/>
         </w:rPr>
       </w:pPr>
-      <w:hyperlink w:anchor="_Toc241263042" w:history="1">
+      <w:hyperlink w:anchor="_Toc241314446" w:history="1">
         <w:r>
           <w:rPr>
             <w:rStyle w:val="Hyperlink"/>
@@ -1809,7 +1809,7 @@
             <w:noProof/>
             <w:webHidden/>
           </w:rPr>
-          <w:instrText xml:space="preserve"> PAGEREF _Toc241263042 \h </w:instrText>
+          <w:instrText xml:space="preserve"> PAGEREF _Toc241314446 \h </w:instrText>
         </w:r>
         <w:r>
           <w:rPr>
@@ -1850,7 +1850,7 @@
           <w:noProof/>
         </w:rPr>
       </w:pPr>
-      <w:hyperlink w:anchor="_Toc241263043" w:history="1">
+      <w:hyperlink w:anchor="_Toc241314447" w:history="1">
         <w:r>
           <w:rPr>
             <w:rStyle w:val="Hyperlink"/>
@@ -1877,7 +1877,7 @@
             <w:noProof/>
             <w:webHidden/>
           </w:rPr>
-          <w:instrText xml:space="preserve"> PAGEREF _Toc241263043 \h </w:instrText>
+          <w:instrText xml:space="preserve"> PAGEREF _Toc241314447 \h </w:instrText>
         </w:r>
         <w:r>
           <w:rPr>
@@ -1918,7 +1918,7 @@
           <w:noProof/>
         </w:rPr>
       </w:pPr>
-      <w:hyperlink w:anchor="_Toc241263044" w:history="1">
+      <w:hyperlink w:anchor="_Toc241314448" w:history="1">
         <w:r>
           <w:rPr>
             <w:rStyle w:val="Hyperlink"/>
@@ -1945,7 +1945,7 @@
             <w:noProof/>
             <w:webHidden/>
           </w:rPr>
-          <w:instrText xml:space="preserve"> PAGEREF _Toc241263044 \h </w:instrText>
+          <w:instrText xml:space="preserve"> PAGEREF _Toc241314448 \h </w:instrText>
         </w:r>
         <w:r>
           <w:rPr>
@@ -1986,7 +1986,7 @@
           <w:noProof/>
         </w:rPr>
       </w:pPr>
-      <w:hyperlink w:anchor="_Toc241263045" w:history="1">
+      <w:hyperlink w:anchor="_Toc241314449" w:history="1">
         <w:r>
           <w:rPr>
             <w:rStyle w:val="Hyperlink"/>
@@ -2013,7 +2013,7 @@
             <w:noProof/>
             <w:webHidden/>
           </w:rPr>
-          <w:instrText xml:space="preserve"> PAGEREF _Toc241263045 \h </w:instrText>
+          <w:instrText xml:space="preserve"> PAGEREF _Toc241314449 \h </w:instrText>
         </w:r>
         <w:r>
           <w:rPr>
@@ -2054,7 +2054,7 @@
           <w:noProof/>
         </w:rPr>
       </w:pPr>
-      <w:hyperlink w:anchor="_Toc241263046" w:history="1">
+      <w:hyperlink w:anchor="_Toc241314450" w:history="1">
         <w:r>
           <w:rPr>
             <w:rStyle w:val="Hyperlink"/>
@@ -2081,7 +2081,7 @@
             <w:noProof/>
             <w:webHidden/>
           </w:rPr>
-          <w:instrText xml:space="preserve"> PAGEREF _Toc241263046 \h </w:instrText>
+          <w:instrText xml:space="preserve"> PAGEREF _Toc241314450 \h </w:instrText>
         </w:r>
         <w:r>
           <w:rPr>
@@ -2122,7 +2122,7 @@
           <w:noProof/>
         </w:rPr>
       </w:pPr>
-      <w:hyperlink w:anchor="_Toc241263047" w:history="1">
+      <w:hyperlink w:anchor="_Toc241314451" w:history="1">
         <w:r>
           <w:rPr>
             <w:rStyle w:val="Hyperlink"/>
@@ -2149,7 +2149,7 @@
             <w:noProof/>
             <w:webHidden/>
           </w:rPr>
-          <w:instrText xml:space="preserve"> PAGEREF _Toc241263047 \h </w:instrText>
+          <w:instrText xml:space="preserve"> PAGEREF _Toc241314451 \h </w:instrText>
         </w:r>
         <w:r>
           <w:rPr>
@@ -2190,7 +2190,7 @@
           <w:noProof/>
         </w:rPr>
       </w:pPr>
-      <w:hyperlink w:anchor="_Toc241263048" w:history="1">
+      <w:hyperlink w:anchor="_Toc241314452" w:history="1">
         <w:r>
           <w:rPr>
             <w:rStyle w:val="Hyperlink"/>
@@ -2217,7 +2217,7 @@
             <w:noProof/>
             <w:webHidden/>
           </w:rPr>
-          <w:instrText xml:space="preserve"> PAGEREF _Toc241263048 \h </w:instrText>
+          <w:instrText xml:space="preserve"> PAGEREF _Toc241314452 \h </w:instrText>
         </w:r>
         <w:r>
           <w:rPr>
@@ -2258,7 +2258,7 @@
           <w:noProof/>
         </w:rPr>
       </w:pPr>
-      <w:hyperlink w:anchor="_Toc241263049" w:history="1">
+      <w:hyperlink w:anchor="_Toc241314453" w:history="1">
         <w:r>
           <w:rPr>
             <w:rStyle w:val="Hyperlink"/>
@@ -2285,7 +2285,7 @@
             <w:noProof/>
             <w:webHidden/>
           </w:rPr>
-          <w:instrText xml:space="preserve"> PAGEREF _Toc241263049 \h </w:instrText>
+          <w:instrText xml:space="preserve"> PAGEREF _Toc241314453 \h </w:instrText>
         </w:r>
         <w:r>
           <w:rPr>
@@ -2326,7 +2326,7 @@
           <w:noProof/>
         </w:rPr>
       </w:pPr>
-      <w:hyperlink w:anchor="_Toc241263050" w:history="1">
+      <w:hyperlink w:anchor="_Toc241314454" w:history="1">
         <w:r>
           <w:rPr>
             <w:rStyle w:val="Hyperlink"/>
@@ -2353,7 +2353,7 @@
             <w:noProof/>
             <w:webHidden/>
           </w:rPr>
-          <w:instrText xml:space="preserve"> PAGEREF _Toc241263050 \h </w:instrText>
+          <w:instrText xml:space="preserve"> PAGEREF _Toc241314454 \h </w:instrText>
         </w:r>
         <w:r>
           <w:rPr>
@@ -2394,7 +2394,7 @@
           <w:noProof/>
         </w:rPr>
       </w:pPr>
-      <w:hyperlink w:anchor="_Toc241263051" w:history="1">
+      <w:hyperlink w:anchor="_Toc241314455" w:history="1">
         <w:r>
           <w:rPr>
             <w:rStyle w:val="Hyperlink"/>
@@ -2421,7 +2421,7 @@
             <w:noProof/>
             <w:webHidden/>
           </w:rPr>
-          <w:instrText xml:space="preserve"> PAGEREF _Toc241263051 \h </w:instrText>
+          <w:instrText xml:space="preserve"> PAGEREF _Toc241314455 \h </w:instrText>
         </w:r>
         <w:r>
           <w:rPr>
@@ -2462,7 +2462,7 @@
           <w:noProof/>
         </w:rPr>
       </w:pPr>
-      <w:hyperlink w:anchor="_Toc241263052" w:history="1">
+      <w:hyperlink w:anchor="_Toc241314456" w:history="1">
         <w:r>
           <w:rPr>
             <w:rStyle w:val="Hyperlink"/>
@@ -2489,7 +2489,7 @@
             <w:noProof/>
             <w:webHidden/>
           </w:rPr>
-          <w:instrText xml:space="preserve"> PAGEREF _Toc241263052 \h </w:instrText>
+          <w:instrText xml:space="preserve"> PAGEREF _Toc241314456 \h </w:instrText>
         </w:r>
         <w:r>
           <w:rPr>
@@ -2530,7 +2530,7 @@
           <w:noProof/>
         </w:rPr>
       </w:pPr>
-      <w:hyperlink w:anchor="_Toc241263053" w:history="1">
+      <w:hyperlink w:anchor="_Toc241314457" w:history="1">
         <w:r>
           <w:rPr>
             <w:rStyle w:val="Hyperlink"/>
@@ -2557,7 +2557,7 @@
             <w:noProof/>
             <w:webHidden/>
           </w:rPr>
-          <w:instrText xml:space="preserve"> PAGEREF _Toc241263053 \h </w:instrText>
+          <w:instrText xml:space="preserve"> PAGEREF _Toc241314457 \h </w:instrText>
         </w:r>
         <w:r>
           <w:rPr>
@@ -2598,7 +2598,7 @@
           <w:noProof/>
         </w:rPr>
       </w:pPr>
-      <w:hyperlink w:anchor="_Toc241263054" w:history="1">
+      <w:hyperlink w:anchor="_Toc241314458" w:history="1">
         <w:r>
           <w:rPr>
             <w:rStyle w:val="Hyperlink"/>
@@ -2625,7 +2625,7 @@
             <w:noProof/>
             <w:webHidden/>
           </w:rPr>
-          <w:instrText xml:space="preserve"> PAGEREF _Toc241263054 \h </w:instrText>
+          <w:instrText xml:space="preserve"> PAGEREF _Toc241314458 \h </w:instrText>
         </w:r>
         <w:r>
           <w:rPr>
@@ -2666,7 +2666,7 @@
           <w:noProof/>
         </w:rPr>
       </w:pPr>
-      <w:hyperlink w:anchor="_Toc241263055" w:history="1">
+      <w:hyperlink w:anchor="_Toc241314459" w:history="1">
         <w:r>
           <w:rPr>
             <w:rStyle w:val="Hyperlink"/>
@@ -2693,7 +2693,7 @@
             <w:noProof/>
             <w:webHidden/>
           </w:rPr>
-          <w:instrText xml:space="preserve"> PAGEREF _Toc241263055 \h </w:instrText>
+          <w:instrText xml:space="preserve"> PAGEREF _Toc241314459 \h </w:instrText>
         </w:r>
         <w:r>
           <w:rPr>
@@ -2734,7 +2734,7 @@
           <w:noProof/>
         </w:rPr>
       </w:pPr>
-      <w:hyperlink w:anchor="_Toc241263056" w:history="1">
+      <w:hyperlink w:anchor="_Toc241314460" w:history="1">
         <w:r>
           <w:rPr>
             <w:rStyle w:val="Hyperlink"/>
@@ -2761,7 +2761,7 @@
             <w:noProof/>
             <w:webHidden/>
           </w:rPr>
-          <w:instrText xml:space="preserve"> PAGEREF _Toc241263056 \h </w:instrText>
+          <w:instrText xml:space="preserve"> PAGEREF _Toc241314460 \h </w:instrText>
         </w:r>
         <w:r>
           <w:rPr>
@@ -2802,7 +2802,7 @@
           <w:noProof/>
         </w:rPr>
       </w:pPr>
-      <w:hyperlink w:anchor="_Toc241263057" w:history="1">
+      <w:hyperlink w:anchor="_Toc241314461" w:history="1">
         <w:r>
           <w:rPr>
             <w:rStyle w:val="Hyperlink"/>
@@ -2829,7 +2829,7 @@
             <w:noProof/>
             <w:webHidden/>
           </w:rPr>
-          <w:instrText xml:space="preserve"> PAGEREF _Toc241263057 \h </w:instrText>
+          <w:instrText xml:space="preserve"> PAGEREF _Toc241314461 \h </w:instrText>
         </w:r>
         <w:r>
           <w:rPr>
@@ -2870,7 +2870,7 @@
           <w:noProof/>
         </w:rPr>
       </w:pPr>
-      <w:hyperlink w:anchor="_Toc241263058" w:history="1">
+      <w:hyperlink w:anchor="_Toc241314462" w:history="1">
         <w:r>
           <w:rPr>
             <w:rStyle w:val="Hyperlink"/>
@@ -2897,7 +2897,7 @@
             <w:noProof/>
             <w:webHidden/>
           </w:rPr>
-          <w:instrText xml:space="preserve"> PAGEREF _Toc241263058 \h </w:instrText>
+          <w:instrText xml:space="preserve"> PAGEREF _Toc241314462 \h </w:instrText>
         </w:r>
         <w:r>
           <w:rPr>
@@ -2938,7 +2938,7 @@
           <w:noProof/>
         </w:rPr>
       </w:pPr>
-      <w:hyperlink w:anchor="_Toc241263059" w:history="1">
+      <w:hyperlink w:anchor="_Toc241314463" w:history="1">
         <w:r>
           <w:rPr>
             <w:rStyle w:val="Hyperlink"/>
@@ -2965,7 +2965,7 @@
             <w:noProof/>
             <w:webHidden/>
           </w:rPr>
-          <w:instrText xml:space="preserve"> PAGEREF _Toc241263059 \h </w:instrText>
+          <w:instrText xml:space="preserve"> PAGEREF _Toc241314463 \h </w:instrText>
         </w:r>
         <w:r>
           <w:rPr>
@@ -3006,7 +3006,7 @@
           <w:noProof/>
         </w:rPr>
       </w:pPr>
-      <w:hyperlink w:anchor="_Toc241263060" w:history="1">
+      <w:hyperlink w:anchor="_Toc241314464" w:history="1">
         <w:r>
           <w:rPr>
             <w:rStyle w:val="Hyperlink"/>
@@ -3033,7 +3033,7 @@
             <w:noProof/>
             <w:webHidden/>
           </w:rPr>
-          <w:instrText xml:space="preserve"> PAGEREF _Toc241263060 \h </w:instrText>
+          <w:instrText xml:space="preserve"> PAGEREF _Toc241314464 \h </w:instrText>
         </w:r>
         <w:r>
           <w:rPr>
@@ -3074,7 +3074,7 @@
           <w:noProof/>
         </w:rPr>
       </w:pPr>
-      <w:hyperlink w:anchor="_Toc241263061" w:history="1">
+      <w:hyperlink w:anchor="_Toc241314465" w:history="1">
         <w:r>
           <w:rPr>
             <w:rStyle w:val="Hyperlink"/>
@@ -3101,7 +3101,7 @@
             <w:noProof/>
             <w:webHidden/>
           </w:rPr>
-          <w:instrText xml:space="preserve"> PAGEREF _Toc241263061 \h </w:instrText>
+          <w:instrText xml:space="preserve"> PAGEREF _Toc241314465 \h </w:instrText>
         </w:r>
         <w:r>
           <w:rPr>
@@ -3142,7 +3142,7 @@
           <w:noProof/>
         </w:rPr>
       </w:pPr>
-      <w:hyperlink w:anchor="_Toc241263062" w:history="1">
+      <w:hyperlink w:anchor="_Toc241314466" w:history="1">
         <w:r>
           <w:rPr>
             <w:rStyle w:val="Hyperlink"/>
@@ -3169,7 +3169,7 @@
             <w:noProof/>
             <w:webHidden/>
           </w:rPr>
-          <w:instrText xml:space="preserve"> PAGEREF _Toc241263062 \h </w:instrText>
+          <w:instrText xml:space="preserve"> PAGEREF _Toc241314466 \h </w:instrText>
         </w:r>
         <w:r>
           <w:rPr>
@@ -3210,7 +3210,7 @@
           <w:noProof/>
         </w:rPr>
       </w:pPr>
-      <w:hyperlink w:anchor="_Toc241263063" w:history="1">
+      <w:hyperlink w:anchor="_Toc241314467" w:history="1">
         <w:r>
           <w:rPr>
             <w:rStyle w:val="Hyperlink"/>
@@ -3237,7 +3237,7 @@
             <w:noProof/>
             <w:webHidden/>
           </w:rPr>
-          <w:instrText xml:space="preserve"> PAGEREF _Toc241263063 \h </w:instrText>
+          <w:instrText xml:space="preserve"> PAGEREF _Toc241314467 \h </w:instrText>
         </w:r>
         <w:r>
           <w:rPr>
@@ -3278,7 +3278,7 @@
           <w:noProof/>
         </w:rPr>
       </w:pPr>
-      <w:hyperlink w:anchor="_Toc241263064" w:history="1">
+      <w:hyperlink w:anchor="_Toc241314468" w:history="1">
         <w:r>
           <w:rPr>
             <w:rStyle w:val="Hyperlink"/>
@@ -3305,7 +3305,7 @@
             <w:noProof/>
             <w:webHidden/>
           </w:rPr>
-          <w:instrText xml:space="preserve"> PAGEREF _Toc241263064 \h </w:instrText>
+          <w:instrText xml:space="preserve"> PAGEREF _Toc241314468 \h </w:instrText>
         </w:r>
         <w:r>
           <w:rPr>
@@ -3346,7 +3346,7 @@
           <w:noProof/>
         </w:rPr>
       </w:pPr>
-      <w:hyperlink w:anchor="_Toc241263065" w:history="1">
+      <w:hyperlink w:anchor="_Toc241314469" w:history="1">
         <w:r>
           <w:rPr>
             <w:rStyle w:val="Hyperlink"/>
@@ -3373,7 +3373,7 @@
             <w:noProof/>
             <w:webHidden/>
           </w:rPr>
-          <w:instrText xml:space="preserve"> PAGEREF _Toc241263065 \h </w:instrText>
+          <w:instrText xml:space="preserve"> PAGEREF _Toc241314469 \h </w:instrText>
         </w:r>
         <w:r>
           <w:rPr>
@@ -3414,7 +3414,7 @@
           <w:noProof/>
         </w:rPr>
       </w:pPr>
-      <w:hyperlink w:anchor="_Toc241263066" w:history="1">
+      <w:hyperlink w:anchor="_Toc241314470" w:history="1">
         <w:r>
           <w:rPr>
             <w:rStyle w:val="Hyperlink"/>
@@ -3441,7 +3441,75 @@
             <w:noProof/>
             <w:webHidden/>
           </w:rPr>
-          <w:instrText xml:space="preserve"> PAGEREF _Toc241263066 \h </w:instrText>
+          <w:instrText xml:space="preserve"> PAGEREF _Toc241314470 \h </w:instrText>
+        </w:r>
+        <w:r>
+          <w:rPr>
+            <w:noProof/>
+            <w:webHidden/>
+          </w:rPr>
+        </w:r>
+        <w:r>
+          <w:rPr>
+            <w:noProof/>
+            <w:webHidden/>
+          </w:rPr>
+          <w:fldChar w:fldCharType="separate"/>
+        </w:r>
+        <w:r>
+          <w:rPr>
+            <w:noProof/>
+            <w:webHidden/>
+          </w:rPr>
+          <w:t>14</w:t>
+        </w:r>
+        <w:r>
+          <w:rPr>
+            <w:noProof/>
+            <w:webHidden/>
+          </w:rPr>
+          <w:fldChar w:fldCharType="end"/>
+        </w:r>
+      </w:hyperlink>
+    </w:p>
+    <w:p>
+      <w:pPr>
+        <w:pStyle w:val="TOC2"/>
+        <w:tabs>
+          <w:tab w:val="right" w:leader="dot" w:pos="9350"/>
+        </w:tabs>
+        <w:rPr>
+          <w:noProof/>
+        </w:rPr>
+      </w:pPr>
+      <w:hyperlink w:anchor="_Toc241314471" w:history="1">
+        <w:r>
+          <w:rPr>
+            <w:rStyle w:val="Hyperlink"/>
+            <w:noProof/>
+          </w:rPr>
+          <w:t>14.3 Juan Guillermo Popayán Hernández</w:t>
+        </w:r>
+        <w:r>
+          <w:rPr>
+            <w:noProof/>
+            <w:webHidden/>
+          </w:rPr>
+          <w:tab/>
+        </w:r>
+        <w:r>
+          <w:rPr>
+            <w:noProof/>
+            <w:webHidden/>
+          </w:rPr>
+          <w:fldChar w:fldCharType="begin"/>
+        </w:r>
+        <w:r>
+          <w:rPr>
+            <w:noProof/>
+            <w:webHidden/>
+          </w:rPr>
+          <w:instrText xml:space="preserve"> PAGEREF _Toc241314471 \h </w:instrText>
         </w:r>
         <w:r>
           <w:rPr>
@@ -3482,7 +3550,7 @@
           <w:noProof/>
         </w:rPr>
       </w:pPr>
-      <w:hyperlink w:anchor="_Toc241263067" w:history="1">
+      <w:hyperlink w:anchor="_Toc241314472" w:history="1">
         <w:r>
           <w:rPr>
             <w:rStyle w:val="Hyperlink"/>
@@ -3509,7 +3577,7 @@
             <w:noProof/>
             <w:webHidden/>
           </w:rPr>
-          <w:instrText xml:space="preserve"> PAGEREF _Toc241263067 \h </w:instrText>
+          <w:instrText xml:space="preserve"> PAGEREF _Toc241314472 \h </w:instrText>
         </w:r>
         <w:r>
           <w:rPr>
@@ -3554,7 +3622,7 @@
       <w:pPr>
         <w:pStyle w:val="Heading1"/>
       </w:pPr>
-      <w:bookmarkStart w:id="0" w:name="_Toc241263020"/>
+      <w:bookmarkStart w:id="0" w:name="_Toc241314424"/>
       <w:r>
         <w:lastRenderedPageBreak/>
         <w:t>1. Información general del producto</w:t>
@@ -3804,7 +3872,7 @@
               <w:rPr>
                 <w:sz w:val="18"/>
               </w:rPr>
-              <w:t>Keidy Lucía Gómez Otero – Francisco Javier Burgos Flórez</w:t>
+              <w:t>Keidy Lucía Gómez Otero – Francisco Javier Burgos Flórez – Juan Guillermo Popayán Hernández</w:t>
             </w:r>
           </w:p>
         </w:tc>
@@ -4000,45 +4068,6 @@
                 <w:sz w:val="18"/>
               </w:rPr>
               <w:t>Español e inglés, con cambio en vivo</w:t>
-            </w:r>
-          </w:p>
-        </w:tc>
-      </w:tr>
-      <w:tr>
-        <w:trPr>
-          <w:jc w:val="center"/>
-        </w:trPr>
-        <w:tc>
-          <w:tcPr>
-            <w:tcW w:w="2835" w:type="dxa"/>
-          </w:tcPr>
-          <w:p>
-            <w:pPr>
-              <w:keepNext/>
-              <w:spacing w:after="20"/>
-            </w:pPr>
-            <w:r>
-              <w:rPr>
-                <w:sz w:val="18"/>
-              </w:rPr>
-              <w:t>Licencia</w:t>
-            </w:r>
-          </w:p>
-        </w:tc>
-        <w:tc>
-          <w:tcPr>
-            <w:tcW w:w="6236" w:type="dxa"/>
-          </w:tcPr>
-          <w:p>
-            <w:pPr>
-              <w:keepNext/>
-              <w:spacing w:after="20"/>
-            </w:pPr>
-            <w:r>
-              <w:rPr>
-                <w:sz w:val="18"/>
-              </w:rPr>
-              <w:t>GNU General Public License v3.0 (GPL-3.0)</w:t>
             </w:r>
           </w:p>
         </w:tc>
@@ -4101,7 +4130,7 @@
       <w:pPr>
         <w:pStyle w:val="Heading1"/>
       </w:pPr>
-      <w:bookmarkStart w:id="1" w:name="_Toc241263021"/>
+      <w:bookmarkStart w:id="1" w:name="_Toc241314425"/>
       <w:r>
         <w:t>2. Descripción general del software</w:t>
       </w:r>
@@ -4161,7 +4190,7 @@
       <w:pPr>
         <w:pStyle w:val="Heading2"/>
       </w:pPr>
-      <w:bookmarkStart w:id="2" w:name="_Toc241263022"/>
+      <w:bookmarkStart w:id="2" w:name="_Toc241314426"/>
       <w:r>
         <w:t>2.1. Especificación de requisitos de hardware y software</w:t>
       </w:r>
@@ -4171,7 +4200,7 @@
       <w:pPr>
         <w:pStyle w:val="Heading3"/>
       </w:pPr>
-      <w:bookmarkStart w:id="3" w:name="_Toc241263023"/>
+      <w:bookmarkStart w:id="3" w:name="_Toc241314427"/>
       <w:r>
         <w:t>Requisitos para el usuario final</w:t>
       </w:r>
@@ -4483,7 +4512,7 @@
       <w:pPr>
         <w:pStyle w:val="Heading3"/>
       </w:pPr>
-      <w:bookmarkStart w:id="4" w:name="_Toc241263024"/>
+      <w:bookmarkStart w:id="4" w:name="_Toc241314428"/>
       <w:r>
         <w:t>Entorno de software (modo desarrollo)</w:t>
       </w:r>
@@ -4834,7 +4863,7 @@
       <w:pPr>
         <w:pStyle w:val="Heading3"/>
       </w:pPr>
-      <w:bookmarkStart w:id="5" w:name="_Toc241263025"/>
+      <w:bookmarkStart w:id="5" w:name="_Toc241314429"/>
       <w:r>
         <w:t>Requisito de operación en red</w:t>
       </w:r>
@@ -4852,7 +4881,7 @@
       <w:pPr>
         <w:pStyle w:val="Heading2"/>
       </w:pPr>
-      <w:bookmarkStart w:id="6" w:name="_Toc241263026"/>
+      <w:bookmarkStart w:id="6" w:name="_Toc241314430"/>
       <w:r>
         <w:lastRenderedPageBreak/>
         <w:t>2.2. Justificación de los requisitos</w:t>
@@ -4867,7 +4896,7 @@
         <w:t>La distribución como carpeta de aplicación para Windows, generada con PyInstaller y comprimida en el archivo Meritum_CAT_1.0.0_Windows_x64.zip, responde al objetivo de que investigadores y docentes usen el software sin instalar Python ni bibliotecas: basta con descomprimir el archivo y abrir Meritum_CAT.exe. El programa guarda su registro, sus preferencias y su caché en la subcarpeta cache de su propia carpeta (o en Documentos\Meritum_CAT\cache si aquella no admite escritura) y no escribe en AppData. La cop</w:t>
       </w:r>
       <w:r>
-        <w:t>ia verificada abre su ventana principal en 8.6 s en el equipo de pruebas.</w:t>
+        <w:t>ia verificada abre su ventana principal en 7.3 s en el equipo de pruebas.</w:t>
       </w:r>
     </w:p>
     <w:p>
@@ -4890,7 +4919,7 @@
       <w:pPr>
         <w:pStyle w:val="Heading1"/>
       </w:pPr>
-      <w:bookmarkStart w:id="7" w:name="_Toc241263027"/>
+      <w:bookmarkStart w:id="7" w:name="_Toc241314431"/>
       <w:r>
         <w:t>3. Objetivos y área de aplicación</w:t>
       </w:r>
@@ -4900,7 +4929,7 @@
       <w:pPr>
         <w:pStyle w:val="Heading2"/>
       </w:pPr>
-      <w:bookmarkStart w:id="8" w:name="_Toc241263028"/>
+      <w:bookmarkStart w:id="8" w:name="_Toc241314432"/>
       <w:r>
         <w:t>3.1 Objetivo general</w:t>
       </w:r>
@@ -4918,7 +4947,7 @@
       <w:pPr>
         <w:pStyle w:val="Heading2"/>
       </w:pPr>
-      <w:bookmarkStart w:id="9" w:name="_Toc241263029"/>
+      <w:bookmarkStart w:id="9" w:name="_Toc241314433"/>
       <w:r>
         <w:t>3.2 Objetivos específicos</w:t>
       </w:r>
@@ -4991,7 +5020,7 @@
       <w:pPr>
         <w:pStyle w:val="Heading2"/>
       </w:pPr>
-      <w:bookmarkStart w:id="10" w:name="_Toc241263030"/>
+      <w:bookmarkStart w:id="10" w:name="_Toc241314434"/>
       <w:r>
         <w:t>3.3 Área de aplicación</w:t>
       </w:r>
@@ -5064,7 +5093,7 @@
       <w:pPr>
         <w:pStyle w:val="Heading1"/>
       </w:pPr>
-      <w:bookmarkStart w:id="11" w:name="_Toc241263031"/>
+      <w:bookmarkStart w:id="11" w:name="_Toc241314435"/>
       <w:r>
         <w:t>4. Funcionalidades principales</w:t>
       </w:r>
@@ -5293,7 +5322,7 @@
       <w:pPr>
         <w:pStyle w:val="Heading1"/>
       </w:pPr>
-      <w:bookmarkStart w:id="12" w:name="_Toc241263032"/>
+      <w:bookmarkStart w:id="12" w:name="_Toc241314436"/>
       <w:r>
         <w:t>5. Adaptabilidad, extensibilidad y mantenibilidad</w:t>
       </w:r>
@@ -5303,7 +5332,7 @@
       <w:pPr>
         <w:pStyle w:val="Heading3"/>
       </w:pPr>
-      <w:bookmarkStart w:id="13" w:name="_Toc241263033"/>
+      <w:bookmarkStart w:id="13" w:name="_Toc241314437"/>
       <w:r>
         <w:t>Modularidad</w:t>
       </w:r>
@@ -5321,7 +5350,7 @@
       <w:pPr>
         <w:pStyle w:val="Heading3"/>
       </w:pPr>
-      <w:bookmarkStart w:id="14" w:name="_Toc241263034"/>
+      <w:bookmarkStart w:id="14" w:name="_Toc241314438"/>
       <w:r>
         <w:t>Incorporación de nuevos algoritmos</w:t>
       </w:r>
@@ -5339,7 +5368,7 @@
       <w:pPr>
         <w:pStyle w:val="Heading3"/>
       </w:pPr>
-      <w:bookmarkStart w:id="15" w:name="_Toc241263035"/>
+      <w:bookmarkStart w:id="15" w:name="_Toc241314439"/>
       <w:r>
         <w:t>Incorporación de nuevas fuentes de datos</w:t>
       </w:r>
@@ -5357,7 +5386,7 @@
       <w:pPr>
         <w:pStyle w:val="Heading3"/>
       </w:pPr>
-      <w:bookmarkStart w:id="16" w:name="_Toc241263036"/>
+      <w:bookmarkStart w:id="16" w:name="_Toc241314440"/>
       <w:r>
         <w:t>Reutilización de componentes</w:t>
       </w:r>
@@ -5375,7 +5404,7 @@
       <w:pPr>
         <w:pStyle w:val="Heading3"/>
       </w:pPr>
-      <w:bookmarkStart w:id="17" w:name="_Toc241263037"/>
+      <w:bookmarkStart w:id="17" w:name="_Toc241314441"/>
       <w:r>
         <w:t>Configuración y parametrización</w:t>
       </w:r>
@@ -5393,7 +5422,7 @@
       <w:pPr>
         <w:pStyle w:val="Heading3"/>
       </w:pPr>
-      <w:bookmarkStart w:id="18" w:name="_Toc241263038"/>
+      <w:bookmarkStart w:id="18" w:name="_Toc241314442"/>
       <w:r>
         <w:t>Facilidad de mantenimiento</w:t>
       </w:r>
@@ -5404,14 +5433,14 @@
         <w:jc w:val="both"/>
       </w:pPr>
       <w:r>
-        <w:t>El código usa anotaciones de tipo y documentación en cada módulo, centraliza la versión en un único punto (__version__ = "1.0.0") y cuenta con 168 pruebas automatizadas y una autoprueba de la interfaz que se ejecuta sobre el propio ejecutable.</w:t>
+        <w:t>El código usa anotaciones de tipo y documentación en cada módulo, centraliza la versión en un único punto (__version__ = "1.0.0") y cuenta con 170 pruebas automatizadas y una autoprueba de la interfaz que se ejecuta sobre el propio ejecutable.</w:t>
       </w:r>
     </w:p>
     <w:p>
       <w:pPr>
         <w:pStyle w:val="Heading3"/>
       </w:pPr>
-      <w:bookmarkStart w:id="19" w:name="_Toc241263039"/>
+      <w:bookmarkStart w:id="19" w:name="_Toc241314443"/>
       <w:r>
         <w:t>Extensiones ya realizadas</w:t>
       </w:r>
@@ -5429,7 +5458,7 @@
       <w:pPr>
         <w:pStyle w:val="Heading1"/>
       </w:pPr>
-      <w:bookmarkStart w:id="20" w:name="_Toc241263040"/>
+      <w:bookmarkStart w:id="20" w:name="_Toc241314444"/>
       <w:r>
         <w:lastRenderedPageBreak/>
         <w:t>6. Robustez, desempeño y consistencia</w:t>
@@ -5440,7 +5469,7 @@
       <w:pPr>
         <w:pStyle w:val="Heading2"/>
       </w:pPr>
-      <w:bookmarkStart w:id="21" w:name="_Toc241263041"/>
+      <w:bookmarkStart w:id="21" w:name="_Toc241314445"/>
       <w:r>
         <w:t>6.1 Robustez</w:t>
       </w:r>
@@ -5461,7 +5490,7 @@
       <w:pPr>
         <w:pStyle w:val="Heading2"/>
       </w:pPr>
-      <w:bookmarkStart w:id="22" w:name="_Toc241263042"/>
+      <w:bookmarkStart w:id="22" w:name="_Toc241314446"/>
       <w:r>
         <w:t>6.2 Desempeño</w:t>
       </w:r>
@@ -6907,7 +6936,7 @@
       <w:pPr>
         <w:pStyle w:val="Heading2"/>
       </w:pPr>
-      <w:bookmarkStart w:id="23" w:name="_Toc241263043"/>
+      <w:bookmarkStart w:id="23" w:name="_Toc241314447"/>
       <w:r>
         <w:t>6.3 Consistencia y reproducibilidad</w:t>
       </w:r>
@@ -6918,14 +6947,14 @@
         <w:jc w:val="both"/>
       </w:pPr>
       <w:r>
-        <w:t>Toda la aleatoriedad proviene de un único generador inicializado con la semilla. La misma configuración con la misma semilla y el mismo banco produce resultados idénticos bit a bit, lo que se verifica en las pruebas automatizadas, en el experimento 10 y en la interfaz. En la corrida documentada con 5000 examinados, al guardar, restablecer, cargar la configuración y volver a ejecutar, la reproducción fue idéntica (RMSE = 0.2744).</w:t>
+        <w:t>Toda la aleatoriedad proviene de un único generador inicializado con la semilla. La misma configuración con la misma semilla, el mismo banco y el mismo entorno numérico produce resultados idénticos, lo que se verifica en las pruebas automatizadas, en el experimento 10 y en la interfaz. En la corrida documentada con 5000 examinados, al guardar, restablecer, cargar la configuración y volver a ejecutar, la reproducción fue idéntica (RMSE = 0.2744).</w:t>
       </w:r>
     </w:p>
     <w:p>
       <w:pPr>
         <w:pStyle w:val="Heading1"/>
       </w:pPr>
-      <w:bookmarkStart w:id="24" w:name="_Toc241263044"/>
+      <w:bookmarkStart w:id="24" w:name="_Toc241314448"/>
       <w:r>
         <w:t>7. Interfaz y usabilidad</w:t>
       </w:r>
@@ -6953,7 +6982,7 @@
           <w:noProof/>
         </w:rPr>
         <w:drawing>
-          <wp:inline distT="0" distB="0" distL="0" distR="0" wp14:anchorId="1A5D01F9" wp14:editId="7D217E4D">
+          <wp:inline distT="0" distB="0" distL="0" distR="0" wp14:anchorId="37D3709F" wp14:editId="45946060">
             <wp:extent cx="5760000" cy="3420000"/>
             <wp:effectExtent l="0" t="0" r="0" b="0"/>
             <wp:docPr id="1" name="Picture 1"/>
@@ -7007,7 +7036,7 @@
       <w:pPr>
         <w:pStyle w:val="Heading1"/>
       </w:pPr>
-      <w:bookmarkStart w:id="25" w:name="_Toc241263045"/>
+      <w:bookmarkStart w:id="25" w:name="_Toc241314449"/>
       <w:r>
         <w:t>8. Integridad y seguridad de la información</w:t>
       </w:r>
@@ -7028,7 +7057,7 @@
       <w:pPr>
         <w:pStyle w:val="Heading1"/>
       </w:pPr>
-      <w:bookmarkStart w:id="26" w:name="_Toc241263046"/>
+      <w:bookmarkStart w:id="26" w:name="_Toc241314450"/>
       <w:r>
         <w:t>9. Portabilidad y compatibilidad</w:t>
       </w:r>
@@ -7038,7 +7067,7 @@
       <w:pPr>
         <w:pStyle w:val="Heading2"/>
       </w:pPr>
-      <w:bookmarkStart w:id="27" w:name="_Toc241263047"/>
+      <w:bookmarkStart w:id="27" w:name="_Toc241314451"/>
       <w:r>
         <w:t>9.1 Plataformas compatibles</w:t>
       </w:r>
@@ -7056,7 +7085,7 @@
       <w:pPr>
         <w:pStyle w:val="Heading2"/>
       </w:pPr>
-      <w:bookmarkStart w:id="28" w:name="_Toc241263048"/>
+      <w:bookmarkStart w:id="28" w:name="_Toc241314452"/>
       <w:r>
         <w:lastRenderedPageBreak/>
         <w:t>9.2 Dependencias relevantes</w:t>
@@ -7130,7 +7159,7 @@
                 <w:b/>
                 <w:sz w:val="18"/>
               </w:rPr>
-              <w:t>Licencia</w:t>
+              <w:t>Licencia del componente</w:t>
             </w:r>
           </w:p>
         </w:tc>
@@ -7378,7 +7407,7 @@
       <w:pPr>
         <w:pStyle w:val="Heading2"/>
       </w:pPr>
-      <w:bookmarkStart w:id="29" w:name="_Toc241263049"/>
+      <w:bookmarkStart w:id="29" w:name="_Toc241314453"/>
       <w:r>
         <w:t>9.3 Portabilidad</w:t>
       </w:r>
@@ -7392,9 +7421,9 @@
         <w:tblLook w:val="04A0" w:firstRow="1" w:lastRow="0" w:firstColumn="1" w:lastColumn="0" w:noHBand="0" w:noVBand="1"/>
       </w:tblPr>
       <w:tblGrid>
-        <w:gridCol w:w="2837"/>
-        <w:gridCol w:w="5828"/>
-        <w:gridCol w:w="911"/>
+        <w:gridCol w:w="2802"/>
+        <w:gridCol w:w="5869"/>
+        <w:gridCol w:w="905"/>
       </w:tblGrid>
       <w:tr>
         <w:trPr>
@@ -7490,7 +7519,7 @@
               <w:rPr>
                 <w:sz w:val="18"/>
               </w:rPr>
-              <w:t>101.6 MB; 567 archivos; Meritum_CAT/Meritum_CAT.exe</w:t>
+              <w:t>101.6 MB; 566 archivos; Meritum_CAT/Meritum_CAT.exe</w:t>
             </w:r>
           </w:p>
         </w:tc>
@@ -7658,7 +7687,7 @@
               <w:rPr>
                 <w:sz w:val="18"/>
               </w:rPr>
-              <w:t>0a92bbcf2d093690a7745af652eb093f508e4b2f61ab3603bfece08d2526c870</w:t>
+              <w:t>dc2ce004fe0c0758d94a05d689f8975ce11c12721ea6095d38d4f8189819e593</w:t>
             </w:r>
           </w:p>
         </w:tc>
@@ -7770,7 +7799,7 @@
               <w:rPr>
                 <w:sz w:val="18"/>
               </w:rPr>
-              <w:t>ventana en 4.9 s; cierre limpio; procesos restantes: 0</w:t>
+              <w:t>ventana en 4.7 s; cierre limpio; procesos restantes: 0</w:t>
             </w:r>
           </w:p>
         </w:tc>
@@ -7826,7 +7855,7 @@
               <w:rPr>
                 <w:sz w:val="18"/>
               </w:rPr>
-              <w:t>ventana en 8.6 s; cierre limpio; procesos restantes: 0</w:t>
+              <w:t>ventana en 7.3 s; cierre limpio; procesos restantes: 0</w:t>
             </w:r>
           </w:p>
         </w:tc>
@@ -8084,14 +8113,14 @@
           <w:color w:val="52514E"/>
           <w:sz w:val="19"/>
         </w:rPr>
-        <w:t>Tabla 6. Pruebas de portabilidad de la aplicación empaquetada (2026-09-25 20:59:08, Microsoft Windows 10 Pro).</w:t>
+        <w:t>Tabla 6. Pruebas de portabilidad de la aplicación empaquetada (2026-09-26 11:22:19, Microsoft Windows 10 Pro).</w:t>
       </w:r>
     </w:p>
     <w:p>
       <w:pPr>
         <w:pStyle w:val="Heading1"/>
       </w:pPr>
-      <w:bookmarkStart w:id="30" w:name="_Toc241263050"/>
+      <w:bookmarkStart w:id="30" w:name="_Toc241314454"/>
       <w:r>
         <w:t>10. Documentación y soporte técnico</w:t>
       </w:r>
@@ -8109,7 +8138,7 @@
       <w:pPr>
         <w:pStyle w:val="Heading3"/>
       </w:pPr>
-      <w:bookmarkStart w:id="31" w:name="_Toc241263051"/>
+      <w:bookmarkStart w:id="31" w:name="_Toc241314455"/>
       <w:r>
         <w:lastRenderedPageBreak/>
         <w:t>Soporte técnico</w:t>
@@ -8128,7 +8157,7 @@
       <w:pPr>
         <w:pStyle w:val="Heading1"/>
       </w:pPr>
-      <w:bookmarkStart w:id="32" w:name="_Toc241263052"/>
+      <w:bookmarkStart w:id="32" w:name="_Toc241314456"/>
       <w:r>
         <w:t>11. Pruebas, validación y desempeño</w:t>
       </w:r>
@@ -8139,7 +8168,7 @@
         <w:jc w:val="both"/>
       </w:pPr>
       <w:r>
-        <w:t>La validación se realizó en cuatro niveles. Primero, 168 pruebas automatizadas (0 fallos) verifican el núcleo, la entrada y salida, los experimentos, el catálogo bilingüe, las figuras y la interfaz. Segundo, una validación numérica compara las implementaciones con soluciones analíticas e implementaciones independientes. Tercero, los diez experimentos se contrastan con el comportamiento esperado según la literatura. Cuarto, una autoprueba de extremo a extremo de la interfaz real se ejecutó sobre el ejecutabl</w:t>
+        <w:t>La validación se realizó en cuatro niveles. Primero, 170 pruebas automatizadas (0 fallos) verifican el núcleo, la entrada y salida, los experimentos, el catálogo bilingüe, las figuras y la interfaz. Segundo, una validación numérica compara las implementaciones con soluciones analíticas e implementaciones independientes. Tercero, los diez experimentos se contrastan con el comportamiento esperado según la literatura. Cuarto, una autoprueba de extremo a extremo de la interfaz real se ejecutó sobre el ejecutabl</w:t>
       </w:r>
       <w:r>
         <w:t>e: 72 de 72 verificaciones aprobadas.</w:t>
@@ -10148,7 +10177,7 @@
       <w:pPr>
         <w:pStyle w:val="Heading1"/>
       </w:pPr>
-      <w:bookmarkStart w:id="33" w:name="_Toc241263053"/>
+      <w:bookmarkStart w:id="33" w:name="_Toc241314457"/>
       <w:r>
         <w:lastRenderedPageBreak/>
         <w:t>12. Impacto y utilización</w:t>
@@ -10159,7 +10188,7 @@
       <w:pPr>
         <w:pStyle w:val="Heading2"/>
       </w:pPr>
-      <w:bookmarkStart w:id="34" w:name="_Toc241263054"/>
+      <w:bookmarkStart w:id="34" w:name="_Toc241314458"/>
       <w:r>
         <w:t>12.1 Impacto en docencia</w:t>
       </w:r>
@@ -10177,7 +10206,7 @@
       <w:pPr>
         <w:pStyle w:val="Heading2"/>
       </w:pPr>
-      <w:bookmarkStart w:id="35" w:name="_Toc241263055"/>
+      <w:bookmarkStart w:id="35" w:name="_Toc241314459"/>
       <w:r>
         <w:t>12.2 Impacto en investigación</w:t>
       </w:r>
@@ -10195,7 +10224,7 @@
       <w:pPr>
         <w:pStyle w:val="Heading2"/>
       </w:pPr>
-      <w:bookmarkStart w:id="36" w:name="_Toc241263056"/>
+      <w:bookmarkStart w:id="36" w:name="_Toc241314460"/>
       <w:r>
         <w:t>12.3 Impacto en extensión</w:t>
       </w:r>
@@ -10213,7 +10242,7 @@
       <w:pPr>
         <w:pStyle w:val="Heading2"/>
       </w:pPr>
-      <w:bookmarkStart w:id="37" w:name="_Toc241263057"/>
+      <w:bookmarkStart w:id="37" w:name="_Toc241314461"/>
       <w:r>
         <w:t>12.4 Usuarios y utilización</w:t>
       </w:r>
@@ -10224,14 +10253,14 @@
         <w:jc w:val="both"/>
       </w:pPr>
       <w:r>
-        <w:t>Usuarios previstos: investigadores, docentes, estudiantes de pregrado y posgrado y equipos técnicos de evaluación. La versión 1.0.0 se publica como código abierto y como aplicación para Windows lista para usar.</w:t>
+        <w:t>Usuarios previstos: investigadores, docentes, estudiantes de pregrado y posgrado y equipos técnicos de evaluación. La versión 1.0.0 se publica como código fuente y como aplicación para Windows lista para usar.</w:t>
       </w:r>
     </w:p>
     <w:p>
       <w:pPr>
         <w:pStyle w:val="Heading2"/>
       </w:pPr>
-      <w:bookmarkStart w:id="38" w:name="_Toc241263058"/>
+      <w:bookmarkStart w:id="38" w:name="_Toc241314462"/>
       <w:r>
         <w:t>12.5 Evidencias de impacto</w:t>
       </w:r>
@@ -10249,7 +10278,7 @@
       <w:pPr>
         <w:pStyle w:val="Heading1"/>
       </w:pPr>
-      <w:bookmarkStart w:id="39" w:name="_Toc241263059"/>
+      <w:bookmarkStart w:id="39" w:name="_Toc241314463"/>
       <w:r>
         <w:t>13. Contribución al estado del arte</w:t>
       </w:r>
@@ -10259,7 +10288,7 @@
       <w:pPr>
         <w:pStyle w:val="Heading2"/>
       </w:pPr>
-      <w:bookmarkStart w:id="40" w:name="_Toc241263060"/>
+      <w:bookmarkStart w:id="40" w:name="_Toc241314464"/>
       <w:r>
         <w:t>13.1 Problema abordado</w:t>
       </w:r>
@@ -10277,7 +10306,7 @@
       <w:pPr>
         <w:pStyle w:val="Heading2"/>
       </w:pPr>
-      <w:bookmarkStart w:id="41" w:name="_Toc241263061"/>
+      <w:bookmarkStart w:id="41" w:name="_Toc241314465"/>
       <w:r>
         <w:lastRenderedPageBreak/>
         <w:t>13.2 Estado del arte</w:t>
@@ -10296,7 +10325,7 @@
       <w:pPr>
         <w:pStyle w:val="Heading2"/>
       </w:pPr>
-      <w:bookmarkStart w:id="42" w:name="_Toc241263062"/>
+      <w:bookmarkStart w:id="42" w:name="_Toc241314466"/>
       <w:r>
         <w:t>13.3 Limitaciones actuales del estado del arte</w:t>
       </w:r>
@@ -10314,7 +10343,7 @@
       <w:pPr>
         <w:pStyle w:val="Heading2"/>
       </w:pPr>
-      <w:bookmarkStart w:id="43" w:name="_Toc241263063"/>
+      <w:bookmarkStart w:id="43" w:name="_Toc241314467"/>
       <w:r>
         <w:t>13.4 Impacto de Meritum_CAT sobre el estado del arte</w:t>
       </w:r>
@@ -10335,7 +10364,7 @@
       <w:pPr>
         <w:pStyle w:val="Heading1"/>
       </w:pPr>
-      <w:bookmarkStart w:id="44" w:name="_Toc241263064"/>
+      <w:bookmarkStart w:id="44" w:name="_Toc241314468"/>
       <w:r>
         <w:t>14. Aportes de los autores</w:t>
       </w:r>
@@ -10345,7 +10374,7 @@
       <w:pPr>
         <w:pStyle w:val="Heading2"/>
       </w:pPr>
-      <w:bookmarkStart w:id="45" w:name="_Toc241263065"/>
+      <w:bookmarkStart w:id="45" w:name="_Toc241314469"/>
       <w:r>
         <w:t>14.1 Keidy Lucía Gómez Otero</w:t>
       </w:r>
@@ -10363,7 +10392,7 @@
       <w:pPr>
         <w:pStyle w:val="Heading2"/>
       </w:pPr>
-      <w:bookmarkStart w:id="46" w:name="_Toc241263066"/>
+      <w:bookmarkStart w:id="46" w:name="_Toc241314470"/>
       <w:r>
         <w:t>14.2 Francisco Javier Burgos Flórez</w:t>
       </w:r>
@@ -10379,13 +10408,35 @@
     </w:p>
     <w:p>
       <w:pPr>
+        <w:pStyle w:val="Heading2"/>
+      </w:pPr>
+      <w:bookmarkStart w:id="47" w:name="_Toc241314471"/>
+      <w:r>
+        <w:t>14.3 Juan Guillermo Popayán Hernández</w:t>
+      </w:r>
+      <w:bookmarkEnd w:id="47"/>
+    </w:p>
+    <w:p>
+      <w:pPr>
+        <w:jc w:val="both"/>
+      </w:pPr>
+      <w:r>
+        <w:rPr>
+          <w:i/>
+          <w:highlight w:val="yellow"/>
+        </w:rPr>
+        <w:t>[COMPLETAR: aportes de Juan Guillermo Popayán Hernández al software]</w:t>
+      </w:r>
+    </w:p>
+    <w:p>
+      <w:pPr>
         <w:pStyle w:val="Heading1"/>
       </w:pPr>
-      <w:bookmarkStart w:id="47" w:name="_Toc241263067"/>
+      <w:bookmarkStart w:id="48" w:name="_Toc241314472"/>
       <w:r>
         <w:t>Referencias</w:t>
       </w:r>
-      <w:bookmarkEnd w:id="47"/>
+      <w:bookmarkEnd w:id="48"/>
     </w:p>
     <w:p>
       <w:pPr>
@@ -10403,6 +10454,11 @@
           <w:sz w:val="20"/>
         </w:rPr>
         <w:tab/>
+      </w:r>
+      <w:r>
+        <w:rPr>
+          <w:sz w:val="20"/>
+        </w:rPr>
         <w:t>G. Rasch, Probabilistic Models for Some Intelligence and Attainment Tests. Copenhague, Dinamarca: Danish Institute for Educational Research, 1960.</w:t>
       </w:r>
     </w:p>
@@ -10415,7 +10471,27 @@
         <w:rPr>
           <w:sz w:val="20"/>
         </w:rPr>
+        <w:lastRenderedPageBreak/>
         <w:t>[2]</w:t>
+      </w:r>
+      <w:r>
+        <w:rPr>
+          <w:sz w:val="20"/>
+        </w:rPr>
+        <w:tab/>
+        <w:t>A. Birnbaum, “Some latent trait models and their use in inferring an examinee's ability,” en F. M. Lord y M. R. Novick, Statistical Theories of Mental Test Scores. Reading, MA, EE. UU.: Addison-Wesley, 1968, pp. 397–479.</w:t>
+      </w:r>
+    </w:p>
+    <w:p>
+      <w:pPr>
+        <w:spacing w:after="80"/>
+        <w:ind w:left="510" w:hanging="510"/>
+      </w:pPr>
+      <w:r>
+        <w:rPr>
+          <w:sz w:val="20"/>
+        </w:rPr>
+        <w:t>[3]</w:t>
       </w:r>
       <w:r>
         <w:rPr>
@@ -10427,26 +10503,6 @@
         <w:rPr>
           <w:sz w:val="20"/>
         </w:rPr>
-        <w:t>A. Birnbaum, “Some latent trait models and their use in inferring an examinee's ability,” en F. M. Lord y M. R. Novick, Statistical Theories of Mental Test Scores. Reading, MA, EE. UU.: Addison-Wesley, 1968, pp. 397–479.</w:t>
-      </w:r>
-    </w:p>
-    <w:p>
-      <w:pPr>
-        <w:spacing w:after="80"/>
-        <w:ind w:left="510" w:hanging="510"/>
-      </w:pPr>
-      <w:r>
-        <w:rPr>
-          <w:sz w:val="20"/>
-        </w:rPr>
-        <w:lastRenderedPageBreak/>
-        <w:t>[3]</w:t>
-      </w:r>
-      <w:r>
-        <w:rPr>
-          <w:sz w:val="20"/>
-        </w:rPr>
-        <w:tab/>
         <w:t>F. M. Lord, Applications of Item Response Theory to Practical Testing Problems. Hillsdale, NJ, EE. UU.: Lawrence Erlbaum Associates, 1980.</w:t>
       </w:r>
     </w:p>
@@ -10485,11 +10541,6 @@
           <w:sz w:val="20"/>
         </w:rPr>
         <w:tab/>
-      </w:r>
-      <w:r>
-        <w:rPr>
-          <w:sz w:val="20"/>
-        </w:rPr>
         <w:t>S. E. Embretson y S. P. Reise, Item Response Theory for Psychologists. Mahwah, NJ, EE. UU.: Lawrence Erlbaum Associates, 2000.</w:t>
       </w:r>
     </w:p>
@@ -10509,6 +10560,11 @@
           <w:sz w:val="20"/>
         </w:rPr>
         <w:tab/>
+      </w:r>
+      <w:r>
+        <w:rPr>
+          <w:sz w:val="20"/>
+        </w:rPr>
         <w:t>F. B. Baker y S.-H. Kim, Item Response Theory: Parameter Estimation Techniques, 2.ª ed. Nueva York, NY, EE. UU.: Marcel Dekker, 2004, doi: 10.1201/9781482276725.</w:t>
       </w:r>
     </w:p>
@@ -10817,6 +10873,7 @@
         <w:rPr>
           <w:sz w:val="20"/>
         </w:rPr>
+        <w:lastRenderedPageBreak/>
         <w:t>[21]</w:t>
       </w:r>
       <w:r>
@@ -10824,7 +10881,7 @@
           <w:sz w:val="20"/>
         </w:rPr>
         <w:tab/>
-        <w:t>K. L. Gómez Otero y F. J. Burgos Flórez, Meritum_CAT — Manual de Usuario del Programa, versión 1.0.0, 2026.</w:t>
+        <w:t>K. L. Gómez Otero, F. J. Burgos Flórez y J. G. Popayán Hernández, Meritum_CAT — Manual de Usuario del Programa, versión 1.0.0, 2026.</w:t>
       </w:r>
     </w:p>
     <w:p>
@@ -10836,7 +10893,6 @@
         <w:rPr>
           <w:sz w:val="20"/>
         </w:rPr>
-        <w:lastRenderedPageBreak/>
         <w:t>[22]</w:t>
       </w:r>
       <w:r>
@@ -10844,7 +10900,7 @@
           <w:sz w:val="20"/>
         </w:rPr>
         <w:tab/>
-        <w:t>K. L. Gómez Otero y F. J. Burgos Flórez, Meritum_CAT — Manual Técnico del Programa, versión 1.0.0, 2026.</w:t>
+        <w:t>K. L. Gómez Otero, F. J. Burgos Flórez y J. G. Popayán Hernández, Meritum_CAT — Manual Técnico del Programa, versión 1.0.0, 2026.</w:t>
       </w:r>
     </w:p>
     <w:p>
@@ -10863,6 +10919,11 @@
           <w:sz w:val="20"/>
         </w:rPr>
         <w:tab/>
+      </w:r>
+      <w:r>
+        <w:rPr>
+          <w:sz w:val="20"/>
+        </w:rPr>
         <w:t>Repositorio de código fuente del proyecto Meritum_CAT. [En línea]. Disponible: https://github.com/primbiolab/Meritum_CAT</w:t>
       </w:r>
     </w:p>
@@ -11161,31 +11222,31 @@
       </w:rPr>
     </w:lvl>
   </w:abstractNum>
-  <w:num w:numId="1" w16cid:durableId="1369648339">
+  <w:num w:numId="1" w16cid:durableId="2018770963">
     <w:abstractNumId w:val="8"/>
   </w:num>
-  <w:num w:numId="2" w16cid:durableId="1864785152">
+  <w:num w:numId="2" w16cid:durableId="1463619253">
     <w:abstractNumId w:val="6"/>
   </w:num>
-  <w:num w:numId="3" w16cid:durableId="1517503209">
+  <w:num w:numId="3" w16cid:durableId="1829055231">
     <w:abstractNumId w:val="5"/>
   </w:num>
-  <w:num w:numId="4" w16cid:durableId="750126520">
+  <w:num w:numId="4" w16cid:durableId="151259196">
     <w:abstractNumId w:val="4"/>
   </w:num>
-  <w:num w:numId="5" w16cid:durableId="908657305">
+  <w:num w:numId="5" w16cid:durableId="306975640">
     <w:abstractNumId w:val="7"/>
   </w:num>
-  <w:num w:numId="6" w16cid:durableId="323361023">
+  <w:num w:numId="6" w16cid:durableId="1279949321">
     <w:abstractNumId w:val="3"/>
   </w:num>
-  <w:num w:numId="7" w16cid:durableId="1324973266">
+  <w:num w:numId="7" w16cid:durableId="457264259">
     <w:abstractNumId w:val="2"/>
   </w:num>
-  <w:num w:numId="8" w16cid:durableId="857624845">
+  <w:num w:numId="8" w16cid:durableId="279920281">
     <w:abstractNumId w:val="1"/>
   </w:num>
-  <w:num w:numId="9" w16cid:durableId="628517508">
+  <w:num w:numId="9" w16cid:durableId="187843034">
     <w:abstractNumId w:val="0"/>
   </w:num>
 </w:numbering>
@@ -22573,7 +22634,7 @@
     <w:autoRedefine/>
     <w:uiPriority w:val="39"/>
     <w:unhideWhenUsed/>
-    <w:rsid w:val="00F13991"/>
+    <w:rsid w:val="009C78B1"/>
     <w:pPr>
       <w:spacing w:after="100"/>
     </w:pPr>
@@ -22585,7 +22646,7 @@
     <w:autoRedefine/>
     <w:uiPriority w:val="39"/>
     <w:unhideWhenUsed/>
-    <w:rsid w:val="00F13991"/>
+    <w:rsid w:val="009C78B1"/>
     <w:pPr>
       <w:spacing w:after="100"/>
       <w:ind w:left="220"/>
@@ -22598,7 +22659,7 @@
     <w:autoRedefine/>
     <w:uiPriority w:val="39"/>
     <w:unhideWhenUsed/>
-    <w:rsid w:val="00F13991"/>
+    <w:rsid w:val="009C78B1"/>
     <w:pPr>
       <w:spacing w:after="100"/>
       <w:ind w:left="440"/>
@@ -22609,7 +22670,7 @@
     <w:basedOn w:val="DefaultParagraphFont"/>
     <w:uiPriority w:val="99"/>
     <w:unhideWhenUsed/>
-    <w:rsid w:val="00F13991"/>
+    <w:rsid w:val="009C78B1"/>
     <w:rPr>
       <w:color w:val="0000FF" w:themeColor="hyperlink"/>
       <w:u w:val="single"/>

</xml_diff>

<commit_message>
Completa los aportes de Juan Guillermo Popayán Hernández en la descripción del software
</commit_message>
<xml_diff>
--- a/manuales/Descripcion_del_Software_Meritum_CAT.docx
+++ b/manuales/Descripcion_del_Software_Meritum_CAT.docx
@@ -286,7 +286,7 @@
       <w:r>
         <w:fldChar w:fldCharType="separate"/>
       </w:r>
-      <w:hyperlink w:anchor="_Toc241314424" w:history="1">
+      <w:hyperlink w:anchor="_Toc241316770" w:history="1">
         <w:r>
           <w:rPr>
             <w:rStyle w:val="Hyperlink"/>
@@ -313,7 +313,7 @@
             <w:noProof/>
             <w:webHidden/>
           </w:rPr>
-          <w:instrText xml:space="preserve"> PAGEREF _Toc241314424 \h </w:instrText>
+          <w:instrText xml:space="preserve"> PAGEREF _Toc241316770 \h </w:instrText>
         </w:r>
         <w:r>
           <w:rPr>
@@ -354,7 +354,7 @@
           <w:noProof/>
         </w:rPr>
       </w:pPr>
-      <w:hyperlink w:anchor="_Toc241314425" w:history="1">
+      <w:hyperlink w:anchor="_Toc241316771" w:history="1">
         <w:r>
           <w:rPr>
             <w:rStyle w:val="Hyperlink"/>
@@ -381,7 +381,7 @@
             <w:noProof/>
             <w:webHidden/>
           </w:rPr>
-          <w:instrText xml:space="preserve"> PAGEREF _Toc241314425 \h </w:instrText>
+          <w:instrText xml:space="preserve"> PAGEREF _Toc241316771 \h </w:instrText>
         </w:r>
         <w:r>
           <w:rPr>
@@ -422,7 +422,7 @@
           <w:noProof/>
         </w:rPr>
       </w:pPr>
-      <w:hyperlink w:anchor="_Toc241314426" w:history="1">
+      <w:hyperlink w:anchor="_Toc241316772" w:history="1">
         <w:r>
           <w:rPr>
             <w:rStyle w:val="Hyperlink"/>
@@ -449,7 +449,7 @@
             <w:noProof/>
             <w:webHidden/>
           </w:rPr>
-          <w:instrText xml:space="preserve"> PAGEREF _Toc241314426 \h </w:instrText>
+          <w:instrText xml:space="preserve"> PAGEREF _Toc241316772 \h </w:instrText>
         </w:r>
         <w:r>
           <w:rPr>
@@ -490,7 +490,7 @@
           <w:noProof/>
         </w:rPr>
       </w:pPr>
-      <w:hyperlink w:anchor="_Toc241314427" w:history="1">
+      <w:hyperlink w:anchor="_Toc241316773" w:history="1">
         <w:r>
           <w:rPr>
             <w:rStyle w:val="Hyperlink"/>
@@ -517,7 +517,7 @@
             <w:noProof/>
             <w:webHidden/>
           </w:rPr>
-          <w:instrText xml:space="preserve"> PAGEREF _Toc241314427 \h </w:instrText>
+          <w:instrText xml:space="preserve"> PAGEREF _Toc241316773 \h </w:instrText>
         </w:r>
         <w:r>
           <w:rPr>
@@ -558,7 +558,7 @@
           <w:noProof/>
         </w:rPr>
       </w:pPr>
-      <w:hyperlink w:anchor="_Toc241314428" w:history="1">
+      <w:hyperlink w:anchor="_Toc241316774" w:history="1">
         <w:r>
           <w:rPr>
             <w:rStyle w:val="Hyperlink"/>
@@ -585,7 +585,7 @@
             <w:noProof/>
             <w:webHidden/>
           </w:rPr>
-          <w:instrText xml:space="preserve"> PAGEREF _Toc241314428 \h </w:instrText>
+          <w:instrText xml:space="preserve"> PAGEREF _Toc241316774 \h </w:instrText>
         </w:r>
         <w:r>
           <w:rPr>
@@ -626,7 +626,7 @@
           <w:noProof/>
         </w:rPr>
       </w:pPr>
-      <w:hyperlink w:anchor="_Toc241314429" w:history="1">
+      <w:hyperlink w:anchor="_Toc241316775" w:history="1">
         <w:r>
           <w:rPr>
             <w:rStyle w:val="Hyperlink"/>
@@ -653,7 +653,7 @@
             <w:noProof/>
             <w:webHidden/>
           </w:rPr>
-          <w:instrText xml:space="preserve"> PAGEREF _Toc241314429 \h </w:instrText>
+          <w:instrText xml:space="preserve"> PAGEREF _Toc241316775 \h </w:instrText>
         </w:r>
         <w:r>
           <w:rPr>
@@ -694,7 +694,7 @@
           <w:noProof/>
         </w:rPr>
       </w:pPr>
-      <w:hyperlink w:anchor="_Toc241314430" w:history="1">
+      <w:hyperlink w:anchor="_Toc241316776" w:history="1">
         <w:r>
           <w:rPr>
             <w:rStyle w:val="Hyperlink"/>
@@ -721,7 +721,7 @@
             <w:noProof/>
             <w:webHidden/>
           </w:rPr>
-          <w:instrText xml:space="preserve"> PAGEREF _Toc241314430 \h </w:instrText>
+          <w:instrText xml:space="preserve"> PAGEREF _Toc241316776 \h </w:instrText>
         </w:r>
         <w:r>
           <w:rPr>
@@ -762,7 +762,7 @@
           <w:noProof/>
         </w:rPr>
       </w:pPr>
-      <w:hyperlink w:anchor="_Toc241314431" w:history="1">
+      <w:hyperlink w:anchor="_Toc241316777" w:history="1">
         <w:r>
           <w:rPr>
             <w:rStyle w:val="Hyperlink"/>
@@ -789,7 +789,7 @@
             <w:noProof/>
             <w:webHidden/>
           </w:rPr>
-          <w:instrText xml:space="preserve"> PAGEREF _Toc241314431 \h </w:instrText>
+          <w:instrText xml:space="preserve"> PAGEREF _Toc241316777 \h </w:instrText>
         </w:r>
         <w:r>
           <w:rPr>
@@ -830,7 +830,7 @@
           <w:noProof/>
         </w:rPr>
       </w:pPr>
-      <w:hyperlink w:anchor="_Toc241314432" w:history="1">
+      <w:hyperlink w:anchor="_Toc241316778" w:history="1">
         <w:r>
           <w:rPr>
             <w:rStyle w:val="Hyperlink"/>
@@ -857,7 +857,7 @@
             <w:noProof/>
             <w:webHidden/>
           </w:rPr>
-          <w:instrText xml:space="preserve"> PAGEREF _Toc241314432 \h </w:instrText>
+          <w:instrText xml:space="preserve"> PAGEREF _Toc241316778 \h </w:instrText>
         </w:r>
         <w:r>
           <w:rPr>
@@ -898,7 +898,7 @@
           <w:noProof/>
         </w:rPr>
       </w:pPr>
-      <w:hyperlink w:anchor="_Toc241314433" w:history="1">
+      <w:hyperlink w:anchor="_Toc241316779" w:history="1">
         <w:r>
           <w:rPr>
             <w:rStyle w:val="Hyperlink"/>
@@ -925,7 +925,7 @@
             <w:noProof/>
             <w:webHidden/>
           </w:rPr>
-          <w:instrText xml:space="preserve"> PAGEREF _Toc241314433 \h </w:instrText>
+          <w:instrText xml:space="preserve"> PAGEREF _Toc241316779 \h </w:instrText>
         </w:r>
         <w:r>
           <w:rPr>
@@ -966,7 +966,7 @@
           <w:noProof/>
         </w:rPr>
       </w:pPr>
-      <w:hyperlink w:anchor="_Toc241314434" w:history="1">
+      <w:hyperlink w:anchor="_Toc241316780" w:history="1">
         <w:r>
           <w:rPr>
             <w:rStyle w:val="Hyperlink"/>
@@ -993,7 +993,7 @@
             <w:noProof/>
             <w:webHidden/>
           </w:rPr>
-          <w:instrText xml:space="preserve"> PAGEREF _Toc241314434 \h </w:instrText>
+          <w:instrText xml:space="preserve"> PAGEREF _Toc241316780 \h </w:instrText>
         </w:r>
         <w:r>
           <w:rPr>
@@ -1034,7 +1034,7 @@
           <w:noProof/>
         </w:rPr>
       </w:pPr>
-      <w:hyperlink w:anchor="_Toc241314435" w:history="1">
+      <w:hyperlink w:anchor="_Toc241316781" w:history="1">
         <w:r>
           <w:rPr>
             <w:rStyle w:val="Hyperlink"/>
@@ -1061,7 +1061,7 @@
             <w:noProof/>
             <w:webHidden/>
           </w:rPr>
-          <w:instrText xml:space="preserve"> PAGEREF _Toc241314435 \h </w:instrText>
+          <w:instrText xml:space="preserve"> PAGEREF _Toc241316781 \h </w:instrText>
         </w:r>
         <w:r>
           <w:rPr>
@@ -1102,7 +1102,7 @@
           <w:noProof/>
         </w:rPr>
       </w:pPr>
-      <w:hyperlink w:anchor="_Toc241314436" w:history="1">
+      <w:hyperlink w:anchor="_Toc241316782" w:history="1">
         <w:r>
           <w:rPr>
             <w:rStyle w:val="Hyperlink"/>
@@ -1129,7 +1129,7 @@
             <w:noProof/>
             <w:webHidden/>
           </w:rPr>
-          <w:instrText xml:space="preserve"> PAGEREF _Toc241314436 \h </w:instrText>
+          <w:instrText xml:space="preserve"> PAGEREF _Toc241316782 \h </w:instrText>
         </w:r>
         <w:r>
           <w:rPr>
@@ -1170,7 +1170,7 @@
           <w:noProof/>
         </w:rPr>
       </w:pPr>
-      <w:hyperlink w:anchor="_Toc241314437" w:history="1">
+      <w:hyperlink w:anchor="_Toc241316783" w:history="1">
         <w:r>
           <w:rPr>
             <w:rStyle w:val="Hyperlink"/>
@@ -1197,7 +1197,7 @@
             <w:noProof/>
             <w:webHidden/>
           </w:rPr>
-          <w:instrText xml:space="preserve"> PAGEREF _Toc241314437 \h </w:instrText>
+          <w:instrText xml:space="preserve"> PAGEREF _Toc241316783 \h </w:instrText>
         </w:r>
         <w:r>
           <w:rPr>
@@ -1238,7 +1238,7 @@
           <w:noProof/>
         </w:rPr>
       </w:pPr>
-      <w:hyperlink w:anchor="_Toc241314438" w:history="1">
+      <w:hyperlink w:anchor="_Toc241316784" w:history="1">
         <w:r>
           <w:rPr>
             <w:rStyle w:val="Hyperlink"/>
@@ -1265,7 +1265,7 @@
             <w:noProof/>
             <w:webHidden/>
           </w:rPr>
-          <w:instrText xml:space="preserve"> PAGEREF _Toc241314438 \h </w:instrText>
+          <w:instrText xml:space="preserve"> PAGEREF _Toc241316784 \h </w:instrText>
         </w:r>
         <w:r>
           <w:rPr>
@@ -1306,7 +1306,7 @@
           <w:noProof/>
         </w:rPr>
       </w:pPr>
-      <w:hyperlink w:anchor="_Toc241314439" w:history="1">
+      <w:hyperlink w:anchor="_Toc241316785" w:history="1">
         <w:r>
           <w:rPr>
             <w:rStyle w:val="Hyperlink"/>
@@ -1333,7 +1333,7 @@
             <w:noProof/>
             <w:webHidden/>
           </w:rPr>
-          <w:instrText xml:space="preserve"> PAGEREF _Toc241314439 \h </w:instrText>
+          <w:instrText xml:space="preserve"> PAGEREF _Toc241316785 \h </w:instrText>
         </w:r>
         <w:r>
           <w:rPr>
@@ -1374,7 +1374,7 @@
           <w:noProof/>
         </w:rPr>
       </w:pPr>
-      <w:hyperlink w:anchor="_Toc241314440" w:history="1">
+      <w:hyperlink w:anchor="_Toc241316786" w:history="1">
         <w:r>
           <w:rPr>
             <w:rStyle w:val="Hyperlink"/>
@@ -1401,7 +1401,7 @@
             <w:noProof/>
             <w:webHidden/>
           </w:rPr>
-          <w:instrText xml:space="preserve"> PAGEREF _Toc241314440 \h </w:instrText>
+          <w:instrText xml:space="preserve"> PAGEREF _Toc241316786 \h </w:instrText>
         </w:r>
         <w:r>
           <w:rPr>
@@ -1442,7 +1442,7 @@
           <w:noProof/>
         </w:rPr>
       </w:pPr>
-      <w:hyperlink w:anchor="_Toc241314441" w:history="1">
+      <w:hyperlink w:anchor="_Toc241316787" w:history="1">
         <w:r>
           <w:rPr>
             <w:rStyle w:val="Hyperlink"/>
@@ -1469,7 +1469,7 @@
             <w:noProof/>
             <w:webHidden/>
           </w:rPr>
-          <w:instrText xml:space="preserve"> PAGEREF _Toc241314441 \h </w:instrText>
+          <w:instrText xml:space="preserve"> PAGEREF _Toc241316787 \h </w:instrText>
         </w:r>
         <w:r>
           <w:rPr>
@@ -1510,7 +1510,7 @@
           <w:noProof/>
         </w:rPr>
       </w:pPr>
-      <w:hyperlink w:anchor="_Toc241314442" w:history="1">
+      <w:hyperlink w:anchor="_Toc241316788" w:history="1">
         <w:r>
           <w:rPr>
             <w:rStyle w:val="Hyperlink"/>
@@ -1537,7 +1537,7 @@
             <w:noProof/>
             <w:webHidden/>
           </w:rPr>
-          <w:instrText xml:space="preserve"> PAGEREF _Toc241314442 \h </w:instrText>
+          <w:instrText xml:space="preserve"> PAGEREF _Toc241316788 \h </w:instrText>
         </w:r>
         <w:r>
           <w:rPr>
@@ -1578,7 +1578,7 @@
           <w:noProof/>
         </w:rPr>
       </w:pPr>
-      <w:hyperlink w:anchor="_Toc241314443" w:history="1">
+      <w:hyperlink w:anchor="_Toc241316789" w:history="1">
         <w:r>
           <w:rPr>
             <w:rStyle w:val="Hyperlink"/>
@@ -1605,7 +1605,7 @@
             <w:noProof/>
             <w:webHidden/>
           </w:rPr>
-          <w:instrText xml:space="preserve"> PAGEREF _Toc241314443 \h </w:instrText>
+          <w:instrText xml:space="preserve"> PAGEREF _Toc241316789 \h </w:instrText>
         </w:r>
         <w:r>
           <w:rPr>
@@ -1646,7 +1646,7 @@
           <w:noProof/>
         </w:rPr>
       </w:pPr>
-      <w:hyperlink w:anchor="_Toc241314444" w:history="1">
+      <w:hyperlink w:anchor="_Toc241316790" w:history="1">
         <w:r>
           <w:rPr>
             <w:rStyle w:val="Hyperlink"/>
@@ -1673,7 +1673,7 @@
             <w:noProof/>
             <w:webHidden/>
           </w:rPr>
-          <w:instrText xml:space="preserve"> PAGEREF _Toc241314444 \h </w:instrText>
+          <w:instrText xml:space="preserve"> PAGEREF _Toc241316790 \h </w:instrText>
         </w:r>
         <w:r>
           <w:rPr>
@@ -1714,7 +1714,7 @@
           <w:noProof/>
         </w:rPr>
       </w:pPr>
-      <w:hyperlink w:anchor="_Toc241314445" w:history="1">
+      <w:hyperlink w:anchor="_Toc241316791" w:history="1">
         <w:r>
           <w:rPr>
             <w:rStyle w:val="Hyperlink"/>
@@ -1741,7 +1741,7 @@
             <w:noProof/>
             <w:webHidden/>
           </w:rPr>
-          <w:instrText xml:space="preserve"> PAGEREF _Toc241314445 \h </w:instrText>
+          <w:instrText xml:space="preserve"> PAGEREF _Toc241316791 \h </w:instrText>
         </w:r>
         <w:r>
           <w:rPr>
@@ -1782,7 +1782,7 @@
           <w:noProof/>
         </w:rPr>
       </w:pPr>
-      <w:hyperlink w:anchor="_Toc241314446" w:history="1">
+      <w:hyperlink w:anchor="_Toc241316792" w:history="1">
         <w:r>
           <w:rPr>
             <w:rStyle w:val="Hyperlink"/>
@@ -1809,7 +1809,7 @@
             <w:noProof/>
             <w:webHidden/>
           </w:rPr>
-          <w:instrText xml:space="preserve"> PAGEREF _Toc241314446 \h </w:instrText>
+          <w:instrText xml:space="preserve"> PAGEREF _Toc241316792 \h </w:instrText>
         </w:r>
         <w:r>
           <w:rPr>
@@ -1850,7 +1850,7 @@
           <w:noProof/>
         </w:rPr>
       </w:pPr>
-      <w:hyperlink w:anchor="_Toc241314447" w:history="1">
+      <w:hyperlink w:anchor="_Toc241316793" w:history="1">
         <w:r>
           <w:rPr>
             <w:rStyle w:val="Hyperlink"/>
@@ -1877,7 +1877,7 @@
             <w:noProof/>
             <w:webHidden/>
           </w:rPr>
-          <w:instrText xml:space="preserve"> PAGEREF _Toc241314447 \h </w:instrText>
+          <w:instrText xml:space="preserve"> PAGEREF _Toc241316793 \h </w:instrText>
         </w:r>
         <w:r>
           <w:rPr>
@@ -1918,7 +1918,7 @@
           <w:noProof/>
         </w:rPr>
       </w:pPr>
-      <w:hyperlink w:anchor="_Toc241314448" w:history="1">
+      <w:hyperlink w:anchor="_Toc241316794" w:history="1">
         <w:r>
           <w:rPr>
             <w:rStyle w:val="Hyperlink"/>
@@ -1945,7 +1945,7 @@
             <w:noProof/>
             <w:webHidden/>
           </w:rPr>
-          <w:instrText xml:space="preserve"> PAGEREF _Toc241314448 \h </w:instrText>
+          <w:instrText xml:space="preserve"> PAGEREF _Toc241316794 \h </w:instrText>
         </w:r>
         <w:r>
           <w:rPr>
@@ -1986,7 +1986,7 @@
           <w:noProof/>
         </w:rPr>
       </w:pPr>
-      <w:hyperlink w:anchor="_Toc241314449" w:history="1">
+      <w:hyperlink w:anchor="_Toc241316795" w:history="1">
         <w:r>
           <w:rPr>
             <w:rStyle w:val="Hyperlink"/>
@@ -2013,7 +2013,7 @@
             <w:noProof/>
             <w:webHidden/>
           </w:rPr>
-          <w:instrText xml:space="preserve"> PAGEREF _Toc241314449 \h </w:instrText>
+          <w:instrText xml:space="preserve"> PAGEREF _Toc241316795 \h </w:instrText>
         </w:r>
         <w:r>
           <w:rPr>
@@ -2054,7 +2054,7 @@
           <w:noProof/>
         </w:rPr>
       </w:pPr>
-      <w:hyperlink w:anchor="_Toc241314450" w:history="1">
+      <w:hyperlink w:anchor="_Toc241316796" w:history="1">
         <w:r>
           <w:rPr>
             <w:rStyle w:val="Hyperlink"/>
@@ -2081,7 +2081,7 @@
             <w:noProof/>
             <w:webHidden/>
           </w:rPr>
-          <w:instrText xml:space="preserve"> PAGEREF _Toc241314450 \h </w:instrText>
+          <w:instrText xml:space="preserve"> PAGEREF _Toc241316796 \h </w:instrText>
         </w:r>
         <w:r>
           <w:rPr>
@@ -2122,7 +2122,7 @@
           <w:noProof/>
         </w:rPr>
       </w:pPr>
-      <w:hyperlink w:anchor="_Toc241314451" w:history="1">
+      <w:hyperlink w:anchor="_Toc241316797" w:history="1">
         <w:r>
           <w:rPr>
             <w:rStyle w:val="Hyperlink"/>
@@ -2149,7 +2149,7 @@
             <w:noProof/>
             <w:webHidden/>
           </w:rPr>
-          <w:instrText xml:space="preserve"> PAGEREF _Toc241314451 \h </w:instrText>
+          <w:instrText xml:space="preserve"> PAGEREF _Toc241316797 \h </w:instrText>
         </w:r>
         <w:r>
           <w:rPr>
@@ -2190,7 +2190,7 @@
           <w:noProof/>
         </w:rPr>
       </w:pPr>
-      <w:hyperlink w:anchor="_Toc241314452" w:history="1">
+      <w:hyperlink w:anchor="_Toc241316798" w:history="1">
         <w:r>
           <w:rPr>
             <w:rStyle w:val="Hyperlink"/>
@@ -2217,7 +2217,7 @@
             <w:noProof/>
             <w:webHidden/>
           </w:rPr>
-          <w:instrText xml:space="preserve"> PAGEREF _Toc241314452 \h </w:instrText>
+          <w:instrText xml:space="preserve"> PAGEREF _Toc241316798 \h </w:instrText>
         </w:r>
         <w:r>
           <w:rPr>
@@ -2258,7 +2258,7 @@
           <w:noProof/>
         </w:rPr>
       </w:pPr>
-      <w:hyperlink w:anchor="_Toc241314453" w:history="1">
+      <w:hyperlink w:anchor="_Toc241316799" w:history="1">
         <w:r>
           <w:rPr>
             <w:rStyle w:val="Hyperlink"/>
@@ -2285,7 +2285,7 @@
             <w:noProof/>
             <w:webHidden/>
           </w:rPr>
-          <w:instrText xml:space="preserve"> PAGEREF _Toc241314453 \h </w:instrText>
+          <w:instrText xml:space="preserve"> PAGEREF _Toc241316799 \h </w:instrText>
         </w:r>
         <w:r>
           <w:rPr>
@@ -2326,7 +2326,7 @@
           <w:noProof/>
         </w:rPr>
       </w:pPr>
-      <w:hyperlink w:anchor="_Toc241314454" w:history="1">
+      <w:hyperlink w:anchor="_Toc241316800" w:history="1">
         <w:r>
           <w:rPr>
             <w:rStyle w:val="Hyperlink"/>
@@ -2353,7 +2353,7 @@
             <w:noProof/>
             <w:webHidden/>
           </w:rPr>
-          <w:instrText xml:space="preserve"> PAGEREF _Toc241314454 \h </w:instrText>
+          <w:instrText xml:space="preserve"> PAGEREF _Toc241316800 \h </w:instrText>
         </w:r>
         <w:r>
           <w:rPr>
@@ -2394,7 +2394,7 @@
           <w:noProof/>
         </w:rPr>
       </w:pPr>
-      <w:hyperlink w:anchor="_Toc241314455" w:history="1">
+      <w:hyperlink w:anchor="_Toc241316801" w:history="1">
         <w:r>
           <w:rPr>
             <w:rStyle w:val="Hyperlink"/>
@@ -2421,7 +2421,7 @@
             <w:noProof/>
             <w:webHidden/>
           </w:rPr>
-          <w:instrText xml:space="preserve"> PAGEREF _Toc241314455 \h </w:instrText>
+          <w:instrText xml:space="preserve"> PAGEREF _Toc241316801 \h </w:instrText>
         </w:r>
         <w:r>
           <w:rPr>
@@ -2462,7 +2462,7 @@
           <w:noProof/>
         </w:rPr>
       </w:pPr>
-      <w:hyperlink w:anchor="_Toc241314456" w:history="1">
+      <w:hyperlink w:anchor="_Toc241316802" w:history="1">
         <w:r>
           <w:rPr>
             <w:rStyle w:val="Hyperlink"/>
@@ -2489,7 +2489,7 @@
             <w:noProof/>
             <w:webHidden/>
           </w:rPr>
-          <w:instrText xml:space="preserve"> PAGEREF _Toc241314456 \h </w:instrText>
+          <w:instrText xml:space="preserve"> PAGEREF _Toc241316802 \h </w:instrText>
         </w:r>
         <w:r>
           <w:rPr>
@@ -2530,7 +2530,7 @@
           <w:noProof/>
         </w:rPr>
       </w:pPr>
-      <w:hyperlink w:anchor="_Toc241314457" w:history="1">
+      <w:hyperlink w:anchor="_Toc241316803" w:history="1">
         <w:r>
           <w:rPr>
             <w:rStyle w:val="Hyperlink"/>
@@ -2557,7 +2557,7 @@
             <w:noProof/>
             <w:webHidden/>
           </w:rPr>
-          <w:instrText xml:space="preserve"> PAGEREF _Toc241314457 \h </w:instrText>
+          <w:instrText xml:space="preserve"> PAGEREF _Toc241316803 \h </w:instrText>
         </w:r>
         <w:r>
           <w:rPr>
@@ -2598,7 +2598,7 @@
           <w:noProof/>
         </w:rPr>
       </w:pPr>
-      <w:hyperlink w:anchor="_Toc241314458" w:history="1">
+      <w:hyperlink w:anchor="_Toc241316804" w:history="1">
         <w:r>
           <w:rPr>
             <w:rStyle w:val="Hyperlink"/>
@@ -2625,7 +2625,7 @@
             <w:noProof/>
             <w:webHidden/>
           </w:rPr>
-          <w:instrText xml:space="preserve"> PAGEREF _Toc241314458 \h </w:instrText>
+          <w:instrText xml:space="preserve"> PAGEREF _Toc241316804 \h </w:instrText>
         </w:r>
         <w:r>
           <w:rPr>
@@ -2666,7 +2666,7 @@
           <w:noProof/>
         </w:rPr>
       </w:pPr>
-      <w:hyperlink w:anchor="_Toc241314459" w:history="1">
+      <w:hyperlink w:anchor="_Toc241316805" w:history="1">
         <w:r>
           <w:rPr>
             <w:rStyle w:val="Hyperlink"/>
@@ -2693,7 +2693,7 @@
             <w:noProof/>
             <w:webHidden/>
           </w:rPr>
-          <w:instrText xml:space="preserve"> PAGEREF _Toc241314459 \h </w:instrText>
+          <w:instrText xml:space="preserve"> PAGEREF _Toc241316805 \h </w:instrText>
         </w:r>
         <w:r>
           <w:rPr>
@@ -2734,7 +2734,7 @@
           <w:noProof/>
         </w:rPr>
       </w:pPr>
-      <w:hyperlink w:anchor="_Toc241314460" w:history="1">
+      <w:hyperlink w:anchor="_Toc241316806" w:history="1">
         <w:r>
           <w:rPr>
             <w:rStyle w:val="Hyperlink"/>
@@ -2761,7 +2761,7 @@
             <w:noProof/>
             <w:webHidden/>
           </w:rPr>
-          <w:instrText xml:space="preserve"> PAGEREF _Toc241314460 \h </w:instrText>
+          <w:instrText xml:space="preserve"> PAGEREF _Toc241316806 \h </w:instrText>
         </w:r>
         <w:r>
           <w:rPr>
@@ -2802,7 +2802,7 @@
           <w:noProof/>
         </w:rPr>
       </w:pPr>
-      <w:hyperlink w:anchor="_Toc241314461" w:history="1">
+      <w:hyperlink w:anchor="_Toc241316807" w:history="1">
         <w:r>
           <w:rPr>
             <w:rStyle w:val="Hyperlink"/>
@@ -2829,7 +2829,7 @@
             <w:noProof/>
             <w:webHidden/>
           </w:rPr>
-          <w:instrText xml:space="preserve"> PAGEREF _Toc241314461 \h </w:instrText>
+          <w:instrText xml:space="preserve"> PAGEREF _Toc241316807 \h </w:instrText>
         </w:r>
         <w:r>
           <w:rPr>
@@ -2870,7 +2870,7 @@
           <w:noProof/>
         </w:rPr>
       </w:pPr>
-      <w:hyperlink w:anchor="_Toc241314462" w:history="1">
+      <w:hyperlink w:anchor="_Toc241316808" w:history="1">
         <w:r>
           <w:rPr>
             <w:rStyle w:val="Hyperlink"/>
@@ -2897,7 +2897,7 @@
             <w:noProof/>
             <w:webHidden/>
           </w:rPr>
-          <w:instrText xml:space="preserve"> PAGEREF _Toc241314462 \h </w:instrText>
+          <w:instrText xml:space="preserve"> PAGEREF _Toc241316808 \h </w:instrText>
         </w:r>
         <w:r>
           <w:rPr>
@@ -2938,7 +2938,7 @@
           <w:noProof/>
         </w:rPr>
       </w:pPr>
-      <w:hyperlink w:anchor="_Toc241314463" w:history="1">
+      <w:hyperlink w:anchor="_Toc241316809" w:history="1">
         <w:r>
           <w:rPr>
             <w:rStyle w:val="Hyperlink"/>
@@ -2965,7 +2965,7 @@
             <w:noProof/>
             <w:webHidden/>
           </w:rPr>
-          <w:instrText xml:space="preserve"> PAGEREF _Toc241314463 \h </w:instrText>
+          <w:instrText xml:space="preserve"> PAGEREF _Toc241316809 \h </w:instrText>
         </w:r>
         <w:r>
           <w:rPr>
@@ -3006,7 +3006,7 @@
           <w:noProof/>
         </w:rPr>
       </w:pPr>
-      <w:hyperlink w:anchor="_Toc241314464" w:history="1">
+      <w:hyperlink w:anchor="_Toc241316810" w:history="1">
         <w:r>
           <w:rPr>
             <w:rStyle w:val="Hyperlink"/>
@@ -3033,7 +3033,7 @@
             <w:noProof/>
             <w:webHidden/>
           </w:rPr>
-          <w:instrText xml:space="preserve"> PAGEREF _Toc241314464 \h </w:instrText>
+          <w:instrText xml:space="preserve"> PAGEREF _Toc241316810 \h </w:instrText>
         </w:r>
         <w:r>
           <w:rPr>
@@ -3074,7 +3074,7 @@
           <w:noProof/>
         </w:rPr>
       </w:pPr>
-      <w:hyperlink w:anchor="_Toc241314465" w:history="1">
+      <w:hyperlink w:anchor="_Toc241316811" w:history="1">
         <w:r>
           <w:rPr>
             <w:rStyle w:val="Hyperlink"/>
@@ -3101,7 +3101,7 @@
             <w:noProof/>
             <w:webHidden/>
           </w:rPr>
-          <w:instrText xml:space="preserve"> PAGEREF _Toc241314465 \h </w:instrText>
+          <w:instrText xml:space="preserve"> PAGEREF _Toc241316811 \h </w:instrText>
         </w:r>
         <w:r>
           <w:rPr>
@@ -3142,7 +3142,7 @@
           <w:noProof/>
         </w:rPr>
       </w:pPr>
-      <w:hyperlink w:anchor="_Toc241314466" w:history="1">
+      <w:hyperlink w:anchor="_Toc241316812" w:history="1">
         <w:r>
           <w:rPr>
             <w:rStyle w:val="Hyperlink"/>
@@ -3169,7 +3169,7 @@
             <w:noProof/>
             <w:webHidden/>
           </w:rPr>
-          <w:instrText xml:space="preserve"> PAGEREF _Toc241314466 \h </w:instrText>
+          <w:instrText xml:space="preserve"> PAGEREF _Toc241316812 \h </w:instrText>
         </w:r>
         <w:r>
           <w:rPr>
@@ -3210,7 +3210,7 @@
           <w:noProof/>
         </w:rPr>
       </w:pPr>
-      <w:hyperlink w:anchor="_Toc241314467" w:history="1">
+      <w:hyperlink w:anchor="_Toc241316813" w:history="1">
         <w:r>
           <w:rPr>
             <w:rStyle w:val="Hyperlink"/>
@@ -3237,7 +3237,7 @@
             <w:noProof/>
             <w:webHidden/>
           </w:rPr>
-          <w:instrText xml:space="preserve"> PAGEREF _Toc241314467 \h </w:instrText>
+          <w:instrText xml:space="preserve"> PAGEREF _Toc241316813 \h </w:instrText>
         </w:r>
         <w:r>
           <w:rPr>
@@ -3278,7 +3278,7 @@
           <w:noProof/>
         </w:rPr>
       </w:pPr>
-      <w:hyperlink w:anchor="_Toc241314468" w:history="1">
+      <w:hyperlink w:anchor="_Toc241316814" w:history="1">
         <w:r>
           <w:rPr>
             <w:rStyle w:val="Hyperlink"/>
@@ -3305,7 +3305,7 @@
             <w:noProof/>
             <w:webHidden/>
           </w:rPr>
-          <w:instrText xml:space="preserve"> PAGEREF _Toc241314468 \h </w:instrText>
+          <w:instrText xml:space="preserve"> PAGEREF _Toc241316814 \h </w:instrText>
         </w:r>
         <w:r>
           <w:rPr>
@@ -3346,7 +3346,7 @@
           <w:noProof/>
         </w:rPr>
       </w:pPr>
-      <w:hyperlink w:anchor="_Toc241314469" w:history="1">
+      <w:hyperlink w:anchor="_Toc241316815" w:history="1">
         <w:r>
           <w:rPr>
             <w:rStyle w:val="Hyperlink"/>
@@ -3373,7 +3373,7 @@
             <w:noProof/>
             <w:webHidden/>
           </w:rPr>
-          <w:instrText xml:space="preserve"> PAGEREF _Toc241314469 \h </w:instrText>
+          <w:instrText xml:space="preserve"> PAGEREF _Toc241316815 \h </w:instrText>
         </w:r>
         <w:r>
           <w:rPr>
@@ -3414,7 +3414,7 @@
           <w:noProof/>
         </w:rPr>
       </w:pPr>
-      <w:hyperlink w:anchor="_Toc241314470" w:history="1">
+      <w:hyperlink w:anchor="_Toc241316816" w:history="1">
         <w:r>
           <w:rPr>
             <w:rStyle w:val="Hyperlink"/>
@@ -3441,7 +3441,7 @@
             <w:noProof/>
             <w:webHidden/>
           </w:rPr>
-          <w:instrText xml:space="preserve"> PAGEREF _Toc241314470 \h </w:instrText>
+          <w:instrText xml:space="preserve"> PAGEREF _Toc241316816 \h </w:instrText>
         </w:r>
         <w:r>
           <w:rPr>
@@ -3482,7 +3482,7 @@
           <w:noProof/>
         </w:rPr>
       </w:pPr>
-      <w:hyperlink w:anchor="_Toc241314471" w:history="1">
+      <w:hyperlink w:anchor="_Toc241316817" w:history="1">
         <w:r>
           <w:rPr>
             <w:rStyle w:val="Hyperlink"/>
@@ -3509,7 +3509,7 @@
             <w:noProof/>
             <w:webHidden/>
           </w:rPr>
-          <w:instrText xml:space="preserve"> PAGEREF _Toc241314471 \h </w:instrText>
+          <w:instrText xml:space="preserve"> PAGEREF _Toc241316817 \h </w:instrText>
         </w:r>
         <w:r>
           <w:rPr>
@@ -3550,7 +3550,7 @@
           <w:noProof/>
         </w:rPr>
       </w:pPr>
-      <w:hyperlink w:anchor="_Toc241314472" w:history="1">
+      <w:hyperlink w:anchor="_Toc241316818" w:history="1">
         <w:r>
           <w:rPr>
             <w:rStyle w:val="Hyperlink"/>
@@ -3577,7 +3577,7 @@
             <w:noProof/>
             <w:webHidden/>
           </w:rPr>
-          <w:instrText xml:space="preserve"> PAGEREF _Toc241314472 \h </w:instrText>
+          <w:instrText xml:space="preserve"> PAGEREF _Toc241316818 \h </w:instrText>
         </w:r>
         <w:r>
           <w:rPr>
@@ -3597,7 +3597,7 @@
             <w:noProof/>
             <w:webHidden/>
           </w:rPr>
-          <w:t>14</w:t>
+          <w:t>15</w:t>
         </w:r>
         <w:r>
           <w:rPr>
@@ -3622,7 +3622,7 @@
       <w:pPr>
         <w:pStyle w:val="Heading1"/>
       </w:pPr>
-      <w:bookmarkStart w:id="0" w:name="_Toc241314424"/>
+      <w:bookmarkStart w:id="0" w:name="_Toc241316770"/>
       <w:r>
         <w:lastRenderedPageBreak/>
         <w:t>1. Información general del producto</w:t>
@@ -4130,7 +4130,7 @@
       <w:pPr>
         <w:pStyle w:val="Heading1"/>
       </w:pPr>
-      <w:bookmarkStart w:id="1" w:name="_Toc241314425"/>
+      <w:bookmarkStart w:id="1" w:name="_Toc241316771"/>
       <w:r>
         <w:t>2. Descripción general del software</w:t>
       </w:r>
@@ -4190,7 +4190,7 @@
       <w:pPr>
         <w:pStyle w:val="Heading2"/>
       </w:pPr>
-      <w:bookmarkStart w:id="2" w:name="_Toc241314426"/>
+      <w:bookmarkStart w:id="2" w:name="_Toc241316772"/>
       <w:r>
         <w:t>2.1. Especificación de requisitos de hardware y software</w:t>
       </w:r>
@@ -4200,7 +4200,7 @@
       <w:pPr>
         <w:pStyle w:val="Heading3"/>
       </w:pPr>
-      <w:bookmarkStart w:id="3" w:name="_Toc241314427"/>
+      <w:bookmarkStart w:id="3" w:name="_Toc241316773"/>
       <w:r>
         <w:t>Requisitos para el usuario final</w:t>
       </w:r>
@@ -4512,7 +4512,7 @@
       <w:pPr>
         <w:pStyle w:val="Heading3"/>
       </w:pPr>
-      <w:bookmarkStart w:id="4" w:name="_Toc241314428"/>
+      <w:bookmarkStart w:id="4" w:name="_Toc241316774"/>
       <w:r>
         <w:t>Entorno de software (modo desarrollo)</w:t>
       </w:r>
@@ -4863,7 +4863,7 @@
       <w:pPr>
         <w:pStyle w:val="Heading3"/>
       </w:pPr>
-      <w:bookmarkStart w:id="5" w:name="_Toc241314429"/>
+      <w:bookmarkStart w:id="5" w:name="_Toc241316775"/>
       <w:r>
         <w:t>Requisito de operación en red</w:t>
       </w:r>
@@ -4881,7 +4881,7 @@
       <w:pPr>
         <w:pStyle w:val="Heading2"/>
       </w:pPr>
-      <w:bookmarkStart w:id="6" w:name="_Toc241314430"/>
+      <w:bookmarkStart w:id="6" w:name="_Toc241316776"/>
       <w:r>
         <w:lastRenderedPageBreak/>
         <w:t>2.2. Justificación de los requisitos</w:t>
@@ -4919,7 +4919,7 @@
       <w:pPr>
         <w:pStyle w:val="Heading1"/>
       </w:pPr>
-      <w:bookmarkStart w:id="7" w:name="_Toc241314431"/>
+      <w:bookmarkStart w:id="7" w:name="_Toc241316777"/>
       <w:r>
         <w:t>3. Objetivos y área de aplicación</w:t>
       </w:r>
@@ -4929,7 +4929,7 @@
       <w:pPr>
         <w:pStyle w:val="Heading2"/>
       </w:pPr>
-      <w:bookmarkStart w:id="8" w:name="_Toc241314432"/>
+      <w:bookmarkStart w:id="8" w:name="_Toc241316778"/>
       <w:r>
         <w:t>3.1 Objetivo general</w:t>
       </w:r>
@@ -4947,7 +4947,7 @@
       <w:pPr>
         <w:pStyle w:val="Heading2"/>
       </w:pPr>
-      <w:bookmarkStart w:id="9" w:name="_Toc241314433"/>
+      <w:bookmarkStart w:id="9" w:name="_Toc241316779"/>
       <w:r>
         <w:t>3.2 Objetivos específicos</w:t>
       </w:r>
@@ -5020,7 +5020,7 @@
       <w:pPr>
         <w:pStyle w:val="Heading2"/>
       </w:pPr>
-      <w:bookmarkStart w:id="10" w:name="_Toc241314434"/>
+      <w:bookmarkStart w:id="10" w:name="_Toc241316780"/>
       <w:r>
         <w:t>3.3 Área de aplicación</w:t>
       </w:r>
@@ -5093,7 +5093,7 @@
       <w:pPr>
         <w:pStyle w:val="Heading1"/>
       </w:pPr>
-      <w:bookmarkStart w:id="11" w:name="_Toc241314435"/>
+      <w:bookmarkStart w:id="11" w:name="_Toc241316781"/>
       <w:r>
         <w:t>4. Funcionalidades principales</w:t>
       </w:r>
@@ -5322,7 +5322,7 @@
       <w:pPr>
         <w:pStyle w:val="Heading1"/>
       </w:pPr>
-      <w:bookmarkStart w:id="12" w:name="_Toc241314436"/>
+      <w:bookmarkStart w:id="12" w:name="_Toc241316782"/>
       <w:r>
         <w:t>5. Adaptabilidad, extensibilidad y mantenibilidad</w:t>
       </w:r>
@@ -5332,7 +5332,7 @@
       <w:pPr>
         <w:pStyle w:val="Heading3"/>
       </w:pPr>
-      <w:bookmarkStart w:id="13" w:name="_Toc241314437"/>
+      <w:bookmarkStart w:id="13" w:name="_Toc241316783"/>
       <w:r>
         <w:t>Modularidad</w:t>
       </w:r>
@@ -5350,7 +5350,7 @@
       <w:pPr>
         <w:pStyle w:val="Heading3"/>
       </w:pPr>
-      <w:bookmarkStart w:id="14" w:name="_Toc241314438"/>
+      <w:bookmarkStart w:id="14" w:name="_Toc241316784"/>
       <w:r>
         <w:t>Incorporación de nuevos algoritmos</w:t>
       </w:r>
@@ -5368,7 +5368,7 @@
       <w:pPr>
         <w:pStyle w:val="Heading3"/>
       </w:pPr>
-      <w:bookmarkStart w:id="15" w:name="_Toc241314439"/>
+      <w:bookmarkStart w:id="15" w:name="_Toc241316785"/>
       <w:r>
         <w:t>Incorporación de nuevas fuentes de datos</w:t>
       </w:r>
@@ -5386,7 +5386,7 @@
       <w:pPr>
         <w:pStyle w:val="Heading3"/>
       </w:pPr>
-      <w:bookmarkStart w:id="16" w:name="_Toc241314440"/>
+      <w:bookmarkStart w:id="16" w:name="_Toc241316786"/>
       <w:r>
         <w:t>Reutilización de componentes</w:t>
       </w:r>
@@ -5404,7 +5404,7 @@
       <w:pPr>
         <w:pStyle w:val="Heading3"/>
       </w:pPr>
-      <w:bookmarkStart w:id="17" w:name="_Toc241314441"/>
+      <w:bookmarkStart w:id="17" w:name="_Toc241316787"/>
       <w:r>
         <w:t>Configuración y parametrización</w:t>
       </w:r>
@@ -5422,7 +5422,7 @@
       <w:pPr>
         <w:pStyle w:val="Heading3"/>
       </w:pPr>
-      <w:bookmarkStart w:id="18" w:name="_Toc241314442"/>
+      <w:bookmarkStart w:id="18" w:name="_Toc241316788"/>
       <w:r>
         <w:t>Facilidad de mantenimiento</w:t>
       </w:r>
@@ -5440,7 +5440,7 @@
       <w:pPr>
         <w:pStyle w:val="Heading3"/>
       </w:pPr>
-      <w:bookmarkStart w:id="19" w:name="_Toc241314443"/>
+      <w:bookmarkStart w:id="19" w:name="_Toc241316789"/>
       <w:r>
         <w:t>Extensiones ya realizadas</w:t>
       </w:r>
@@ -5458,7 +5458,7 @@
       <w:pPr>
         <w:pStyle w:val="Heading1"/>
       </w:pPr>
-      <w:bookmarkStart w:id="20" w:name="_Toc241314444"/>
+      <w:bookmarkStart w:id="20" w:name="_Toc241316790"/>
       <w:r>
         <w:lastRenderedPageBreak/>
         <w:t>6. Robustez, desempeño y consistencia</w:t>
@@ -5469,7 +5469,7 @@
       <w:pPr>
         <w:pStyle w:val="Heading2"/>
       </w:pPr>
-      <w:bookmarkStart w:id="21" w:name="_Toc241314445"/>
+      <w:bookmarkStart w:id="21" w:name="_Toc241316791"/>
       <w:r>
         <w:t>6.1 Robustez</w:t>
       </w:r>
@@ -5490,7 +5490,7 @@
       <w:pPr>
         <w:pStyle w:val="Heading2"/>
       </w:pPr>
-      <w:bookmarkStart w:id="22" w:name="_Toc241314446"/>
+      <w:bookmarkStart w:id="22" w:name="_Toc241316792"/>
       <w:r>
         <w:t>6.2 Desempeño</w:t>
       </w:r>
@@ -6936,7 +6936,7 @@
       <w:pPr>
         <w:pStyle w:val="Heading2"/>
       </w:pPr>
-      <w:bookmarkStart w:id="23" w:name="_Toc241314447"/>
+      <w:bookmarkStart w:id="23" w:name="_Toc241316793"/>
       <w:r>
         <w:t>6.3 Consistencia y reproducibilidad</w:t>
       </w:r>
@@ -6954,7 +6954,7 @@
       <w:pPr>
         <w:pStyle w:val="Heading1"/>
       </w:pPr>
-      <w:bookmarkStart w:id="24" w:name="_Toc241314448"/>
+      <w:bookmarkStart w:id="24" w:name="_Toc241316794"/>
       <w:r>
         <w:t>7. Interfaz y usabilidad</w:t>
       </w:r>
@@ -6982,7 +6982,7 @@
           <w:noProof/>
         </w:rPr>
         <w:drawing>
-          <wp:inline distT="0" distB="0" distL="0" distR="0" wp14:anchorId="37D3709F" wp14:editId="45946060">
+          <wp:inline distT="0" distB="0" distL="0" distR="0" wp14:anchorId="0BD3951E" wp14:editId="4F0C5CE4">
             <wp:extent cx="5760000" cy="3420000"/>
             <wp:effectExtent l="0" t="0" r="0" b="0"/>
             <wp:docPr id="1" name="Picture 1"/>
@@ -7036,7 +7036,7 @@
       <w:pPr>
         <w:pStyle w:val="Heading1"/>
       </w:pPr>
-      <w:bookmarkStart w:id="25" w:name="_Toc241314449"/>
+      <w:bookmarkStart w:id="25" w:name="_Toc241316795"/>
       <w:r>
         <w:t>8. Integridad y seguridad de la información</w:t>
       </w:r>
@@ -7057,7 +7057,7 @@
       <w:pPr>
         <w:pStyle w:val="Heading1"/>
       </w:pPr>
-      <w:bookmarkStart w:id="26" w:name="_Toc241314450"/>
+      <w:bookmarkStart w:id="26" w:name="_Toc241316796"/>
       <w:r>
         <w:t>9. Portabilidad y compatibilidad</w:t>
       </w:r>
@@ -7067,7 +7067,7 @@
       <w:pPr>
         <w:pStyle w:val="Heading2"/>
       </w:pPr>
-      <w:bookmarkStart w:id="27" w:name="_Toc241314451"/>
+      <w:bookmarkStart w:id="27" w:name="_Toc241316797"/>
       <w:r>
         <w:t>9.1 Plataformas compatibles</w:t>
       </w:r>
@@ -7085,7 +7085,7 @@
       <w:pPr>
         <w:pStyle w:val="Heading2"/>
       </w:pPr>
-      <w:bookmarkStart w:id="28" w:name="_Toc241314452"/>
+      <w:bookmarkStart w:id="28" w:name="_Toc241316798"/>
       <w:r>
         <w:lastRenderedPageBreak/>
         <w:t>9.2 Dependencias relevantes</w:t>
@@ -7407,7 +7407,7 @@
       <w:pPr>
         <w:pStyle w:val="Heading2"/>
       </w:pPr>
-      <w:bookmarkStart w:id="29" w:name="_Toc241314453"/>
+      <w:bookmarkStart w:id="29" w:name="_Toc241316799"/>
       <w:r>
         <w:t>9.3 Portabilidad</w:t>
       </w:r>
@@ -8120,7 +8120,7 @@
       <w:pPr>
         <w:pStyle w:val="Heading1"/>
       </w:pPr>
-      <w:bookmarkStart w:id="30" w:name="_Toc241314454"/>
+      <w:bookmarkStart w:id="30" w:name="_Toc241316800"/>
       <w:r>
         <w:t>10. Documentación y soporte técnico</w:t>
       </w:r>
@@ -8138,7 +8138,7 @@
       <w:pPr>
         <w:pStyle w:val="Heading3"/>
       </w:pPr>
-      <w:bookmarkStart w:id="31" w:name="_Toc241314455"/>
+      <w:bookmarkStart w:id="31" w:name="_Toc241316801"/>
       <w:r>
         <w:lastRenderedPageBreak/>
         <w:t>Soporte técnico</w:t>
@@ -8157,7 +8157,7 @@
       <w:pPr>
         <w:pStyle w:val="Heading1"/>
       </w:pPr>
-      <w:bookmarkStart w:id="32" w:name="_Toc241314456"/>
+      <w:bookmarkStart w:id="32" w:name="_Toc241316802"/>
       <w:r>
         <w:t>11. Pruebas, validación y desempeño</w:t>
       </w:r>
@@ -10177,7 +10177,7 @@
       <w:pPr>
         <w:pStyle w:val="Heading1"/>
       </w:pPr>
-      <w:bookmarkStart w:id="33" w:name="_Toc241314457"/>
+      <w:bookmarkStart w:id="33" w:name="_Toc241316803"/>
       <w:r>
         <w:lastRenderedPageBreak/>
         <w:t>12. Impacto y utilización</w:t>
@@ -10188,7 +10188,7 @@
       <w:pPr>
         <w:pStyle w:val="Heading2"/>
       </w:pPr>
-      <w:bookmarkStart w:id="34" w:name="_Toc241314458"/>
+      <w:bookmarkStart w:id="34" w:name="_Toc241316804"/>
       <w:r>
         <w:t>12.1 Impacto en docencia</w:t>
       </w:r>
@@ -10206,7 +10206,7 @@
       <w:pPr>
         <w:pStyle w:val="Heading2"/>
       </w:pPr>
-      <w:bookmarkStart w:id="35" w:name="_Toc241314459"/>
+      <w:bookmarkStart w:id="35" w:name="_Toc241316805"/>
       <w:r>
         <w:t>12.2 Impacto en investigación</w:t>
       </w:r>
@@ -10224,7 +10224,7 @@
       <w:pPr>
         <w:pStyle w:val="Heading2"/>
       </w:pPr>
-      <w:bookmarkStart w:id="36" w:name="_Toc241314460"/>
+      <w:bookmarkStart w:id="36" w:name="_Toc241316806"/>
       <w:r>
         <w:t>12.3 Impacto en extensión</w:t>
       </w:r>
@@ -10242,7 +10242,7 @@
       <w:pPr>
         <w:pStyle w:val="Heading2"/>
       </w:pPr>
-      <w:bookmarkStart w:id="37" w:name="_Toc241314461"/>
+      <w:bookmarkStart w:id="37" w:name="_Toc241316807"/>
       <w:r>
         <w:t>12.4 Usuarios y utilización</w:t>
       </w:r>
@@ -10260,7 +10260,7 @@
       <w:pPr>
         <w:pStyle w:val="Heading2"/>
       </w:pPr>
-      <w:bookmarkStart w:id="38" w:name="_Toc241314462"/>
+      <w:bookmarkStart w:id="38" w:name="_Toc241316808"/>
       <w:r>
         <w:t>12.5 Evidencias de impacto</w:t>
       </w:r>
@@ -10278,7 +10278,7 @@
       <w:pPr>
         <w:pStyle w:val="Heading1"/>
       </w:pPr>
-      <w:bookmarkStart w:id="39" w:name="_Toc241314463"/>
+      <w:bookmarkStart w:id="39" w:name="_Toc241316809"/>
       <w:r>
         <w:t>13. Contribución al estado del arte</w:t>
       </w:r>
@@ -10288,7 +10288,7 @@
       <w:pPr>
         <w:pStyle w:val="Heading2"/>
       </w:pPr>
-      <w:bookmarkStart w:id="40" w:name="_Toc241314464"/>
+      <w:bookmarkStart w:id="40" w:name="_Toc241316810"/>
       <w:r>
         <w:t>13.1 Problema abordado</w:t>
       </w:r>
@@ -10306,7 +10306,7 @@
       <w:pPr>
         <w:pStyle w:val="Heading2"/>
       </w:pPr>
-      <w:bookmarkStart w:id="41" w:name="_Toc241314465"/>
+      <w:bookmarkStart w:id="41" w:name="_Toc241316811"/>
       <w:r>
         <w:lastRenderedPageBreak/>
         <w:t>13.2 Estado del arte</w:t>
@@ -10325,7 +10325,7 @@
       <w:pPr>
         <w:pStyle w:val="Heading2"/>
       </w:pPr>
-      <w:bookmarkStart w:id="42" w:name="_Toc241314466"/>
+      <w:bookmarkStart w:id="42" w:name="_Toc241316812"/>
       <w:r>
         <w:t>13.3 Limitaciones actuales del estado del arte</w:t>
       </w:r>
@@ -10343,7 +10343,7 @@
       <w:pPr>
         <w:pStyle w:val="Heading2"/>
       </w:pPr>
-      <w:bookmarkStart w:id="43" w:name="_Toc241314467"/>
+      <w:bookmarkStart w:id="43" w:name="_Toc241316813"/>
       <w:r>
         <w:t>13.4 Impacto de Meritum_CAT sobre el estado del arte</w:t>
       </w:r>
@@ -10364,7 +10364,7 @@
       <w:pPr>
         <w:pStyle w:val="Heading1"/>
       </w:pPr>
-      <w:bookmarkStart w:id="44" w:name="_Toc241314468"/>
+      <w:bookmarkStart w:id="44" w:name="_Toc241316814"/>
       <w:r>
         <w:t>14. Aportes de los autores</w:t>
       </w:r>
@@ -10374,7 +10374,7 @@
       <w:pPr>
         <w:pStyle w:val="Heading2"/>
       </w:pPr>
-      <w:bookmarkStart w:id="45" w:name="_Toc241314469"/>
+      <w:bookmarkStart w:id="45" w:name="_Toc241316815"/>
       <w:r>
         <w:t>14.1 Keidy Lucía Gómez Otero</w:t>
       </w:r>
@@ -10392,7 +10392,7 @@
       <w:pPr>
         <w:pStyle w:val="Heading2"/>
       </w:pPr>
-      <w:bookmarkStart w:id="46" w:name="_Toc241314470"/>
+      <w:bookmarkStart w:id="46" w:name="_Toc241316816"/>
       <w:r>
         <w:t>14.2 Francisco Javier Burgos Flórez</w:t>
       </w:r>
@@ -10410,7 +10410,7 @@
       <w:pPr>
         <w:pStyle w:val="Heading2"/>
       </w:pPr>
-      <w:bookmarkStart w:id="47" w:name="_Toc241314471"/>
+      <w:bookmarkStart w:id="47" w:name="_Toc241316817"/>
       <w:r>
         <w:t>14.3 Juan Guillermo Popayán Hernández</w:t>
       </w:r>
@@ -10421,19 +10421,16 @@
         <w:jc w:val="both"/>
       </w:pPr>
       <w:r>
-        <w:rPr>
-          <w:i/>
-          <w:highlight w:val="yellow"/>
-        </w:rPr>
-        <w:t>[COMPLETAR: aportes de Juan Guillermo Popayán Hernández al software]</w:t>
+        <w:t>Contribuyó en la metodología, en el código y en todo lo relacionado con la ingeniería del software: el diseño técnico, la implementación y la verificación de su funcionamiento.</w:t>
       </w:r>
     </w:p>
     <w:p>
       <w:pPr>
         <w:pStyle w:val="Heading1"/>
       </w:pPr>
-      <w:bookmarkStart w:id="48" w:name="_Toc241314472"/>
+      <w:bookmarkStart w:id="48" w:name="_Toc241316818"/>
       <w:r>
+        <w:lastRenderedPageBreak/>
         <w:t>Referencias</w:t>
       </w:r>
       <w:bookmarkEnd w:id="48"/>
@@ -10454,24 +10451,18 @@
           <w:sz w:val="20"/>
         </w:rPr>
         <w:tab/>
+        <w:t>G. Rasch, Probabilistic Models for Some Intelligence and Attainment Tests. Copenhague, Dinamarca: Danish Institute for Educational Research, 1960.</w:t>
       </w:r>
+    </w:p>
+    <w:p>
+      <w:pPr>
+        <w:spacing w:after="80"/>
+        <w:ind w:left="510" w:hanging="510"/>
+      </w:pPr>
       <w:r>
         <w:rPr>
           <w:sz w:val="20"/>
         </w:rPr>
-        <w:t>G. Rasch, Probabilistic Models for Some Intelligence and Attainment Tests. Copenhague, Dinamarca: Danish Institute for Educational Research, 1960.</w:t>
-      </w:r>
-    </w:p>
-    <w:p>
-      <w:pPr>
-        <w:spacing w:after="80"/>
-        <w:ind w:left="510" w:hanging="510"/>
-      </w:pPr>
-      <w:r>
-        <w:rPr>
-          <w:sz w:val="20"/>
-        </w:rPr>
-        <w:lastRenderedPageBreak/>
         <w:t>[2]</w:t>
       </w:r>
       <w:r>
@@ -10479,6 +10470,11 @@
           <w:sz w:val="20"/>
         </w:rPr>
         <w:tab/>
+      </w:r>
+      <w:r>
+        <w:rPr>
+          <w:sz w:val="20"/>
+        </w:rPr>
         <w:t>A. Birnbaum, “Some latent trait models and their use in inferring an examinee's ability,” en F. M. Lord y M. R. Novick, Statistical Theories of Mental Test Scores. Reading, MA, EE. UU.: Addison-Wesley, 1968, pp. 397–479.</w:t>
       </w:r>
     </w:p>
@@ -10498,11 +10494,6 @@
           <w:sz w:val="20"/>
         </w:rPr>
         <w:tab/>
-      </w:r>
-      <w:r>
-        <w:rPr>
-          <w:sz w:val="20"/>
-        </w:rPr>
         <w:t>F. M. Lord, Applications of Item Response Theory to Practical Testing Problems. Hillsdale, NJ, EE. UU.: Lawrence Erlbaum Associates, 1980.</w:t>
       </w:r>
     </w:p>
@@ -10541,6 +10532,11 @@
           <w:sz w:val="20"/>
         </w:rPr>
         <w:tab/>
+      </w:r>
+      <w:r>
+        <w:rPr>
+          <w:sz w:val="20"/>
+        </w:rPr>
         <w:t>S. E. Embretson y S. P. Reise, Item Response Theory for Psychologists. Mahwah, NJ, EE. UU.: Lawrence Erlbaum Associates, 2000.</w:t>
       </w:r>
     </w:p>
@@ -10560,11 +10556,6 @@
           <w:sz w:val="20"/>
         </w:rPr>
         <w:tab/>
-      </w:r>
-      <w:r>
-        <w:rPr>
-          <w:sz w:val="20"/>
-        </w:rPr>
         <w:t>F. B. Baker y S.-H. Kim, Item Response Theory: Parameter Estimation Techniques, 2.ª ed. Nueva York, NY, EE. UU.: Marcel Dekker, 2004, doi: 10.1201/9781482276725.</w:t>
       </w:r>
     </w:p>
@@ -10830,6 +10821,7 @@
         <w:rPr>
           <w:sz w:val="20"/>
         </w:rPr>
+        <w:lastRenderedPageBreak/>
         <w:t>[19]</w:t>
       </w:r>
       <w:r>
@@ -10873,7 +10865,6 @@
         <w:rPr>
           <w:sz w:val="20"/>
         </w:rPr>
-        <w:lastRenderedPageBreak/>
         <w:t>[21]</w:t>
       </w:r>
       <w:r>
@@ -11222,31 +11213,31 @@
       </w:rPr>
     </w:lvl>
   </w:abstractNum>
-  <w:num w:numId="1" w16cid:durableId="2018770963">
+  <w:num w:numId="1" w16cid:durableId="1719011420">
     <w:abstractNumId w:val="8"/>
   </w:num>
-  <w:num w:numId="2" w16cid:durableId="1463619253">
+  <w:num w:numId="2" w16cid:durableId="589462217">
     <w:abstractNumId w:val="6"/>
   </w:num>
-  <w:num w:numId="3" w16cid:durableId="1829055231">
+  <w:num w:numId="3" w16cid:durableId="1855194045">
     <w:abstractNumId w:val="5"/>
   </w:num>
-  <w:num w:numId="4" w16cid:durableId="151259196">
+  <w:num w:numId="4" w16cid:durableId="164638639">
     <w:abstractNumId w:val="4"/>
   </w:num>
-  <w:num w:numId="5" w16cid:durableId="306975640">
+  <w:num w:numId="5" w16cid:durableId="722949982">
     <w:abstractNumId w:val="7"/>
   </w:num>
-  <w:num w:numId="6" w16cid:durableId="1279949321">
+  <w:num w:numId="6" w16cid:durableId="1828471659">
     <w:abstractNumId w:val="3"/>
   </w:num>
-  <w:num w:numId="7" w16cid:durableId="457264259">
+  <w:num w:numId="7" w16cid:durableId="1778677991">
     <w:abstractNumId w:val="2"/>
   </w:num>
-  <w:num w:numId="8" w16cid:durableId="279920281">
+  <w:num w:numId="8" w16cid:durableId="2017882437">
     <w:abstractNumId w:val="1"/>
   </w:num>
-  <w:num w:numId="9" w16cid:durableId="187843034">
+  <w:num w:numId="9" w16cid:durableId="508448216">
     <w:abstractNumId w:val="0"/>
   </w:num>
 </w:numbering>
@@ -22634,7 +22625,7 @@
     <w:autoRedefine/>
     <w:uiPriority w:val="39"/>
     <w:unhideWhenUsed/>
-    <w:rsid w:val="009C78B1"/>
+    <w:rsid w:val="008F7601"/>
     <w:pPr>
       <w:spacing w:after="100"/>
     </w:pPr>
@@ -22646,7 +22637,7 @@
     <w:autoRedefine/>
     <w:uiPriority w:val="39"/>
     <w:unhideWhenUsed/>
-    <w:rsid w:val="009C78B1"/>
+    <w:rsid w:val="008F7601"/>
     <w:pPr>
       <w:spacing w:after="100"/>
       <w:ind w:left="220"/>
@@ -22659,7 +22650,7 @@
     <w:autoRedefine/>
     <w:uiPriority w:val="39"/>
     <w:unhideWhenUsed/>
-    <w:rsid w:val="009C78B1"/>
+    <w:rsid w:val="008F7601"/>
     <w:pPr>
       <w:spacing w:after="100"/>
       <w:ind w:left="440"/>
@@ -22670,7 +22661,7 @@
     <w:basedOn w:val="DefaultParagraphFont"/>
     <w:uiPriority w:val="99"/>
     <w:unhideWhenUsed/>
-    <w:rsid w:val="009C78B1"/>
+    <w:rsid w:val="008F7601"/>
     <w:rPr>
       <w:color w:val="0000FF" w:themeColor="hyperlink"/>
       <w:u w:val="single"/>

</xml_diff>